<commit_message>
Update table of contents in TFM document to reflect new structure and sections
</commit_message>
<xml_diff>
--- a/TFM.docx
+++ b/TFM.docx
@@ -713,7 +713,7 @@
                 <v:stroke joinstyle="miter"/>
                 <v:path gradientshapeok="t" o:connecttype="rect"/>
               </v:shapetype>
-              <v:shape id="Cuadro de texto 187" o:spid="_x0000_s1026" type="#_x0000_t202" style="position:absolute;margin-left:349.25pt;margin-top:425.5pt;width:130.25pt;height:82.75pt;z-index:251667456;visibility:visible;mso-wrap-style:square;mso-width-percent:0;mso-height-percent:0;mso-wrap-distance-left:9pt;mso-wrap-distance-top:0;mso-wrap-distance-right:9pt;mso-wrap-distance-bottom:0;mso-position-horizontal:absolute;mso-position-horizontal-relative:text;mso-position-vertical:absolute;mso-position-vertical-relative:text;mso-width-percent:0;mso-height-percent:0;mso-width-relative:page;mso-height-relative:page;v-text-anchor:top" o:gfxdata="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" filled="f" stroked="f" strokeweight=".5pt">
+              <v:shape id="Cuadro de texto 187" o:spid="_x0000_s1026" type="#_x0000_t202" style="position:absolute;left:0;text-align:left;margin-left:349.25pt;margin-top:425.5pt;width:130.25pt;height:82.75pt;z-index:251667456;visibility:visible;mso-wrap-style:square;mso-width-percent:0;mso-height-percent:0;mso-wrap-distance-left:9pt;mso-wrap-distance-top:0;mso-wrap-distance-right:9pt;mso-wrap-distance-bottom:0;mso-position-horizontal:absolute;mso-position-horizontal-relative:text;mso-position-vertical:absolute;mso-position-vertical-relative:text;mso-width-percent:0;mso-height-percent:0;mso-width-relative:page;mso-height-relative:page;v-text-anchor:top" o:gfxdata="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" filled="f" stroked="f" strokeweight=".5pt">
                 <v:textbox inset="0,0,0,0">
                   <w:txbxContent>
                     <w:p>
@@ -912,7 +912,7 @@
       <w:pPr>
         <w:pStyle w:val="Ttulo1"/>
       </w:pPr>
-      <w:bookmarkStart w:id="0" w:name="_Toc238930405"/>
+      <w:bookmarkStart w:id="0" w:name="_Toc239435004"/>
       <w:r>
         <w:rPr>
           <w:noProof/>
@@ -1315,7 +1315,7 @@
           </mc:Choice>
           <mc:Fallback>
             <w:pict>
-              <v:shape w14:anchorId="66BBC64C" id="Cuadro de texto 85" o:spid="_x0000_s1027" type="#_x0000_t202" style="position:absolute;margin-left:-52.75pt;margin-top:92.2pt;width:538.55pt;height:313.75pt;z-index:251660288;visibility:visible;mso-wrap-style:square;mso-width-percent:0;mso-height-percent:0;mso-wrap-distance-left:9pt;mso-wrap-distance-top:0;mso-wrap-distance-right:9pt;mso-wrap-distance-bottom:0;mso-position-horizontal:absolute;mso-position-horizontal-relative:margin;mso-position-vertical:absolute;mso-position-vertical-relative:text;mso-width-percent:0;mso-height-percent:0;mso-width-relative:margin;mso-height-relative:margin;v-text-anchor:top" o:gfxdata="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" filled="f" stroked="f" strokeweight=".5pt">
+              <v:shape w14:anchorId="66BBC64C" id="Cuadro de texto 85" o:spid="_x0000_s1027" type="#_x0000_t202" style="position:absolute;left:0;text-align:left;margin-left:-52.75pt;margin-top:92.2pt;width:538.55pt;height:313.75pt;z-index:251660288;visibility:visible;mso-wrap-style:square;mso-width-percent:0;mso-height-percent:0;mso-wrap-distance-left:9pt;mso-wrap-distance-top:0;mso-wrap-distance-right:9pt;mso-wrap-distance-bottom:0;mso-position-horizontal:absolute;mso-position-horizontal-relative:margin;mso-position-vertical:absolute;mso-position-vertical-relative:text;mso-width-percent:0;mso-height-percent:0;mso-width-relative:margin;mso-height-relative:margin;v-text-anchor:top" o:gfxdata="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" filled="f" stroked="f" strokeweight=".5pt">
                 <v:textbox inset="0,0,0,0">
                   <w:txbxContent>
                     <w:p>
@@ -1660,7 +1660,7 @@
       <w:pPr>
         <w:pStyle w:val="Ttulo1"/>
       </w:pPr>
-      <w:bookmarkStart w:id="1" w:name="_Toc238930406"/>
+      <w:bookmarkStart w:id="1" w:name="_Toc239435005"/>
       <w:r>
         <w:lastRenderedPageBreak/>
         <w:t>Acknowledgements</w:t>
@@ -1744,7 +1744,7 @@
       <w:pPr>
         <w:pStyle w:val="Ttulo1"/>
       </w:pPr>
-      <w:bookmarkStart w:id="2" w:name="_Toc238930407"/>
+      <w:bookmarkStart w:id="2" w:name="_Toc239435006"/>
       <w:r>
         <w:lastRenderedPageBreak/>
         <w:t>Abstract:</w:t>
@@ -1845,7 +1845,7 @@
           <w:r>
             <w:fldChar w:fldCharType="separate"/>
           </w:r>
-          <w:hyperlink w:anchor="_Toc238930405" w:history="1">
+          <w:hyperlink w:anchor="_Toc239435004" w:history="1">
             <w:r>
               <w:rPr>
                 <w:noProof/>
@@ -1865,7 +1865,7 @@
                 <w:noProof/>
                 <w:webHidden/>
               </w:rPr>
-              <w:instrText xml:space="preserve"> PAGEREF _Toc238930405 \h </w:instrText>
+              <w:instrText xml:space="preserve"> PAGEREF _Toc239435004 \h </w:instrText>
             </w:r>
             <w:r>
               <w:rPr>
@@ -1911,7 +1911,7 @@
               <w14:ligatures w14:val="standardContextual"/>
             </w:rPr>
           </w:pPr>
-          <w:hyperlink w:anchor="_Toc238930406" w:history="1">
+          <w:hyperlink w:anchor="_Toc239435005" w:history="1">
             <w:r>
               <w:rPr>
                 <w:rStyle w:val="Hipervnculo"/>
@@ -1938,7 +1938,7 @@
                 <w:noProof/>
                 <w:webHidden/>
               </w:rPr>
-              <w:instrText xml:space="preserve"> PAGEREF _Toc238930406 \h </w:instrText>
+              <w:instrText xml:space="preserve"> PAGEREF _Toc239435005 \h </w:instrText>
             </w:r>
             <w:r>
               <w:rPr>
@@ -1984,7 +1984,7 @@
               <w14:ligatures w14:val="standardContextual"/>
             </w:rPr>
           </w:pPr>
-          <w:hyperlink w:anchor="_Toc238930407" w:history="1">
+          <w:hyperlink w:anchor="_Toc239435006" w:history="1">
             <w:r>
               <w:rPr>
                 <w:rStyle w:val="Hipervnculo"/>
@@ -2011,7 +2011,7 @@
                 <w:noProof/>
                 <w:webHidden/>
               </w:rPr>
-              <w:instrText xml:space="preserve"> PAGEREF _Toc238930407 \h </w:instrText>
+              <w:instrText xml:space="preserve"> PAGEREF _Toc239435006 \h </w:instrText>
             </w:r>
             <w:r>
               <w:rPr>
@@ -2057,7 +2057,7 @@
               <w14:ligatures w14:val="standardContextual"/>
             </w:rPr>
           </w:pPr>
-          <w:hyperlink w:anchor="_Toc238930408" w:history="1">
+          <w:hyperlink w:anchor="_Toc239435007" w:history="1">
             <w:r>
               <w:rPr>
                 <w:rStyle w:val="Hipervnculo"/>
@@ -2084,7 +2084,7 @@
                 <w:noProof/>
                 <w:webHidden/>
               </w:rPr>
-              <w:instrText xml:space="preserve"> PAGEREF _Toc238930408 \h </w:instrText>
+              <w:instrText xml:space="preserve"> PAGEREF _Toc239435007 \h </w:instrText>
             </w:r>
             <w:r>
               <w:rPr>
@@ -2130,13 +2130,13 @@
               <w14:ligatures w14:val="standardContextual"/>
             </w:rPr>
           </w:pPr>
-          <w:hyperlink w:anchor="_Toc238930409" w:history="1">
+          <w:hyperlink w:anchor="_Toc239435008" w:history="1">
             <w:r>
               <w:rPr>
                 <w:rStyle w:val="Hipervnculo"/>
                 <w:noProof/>
               </w:rPr>
-              <w:t>Hardware:</w:t>
+              <w:t>Introduction:</w:t>
             </w:r>
             <w:r>
               <w:rPr>
@@ -2157,7 +2157,7 @@
                 <w:noProof/>
                 <w:webHidden/>
               </w:rPr>
-              <w:instrText xml:space="preserve"> PAGEREF _Toc238930409 \h </w:instrText>
+              <w:instrText xml:space="preserve"> PAGEREF _Toc239435008 \h </w:instrText>
             </w:r>
             <w:r>
               <w:rPr>
@@ -2203,11 +2203,303 @@
               <w14:ligatures w14:val="standardContextual"/>
             </w:rPr>
           </w:pPr>
-          <w:hyperlink w:anchor="_Toc238930410" w:history="1">
+          <w:hyperlink w:anchor="_Toc239435009" w:history="1">
             <w:r>
               <w:rPr>
                 <w:rStyle w:val="Hipervnculo"/>
                 <w:noProof/>
+              </w:rPr>
+              <w:t>Objectives</w:t>
+            </w:r>
+            <w:r>
+              <w:rPr>
+                <w:noProof/>
+                <w:webHidden/>
+              </w:rPr>
+              <w:tab/>
+            </w:r>
+            <w:r>
+              <w:rPr>
+                <w:noProof/>
+                <w:webHidden/>
+              </w:rPr>
+              <w:fldChar w:fldCharType="begin"/>
+            </w:r>
+            <w:r>
+              <w:rPr>
+                <w:noProof/>
+                <w:webHidden/>
+              </w:rPr>
+              <w:instrText xml:space="preserve"> PAGEREF _Toc239435009 \h </w:instrText>
+            </w:r>
+            <w:r>
+              <w:rPr>
+                <w:noProof/>
+                <w:webHidden/>
+              </w:rPr>
+            </w:r>
+            <w:r>
+              <w:rPr>
+                <w:noProof/>
+                <w:webHidden/>
+              </w:rPr>
+              <w:fldChar w:fldCharType="separate"/>
+            </w:r>
+            <w:r>
+              <w:rPr>
+                <w:noProof/>
+                <w:webHidden/>
+              </w:rPr>
+              <w:t>8</w:t>
+            </w:r>
+            <w:r>
+              <w:rPr>
+                <w:noProof/>
+                <w:webHidden/>
+              </w:rPr>
+              <w:fldChar w:fldCharType="end"/>
+            </w:r>
+          </w:hyperlink>
+        </w:p>
+        <w:p>
+          <w:pPr>
+            <w:pStyle w:val="TDC2"/>
+            <w:tabs>
+              <w:tab w:val="right" w:leader="dot" w:pos="9016"/>
+            </w:tabs>
+            <w:rPr>
+              <w:rFonts w:asciiTheme="minorHAnsi" w:eastAsiaTheme="minorEastAsia" w:hAnsiTheme="minorHAnsi"/>
+              <w:noProof/>
+              <w:kern w:val="2"/>
+              <w:szCs w:val="24"/>
+              <w:lang w:val="en-GB" w:eastAsia="en-GB"/>
+              <w14:ligatures w14:val="standardContextual"/>
+            </w:rPr>
+          </w:pPr>
+          <w:hyperlink w:anchor="_Toc239435010" w:history="1">
+            <w:r>
+              <w:rPr>
+                <w:rStyle w:val="Hipervnculo"/>
+                <w:noProof/>
+              </w:rPr>
+              <w:t>Scope and Limitations</w:t>
+            </w:r>
+            <w:r>
+              <w:rPr>
+                <w:noProof/>
+                <w:webHidden/>
+              </w:rPr>
+              <w:tab/>
+            </w:r>
+            <w:r>
+              <w:rPr>
+                <w:noProof/>
+                <w:webHidden/>
+              </w:rPr>
+              <w:fldChar w:fldCharType="begin"/>
+            </w:r>
+            <w:r>
+              <w:rPr>
+                <w:noProof/>
+                <w:webHidden/>
+              </w:rPr>
+              <w:instrText xml:space="preserve"> PAGEREF _Toc239435010 \h </w:instrText>
+            </w:r>
+            <w:r>
+              <w:rPr>
+                <w:noProof/>
+                <w:webHidden/>
+              </w:rPr>
+            </w:r>
+            <w:r>
+              <w:rPr>
+                <w:noProof/>
+                <w:webHidden/>
+              </w:rPr>
+              <w:fldChar w:fldCharType="separate"/>
+            </w:r>
+            <w:r>
+              <w:rPr>
+                <w:noProof/>
+                <w:webHidden/>
+              </w:rPr>
+              <w:t>8</w:t>
+            </w:r>
+            <w:r>
+              <w:rPr>
+                <w:noProof/>
+                <w:webHidden/>
+              </w:rPr>
+              <w:fldChar w:fldCharType="end"/>
+            </w:r>
+          </w:hyperlink>
+        </w:p>
+        <w:p>
+          <w:pPr>
+            <w:pStyle w:val="TDC2"/>
+            <w:tabs>
+              <w:tab w:val="right" w:leader="dot" w:pos="9016"/>
+            </w:tabs>
+            <w:rPr>
+              <w:rFonts w:asciiTheme="minorHAnsi" w:eastAsiaTheme="minorEastAsia" w:hAnsiTheme="minorHAnsi"/>
+              <w:noProof/>
+              <w:kern w:val="2"/>
+              <w:szCs w:val="24"/>
+              <w:lang w:val="en-GB" w:eastAsia="en-GB"/>
+              <w14:ligatures w14:val="standardContextual"/>
+            </w:rPr>
+          </w:pPr>
+          <w:hyperlink w:anchor="_Toc239435011" w:history="1">
+            <w:r>
+              <w:rPr>
+                <w:rStyle w:val="Hipervnculo"/>
+                <w:noProof/>
+              </w:rPr>
+              <w:t>Document Structure</w:t>
+            </w:r>
+            <w:r>
+              <w:rPr>
+                <w:noProof/>
+                <w:webHidden/>
+              </w:rPr>
+              <w:tab/>
+            </w:r>
+            <w:r>
+              <w:rPr>
+                <w:noProof/>
+                <w:webHidden/>
+              </w:rPr>
+              <w:fldChar w:fldCharType="begin"/>
+            </w:r>
+            <w:r>
+              <w:rPr>
+                <w:noProof/>
+                <w:webHidden/>
+              </w:rPr>
+              <w:instrText xml:space="preserve"> PAGEREF _Toc239435011 \h </w:instrText>
+            </w:r>
+            <w:r>
+              <w:rPr>
+                <w:noProof/>
+                <w:webHidden/>
+              </w:rPr>
+            </w:r>
+            <w:r>
+              <w:rPr>
+                <w:noProof/>
+                <w:webHidden/>
+              </w:rPr>
+              <w:fldChar w:fldCharType="separate"/>
+            </w:r>
+            <w:r>
+              <w:rPr>
+                <w:noProof/>
+                <w:webHidden/>
+              </w:rPr>
+              <w:t>9</w:t>
+            </w:r>
+            <w:r>
+              <w:rPr>
+                <w:noProof/>
+                <w:webHidden/>
+              </w:rPr>
+              <w:fldChar w:fldCharType="end"/>
+            </w:r>
+          </w:hyperlink>
+        </w:p>
+        <w:p>
+          <w:pPr>
+            <w:pStyle w:val="TDC1"/>
+            <w:tabs>
+              <w:tab w:val="right" w:leader="dot" w:pos="9016"/>
+            </w:tabs>
+            <w:rPr>
+              <w:rFonts w:asciiTheme="minorHAnsi" w:eastAsiaTheme="minorEastAsia" w:hAnsiTheme="minorHAnsi"/>
+              <w:noProof/>
+              <w:kern w:val="2"/>
+              <w:szCs w:val="24"/>
+              <w:lang w:val="en-GB" w:eastAsia="en-GB"/>
+              <w14:ligatures w14:val="standardContextual"/>
+            </w:rPr>
+          </w:pPr>
+          <w:hyperlink w:anchor="_Toc239435012" w:history="1">
+            <w:r>
+              <w:rPr>
+                <w:rStyle w:val="Hipervnculo"/>
+                <w:noProof/>
+              </w:rPr>
+              <w:t>Hardware:</w:t>
+            </w:r>
+            <w:r>
+              <w:rPr>
+                <w:noProof/>
+                <w:webHidden/>
+              </w:rPr>
+              <w:tab/>
+            </w:r>
+            <w:r>
+              <w:rPr>
+                <w:noProof/>
+                <w:webHidden/>
+              </w:rPr>
+              <w:fldChar w:fldCharType="begin"/>
+            </w:r>
+            <w:r>
+              <w:rPr>
+                <w:noProof/>
+                <w:webHidden/>
+              </w:rPr>
+              <w:instrText xml:space="preserve"> PAGEREF _Toc239435012 \h </w:instrText>
+            </w:r>
+            <w:r>
+              <w:rPr>
+                <w:noProof/>
+                <w:webHidden/>
+              </w:rPr>
+            </w:r>
+            <w:r>
+              <w:rPr>
+                <w:noProof/>
+                <w:webHidden/>
+              </w:rPr>
+              <w:fldChar w:fldCharType="separate"/>
+            </w:r>
+            <w:r>
+              <w:rPr>
+                <w:noProof/>
+                <w:webHidden/>
+              </w:rPr>
+              <w:t>10</w:t>
+            </w:r>
+            <w:r>
+              <w:rPr>
+                <w:noProof/>
+                <w:webHidden/>
+              </w:rPr>
+              <w:fldChar w:fldCharType="end"/>
+            </w:r>
+          </w:hyperlink>
+        </w:p>
+        <w:p>
+          <w:pPr>
+            <w:pStyle w:val="TDC2"/>
+            <w:tabs>
+              <w:tab w:val="right" w:leader="dot" w:pos="9016"/>
+            </w:tabs>
+            <w:rPr>
+              <w:rFonts w:asciiTheme="minorHAnsi" w:eastAsiaTheme="minorEastAsia" w:hAnsiTheme="minorHAnsi"/>
+              <w:noProof/>
+              <w:kern w:val="2"/>
+              <w:szCs w:val="24"/>
+              <w:lang w:val="en-GB" w:eastAsia="en-GB"/>
+              <w14:ligatures w14:val="standardContextual"/>
+            </w:rPr>
+          </w:pPr>
+          <w:hyperlink w:anchor="_Toc239435013" w:history="1">
+            <w:r>
+              <w:rPr>
+                <w:rStyle w:val="Hipervnculo"/>
+                <w:noProof/>
                 <w:lang w:val="en-GB"/>
               </w:rPr>
               <w:t>Hardware Architecture:</w:t>
@@ -2231,7 +2523,7 @@
                 <w:noProof/>
                 <w:webHidden/>
               </w:rPr>
-              <w:instrText xml:space="preserve"> PAGEREF _Toc238930410 \h </w:instrText>
+              <w:instrText xml:space="preserve"> PAGEREF _Toc239435013 \h </w:instrText>
             </w:r>
             <w:r>
               <w:rPr>
@@ -2251,7 +2543,7 @@
                 <w:noProof/>
                 <w:webHidden/>
               </w:rPr>
-              <w:t>7</w:t>
+              <w:t>10</w:t>
             </w:r>
             <w:r>
               <w:rPr>
@@ -2277,7 +2569,7 @@
               <w14:ligatures w14:val="standardContextual"/>
             </w:rPr>
           </w:pPr>
-          <w:hyperlink w:anchor="_Toc238930411" w:history="1">
+          <w:hyperlink w:anchor="_Toc239435014" w:history="1">
             <w:r>
               <w:rPr>
                 <w:rStyle w:val="Hipervnculo"/>
@@ -2305,7 +2597,7 @@
                 <w:noProof/>
                 <w:webHidden/>
               </w:rPr>
-              <w:instrText xml:space="preserve"> PAGEREF _Toc238930411 \h </w:instrText>
+              <w:instrText xml:space="preserve"> PAGEREF _Toc239435014 \h </w:instrText>
             </w:r>
             <w:r>
               <w:rPr>
@@ -2325,7 +2617,7 @@
                 <w:noProof/>
                 <w:webHidden/>
               </w:rPr>
-              <w:t>7</w:t>
+              <w:t>10</w:t>
             </w:r>
             <w:r>
               <w:rPr>
@@ -2351,7 +2643,7 @@
               <w14:ligatures w14:val="standardContextual"/>
             </w:rPr>
           </w:pPr>
-          <w:hyperlink w:anchor="_Toc238930412" w:history="1">
+          <w:hyperlink w:anchor="_Toc239435015" w:history="1">
             <w:r>
               <w:rPr>
                 <w:rStyle w:val="Hipervnculo"/>
@@ -2378,7 +2670,7 @@
                 <w:noProof/>
                 <w:webHidden/>
               </w:rPr>
-              <w:instrText xml:space="preserve"> PAGEREF _Toc238930412 \h </w:instrText>
+              <w:instrText xml:space="preserve"> PAGEREF _Toc239435015 \h </w:instrText>
             </w:r>
             <w:r>
               <w:rPr>
@@ -2398,7 +2690,7 @@
                 <w:noProof/>
                 <w:webHidden/>
               </w:rPr>
-              <w:t>8</w:t>
+              <w:t>11</w:t>
             </w:r>
             <w:r>
               <w:rPr>
@@ -2424,7 +2716,7 @@
               <w14:ligatures w14:val="standardContextual"/>
             </w:rPr>
           </w:pPr>
-          <w:hyperlink w:anchor="_Toc238930413" w:history="1">
+          <w:hyperlink w:anchor="_Toc239435016" w:history="1">
             <w:r>
               <w:rPr>
                 <w:rStyle w:val="Hipervnculo"/>
@@ -2451,7 +2743,7 @@
                 <w:noProof/>
                 <w:webHidden/>
               </w:rPr>
-              <w:instrText xml:space="preserve"> PAGEREF _Toc238930413 \h </w:instrText>
+              <w:instrText xml:space="preserve"> PAGEREF _Toc239435016 \h </w:instrText>
             </w:r>
             <w:r>
               <w:rPr>
@@ -2471,7 +2763,7 @@
                 <w:noProof/>
                 <w:webHidden/>
               </w:rPr>
-              <w:t>9</w:t>
+              <w:t>12</w:t>
             </w:r>
             <w:r>
               <w:rPr>
@@ -2497,7 +2789,7 @@
               <w14:ligatures w14:val="standardContextual"/>
             </w:rPr>
           </w:pPr>
-          <w:hyperlink w:anchor="_Toc238930414" w:history="1">
+          <w:hyperlink w:anchor="_Toc239435017" w:history="1">
             <w:r>
               <w:rPr>
                 <w:rStyle w:val="Hipervnculo"/>
@@ -2524,7 +2816,7 @@
                 <w:noProof/>
                 <w:webHidden/>
               </w:rPr>
-              <w:instrText xml:space="preserve"> PAGEREF _Toc238930414 \h </w:instrText>
+              <w:instrText xml:space="preserve"> PAGEREF _Toc239435017 \h </w:instrText>
             </w:r>
             <w:r>
               <w:rPr>
@@ -2544,7 +2836,7 @@
                 <w:noProof/>
                 <w:webHidden/>
               </w:rPr>
-              <w:t>10</w:t>
+              <w:t>13</w:t>
             </w:r>
             <w:r>
               <w:rPr>
@@ -2570,7 +2862,7 @@
               <w14:ligatures w14:val="standardContextual"/>
             </w:rPr>
           </w:pPr>
-          <w:hyperlink w:anchor="_Toc238930415" w:history="1">
+          <w:hyperlink w:anchor="_Toc239435018" w:history="1">
             <w:r>
               <w:rPr>
                 <w:rStyle w:val="Hipervnculo"/>
@@ -2597,7 +2889,7 @@
                 <w:noProof/>
                 <w:webHidden/>
               </w:rPr>
-              <w:instrText xml:space="preserve"> PAGEREF _Toc238930415 \h </w:instrText>
+              <w:instrText xml:space="preserve"> PAGEREF _Toc239435018 \h </w:instrText>
             </w:r>
             <w:r>
               <w:rPr>
@@ -2617,7 +2909,7 @@
                 <w:noProof/>
                 <w:webHidden/>
               </w:rPr>
-              <w:t>10</w:t>
+              <w:t>13</w:t>
             </w:r>
             <w:r>
               <w:rPr>
@@ -2643,7 +2935,7 @@
               <w14:ligatures w14:val="standardContextual"/>
             </w:rPr>
           </w:pPr>
-          <w:hyperlink w:anchor="_Toc238930416" w:history="1">
+          <w:hyperlink w:anchor="_Toc239435019" w:history="1">
             <w:r>
               <w:rPr>
                 <w:rStyle w:val="Hipervnculo"/>
@@ -2670,7 +2962,7 @@
                 <w:noProof/>
                 <w:webHidden/>
               </w:rPr>
-              <w:instrText xml:space="preserve"> PAGEREF _Toc238930416 \h </w:instrText>
+              <w:instrText xml:space="preserve"> PAGEREF _Toc239435019 \h </w:instrText>
             </w:r>
             <w:r>
               <w:rPr>
@@ -2690,7 +2982,7 @@
                 <w:noProof/>
                 <w:webHidden/>
               </w:rPr>
-              <w:t>11</w:t>
+              <w:t>14</w:t>
             </w:r>
             <w:r>
               <w:rPr>
@@ -2716,7 +3008,7 @@
               <w14:ligatures w14:val="standardContextual"/>
             </w:rPr>
           </w:pPr>
-          <w:hyperlink w:anchor="_Toc238930417" w:history="1">
+          <w:hyperlink w:anchor="_Toc239435020" w:history="1">
             <w:r>
               <w:rPr>
                 <w:rStyle w:val="Hipervnculo"/>
@@ -2743,7 +3035,7 @@
                 <w:noProof/>
                 <w:webHidden/>
               </w:rPr>
-              <w:instrText xml:space="preserve"> PAGEREF _Toc238930417 \h </w:instrText>
+              <w:instrText xml:space="preserve"> PAGEREF _Toc239435020 \h </w:instrText>
             </w:r>
             <w:r>
               <w:rPr>
@@ -2763,7 +3055,7 @@
                 <w:noProof/>
                 <w:webHidden/>
               </w:rPr>
-              <w:t>13</w:t>
+              <w:t>16</w:t>
             </w:r>
             <w:r>
               <w:rPr>
@@ -2789,7 +3081,7 @@
               <w14:ligatures w14:val="standardContextual"/>
             </w:rPr>
           </w:pPr>
-          <w:hyperlink w:anchor="_Toc238930418" w:history="1">
+          <w:hyperlink w:anchor="_Toc239435021" w:history="1">
             <w:r>
               <w:rPr>
                 <w:rStyle w:val="Hipervnculo"/>
@@ -2816,7 +3108,7 @@
                 <w:noProof/>
                 <w:webHidden/>
               </w:rPr>
-              <w:instrText xml:space="preserve"> PAGEREF _Toc238930418 \h </w:instrText>
+              <w:instrText xml:space="preserve"> PAGEREF _Toc239435021 \h </w:instrText>
             </w:r>
             <w:r>
               <w:rPr>
@@ -2836,7 +3128,7 @@
                 <w:noProof/>
                 <w:webHidden/>
               </w:rPr>
-              <w:t>13</w:t>
+              <w:t>16</w:t>
             </w:r>
             <w:r>
               <w:rPr>
@@ -2862,7 +3154,7 @@
               <w14:ligatures w14:val="standardContextual"/>
             </w:rPr>
           </w:pPr>
-          <w:hyperlink w:anchor="_Toc238930419" w:history="1">
+          <w:hyperlink w:anchor="_Toc239435022" w:history="1">
             <w:r>
               <w:rPr>
                 <w:rStyle w:val="Hipervnculo"/>
@@ -2889,7 +3181,7 @@
                 <w:noProof/>
                 <w:webHidden/>
               </w:rPr>
-              <w:instrText xml:space="preserve"> PAGEREF _Toc238930419 \h </w:instrText>
+              <w:instrText xml:space="preserve"> PAGEREF _Toc239435022 \h </w:instrText>
             </w:r>
             <w:r>
               <w:rPr>
@@ -2909,7 +3201,7 @@
                 <w:noProof/>
                 <w:webHidden/>
               </w:rPr>
-              <w:t>13</w:t>
+              <w:t>16</w:t>
             </w:r>
             <w:r>
               <w:rPr>
@@ -2935,7 +3227,7 @@
               <w14:ligatures w14:val="standardContextual"/>
             </w:rPr>
           </w:pPr>
-          <w:hyperlink w:anchor="_Toc238930420" w:history="1">
+          <w:hyperlink w:anchor="_Toc239435023" w:history="1">
             <w:r>
               <w:rPr>
                 <w:rStyle w:val="Hipervnculo"/>
@@ -2962,7 +3254,7 @@
                 <w:noProof/>
                 <w:webHidden/>
               </w:rPr>
-              <w:instrText xml:space="preserve"> PAGEREF _Toc238930420 \h </w:instrText>
+              <w:instrText xml:space="preserve"> PAGEREF _Toc239435023 \h </w:instrText>
             </w:r>
             <w:r>
               <w:rPr>
@@ -2982,7 +3274,7 @@
                 <w:noProof/>
                 <w:webHidden/>
               </w:rPr>
-              <w:t>14</w:t>
+              <w:t>17</w:t>
             </w:r>
             <w:r>
               <w:rPr>
@@ -3008,7 +3300,7 @@
               <w14:ligatures w14:val="standardContextual"/>
             </w:rPr>
           </w:pPr>
-          <w:hyperlink w:anchor="_Toc238930421" w:history="1">
+          <w:hyperlink w:anchor="_Toc239435024" w:history="1">
             <w:r>
               <w:rPr>
                 <w:rStyle w:val="Hipervnculo"/>
@@ -3035,7 +3327,7 @@
                 <w:noProof/>
                 <w:webHidden/>
               </w:rPr>
-              <w:instrText xml:space="preserve"> PAGEREF _Toc238930421 \h </w:instrText>
+              <w:instrText xml:space="preserve"> PAGEREF _Toc239435024 \h </w:instrText>
             </w:r>
             <w:r>
               <w:rPr>
@@ -3055,7 +3347,7 @@
                 <w:noProof/>
                 <w:webHidden/>
               </w:rPr>
-              <w:t>14</w:t>
+              <w:t>17</w:t>
             </w:r>
             <w:r>
               <w:rPr>
@@ -3081,7 +3373,7 @@
               <w14:ligatures w14:val="standardContextual"/>
             </w:rPr>
           </w:pPr>
-          <w:hyperlink w:anchor="_Toc238930422" w:history="1">
+          <w:hyperlink w:anchor="_Toc239435025" w:history="1">
             <w:r>
               <w:rPr>
                 <w:rStyle w:val="Hipervnculo"/>
@@ -3108,7 +3400,7 @@
                 <w:noProof/>
                 <w:webHidden/>
               </w:rPr>
-              <w:instrText xml:space="preserve"> PAGEREF _Toc238930422 \h </w:instrText>
+              <w:instrText xml:space="preserve"> PAGEREF _Toc239435025 \h </w:instrText>
             </w:r>
             <w:r>
               <w:rPr>
@@ -3128,7 +3420,7 @@
                 <w:noProof/>
                 <w:webHidden/>
               </w:rPr>
-              <w:t>14</w:t>
+              <w:t>17</w:t>
             </w:r>
             <w:r>
               <w:rPr>
@@ -3154,7 +3446,7 @@
               <w14:ligatures w14:val="standardContextual"/>
             </w:rPr>
           </w:pPr>
-          <w:hyperlink w:anchor="_Toc238930423" w:history="1">
+          <w:hyperlink w:anchor="_Toc239435026" w:history="1">
             <w:r>
               <w:rPr>
                 <w:rStyle w:val="Hipervnculo"/>
@@ -3181,7 +3473,7 @@
                 <w:noProof/>
                 <w:webHidden/>
               </w:rPr>
-              <w:instrText xml:space="preserve"> PAGEREF _Toc238930423 \h </w:instrText>
+              <w:instrText xml:space="preserve"> PAGEREF _Toc239435026 \h </w:instrText>
             </w:r>
             <w:r>
               <w:rPr>
@@ -3201,7 +3493,7 @@
                 <w:noProof/>
                 <w:webHidden/>
               </w:rPr>
-              <w:t>14</w:t>
+              <w:t>17</w:t>
             </w:r>
             <w:r>
               <w:rPr>
@@ -3227,7 +3519,7 @@
               <w14:ligatures w14:val="standardContextual"/>
             </w:rPr>
           </w:pPr>
-          <w:hyperlink w:anchor="_Toc238930424" w:history="1">
+          <w:hyperlink w:anchor="_Toc239435027" w:history="1">
             <w:r>
               <w:rPr>
                 <w:rStyle w:val="Hipervnculo"/>
@@ -3254,7 +3546,7 @@
                 <w:noProof/>
                 <w:webHidden/>
               </w:rPr>
-              <w:instrText xml:space="preserve"> PAGEREF _Toc238930424 \h </w:instrText>
+              <w:instrText xml:space="preserve"> PAGEREF _Toc239435027 \h </w:instrText>
             </w:r>
             <w:r>
               <w:rPr>
@@ -3274,7 +3566,7 @@
                 <w:noProof/>
                 <w:webHidden/>
               </w:rPr>
-              <w:t>17</w:t>
+              <w:t>20</w:t>
             </w:r>
             <w:r>
               <w:rPr>
@@ -3300,7 +3592,7 @@
               <w14:ligatures w14:val="standardContextual"/>
             </w:rPr>
           </w:pPr>
-          <w:hyperlink w:anchor="_Toc238930425" w:history="1">
+          <w:hyperlink w:anchor="_Toc239435028" w:history="1">
             <w:r>
               <w:rPr>
                 <w:rStyle w:val="Hipervnculo"/>
@@ -3327,7 +3619,7 @@
                 <w:noProof/>
                 <w:webHidden/>
               </w:rPr>
-              <w:instrText xml:space="preserve"> PAGEREF _Toc238930425 \h </w:instrText>
+              <w:instrText xml:space="preserve"> PAGEREF _Toc239435028 \h </w:instrText>
             </w:r>
             <w:r>
               <w:rPr>
@@ -3347,7 +3639,7 @@
                 <w:noProof/>
                 <w:webHidden/>
               </w:rPr>
-              <w:t>18</w:t>
+              <w:t>21</w:t>
             </w:r>
             <w:r>
               <w:rPr>
@@ -3373,7 +3665,7 @@
               <w14:ligatures w14:val="standardContextual"/>
             </w:rPr>
           </w:pPr>
-          <w:hyperlink w:anchor="_Toc238930426" w:history="1">
+          <w:hyperlink w:anchor="_Toc239435029" w:history="1">
             <w:r>
               <w:rPr>
                 <w:rStyle w:val="Hipervnculo"/>
@@ -3400,7 +3692,7 @@
                 <w:noProof/>
                 <w:webHidden/>
               </w:rPr>
-              <w:instrText xml:space="preserve"> PAGEREF _Toc238930426 \h </w:instrText>
+              <w:instrText xml:space="preserve"> PAGEREF _Toc239435029 \h </w:instrText>
             </w:r>
             <w:r>
               <w:rPr>
@@ -3420,7 +3712,7 @@
                 <w:noProof/>
                 <w:webHidden/>
               </w:rPr>
-              <w:t>19</w:t>
+              <w:t>22</w:t>
             </w:r>
             <w:r>
               <w:rPr>
@@ -3446,7 +3738,7 @@
               <w14:ligatures w14:val="standardContextual"/>
             </w:rPr>
           </w:pPr>
-          <w:hyperlink w:anchor="_Toc238930427" w:history="1">
+          <w:hyperlink w:anchor="_Toc239435030" w:history="1">
             <w:r>
               <w:rPr>
                 <w:rStyle w:val="Hipervnculo"/>
@@ -3473,7 +3765,7 @@
                 <w:noProof/>
                 <w:webHidden/>
               </w:rPr>
-              <w:instrText xml:space="preserve"> PAGEREF _Toc238930427 \h </w:instrText>
+              <w:instrText xml:space="preserve"> PAGEREF _Toc239435030 \h </w:instrText>
             </w:r>
             <w:r>
               <w:rPr>
@@ -3493,7 +3785,7 @@
                 <w:noProof/>
                 <w:webHidden/>
               </w:rPr>
-              <w:t>20</w:t>
+              <w:t>23</w:t>
             </w:r>
             <w:r>
               <w:rPr>
@@ -3519,7 +3811,7 @@
               <w14:ligatures w14:val="standardContextual"/>
             </w:rPr>
           </w:pPr>
-          <w:hyperlink w:anchor="_Toc238930428" w:history="1">
+          <w:hyperlink w:anchor="_Toc239435031" w:history="1">
             <w:r>
               <w:rPr>
                 <w:rStyle w:val="Hipervnculo"/>
@@ -3546,7 +3838,7 @@
                 <w:noProof/>
                 <w:webHidden/>
               </w:rPr>
-              <w:instrText xml:space="preserve"> PAGEREF _Toc238930428 \h </w:instrText>
+              <w:instrText xml:space="preserve"> PAGEREF _Toc239435031 \h </w:instrText>
             </w:r>
             <w:r>
               <w:rPr>
@@ -3566,7 +3858,7 @@
                 <w:noProof/>
                 <w:webHidden/>
               </w:rPr>
-              <w:t>21</w:t>
+              <w:t>24</w:t>
             </w:r>
             <w:r>
               <w:rPr>
@@ -3592,7 +3884,7 @@
               <w14:ligatures w14:val="standardContextual"/>
             </w:rPr>
           </w:pPr>
-          <w:hyperlink w:anchor="_Toc238930429" w:history="1">
+          <w:hyperlink w:anchor="_Toc239435032" w:history="1">
             <w:r>
               <w:rPr>
                 <w:rStyle w:val="Hipervnculo"/>
@@ -3619,7 +3911,7 @@
                 <w:noProof/>
                 <w:webHidden/>
               </w:rPr>
-              <w:instrText xml:space="preserve"> PAGEREF _Toc238930429 \h </w:instrText>
+              <w:instrText xml:space="preserve"> PAGEREF _Toc239435032 \h </w:instrText>
             </w:r>
             <w:r>
               <w:rPr>
@@ -3639,7 +3931,7 @@
                 <w:noProof/>
                 <w:webHidden/>
               </w:rPr>
-              <w:t>23</w:t>
+              <w:t>26</w:t>
             </w:r>
             <w:r>
               <w:rPr>
@@ -3665,7 +3957,7 @@
               <w14:ligatures w14:val="standardContextual"/>
             </w:rPr>
           </w:pPr>
-          <w:hyperlink w:anchor="_Toc238930430" w:history="1">
+          <w:hyperlink w:anchor="_Toc239435033" w:history="1">
             <w:r>
               <w:rPr>
                 <w:rStyle w:val="Hipervnculo"/>
@@ -3692,7 +3984,7 @@
                 <w:noProof/>
                 <w:webHidden/>
               </w:rPr>
-              <w:instrText xml:space="preserve"> PAGEREF _Toc238930430 \h </w:instrText>
+              <w:instrText xml:space="preserve"> PAGEREF _Toc239435033 \h </w:instrText>
             </w:r>
             <w:r>
               <w:rPr>
@@ -3712,7 +4004,7 @@
                 <w:noProof/>
                 <w:webHidden/>
               </w:rPr>
-              <w:t>23</w:t>
+              <w:t>26</w:t>
             </w:r>
             <w:r>
               <w:rPr>
@@ -3738,7 +4030,7 @@
               <w14:ligatures w14:val="standardContextual"/>
             </w:rPr>
           </w:pPr>
-          <w:hyperlink w:anchor="_Toc238930431" w:history="1">
+          <w:hyperlink w:anchor="_Toc239435034" w:history="1">
             <w:r>
               <w:rPr>
                 <w:rStyle w:val="Hipervnculo"/>
@@ -3765,7 +4057,7 @@
                 <w:noProof/>
                 <w:webHidden/>
               </w:rPr>
-              <w:instrText xml:space="preserve"> PAGEREF _Toc238930431 \h </w:instrText>
+              <w:instrText xml:space="preserve"> PAGEREF _Toc239435034 \h </w:instrText>
             </w:r>
             <w:r>
               <w:rPr>
@@ -3785,7 +4077,7 @@
                 <w:noProof/>
                 <w:webHidden/>
               </w:rPr>
-              <w:t>23</w:t>
+              <w:t>26</w:t>
             </w:r>
             <w:r>
               <w:rPr>
@@ -3811,7 +4103,7 @@
               <w14:ligatures w14:val="standardContextual"/>
             </w:rPr>
           </w:pPr>
-          <w:hyperlink w:anchor="_Toc238930432" w:history="1">
+          <w:hyperlink w:anchor="_Toc239435035" w:history="1">
             <w:r>
               <w:rPr>
                 <w:rStyle w:val="Hipervnculo"/>
@@ -3838,7 +4130,7 @@
                 <w:noProof/>
                 <w:webHidden/>
               </w:rPr>
-              <w:instrText xml:space="preserve"> PAGEREF _Toc238930432 \h </w:instrText>
+              <w:instrText xml:space="preserve"> PAGEREF _Toc239435035 \h </w:instrText>
             </w:r>
             <w:r>
               <w:rPr>
@@ -3858,7 +4150,7 @@
                 <w:noProof/>
                 <w:webHidden/>
               </w:rPr>
-              <w:t>24</w:t>
+              <w:t>27</w:t>
             </w:r>
             <w:r>
               <w:rPr>
@@ -3884,7 +4176,7 @@
               <w14:ligatures w14:val="standardContextual"/>
             </w:rPr>
           </w:pPr>
-          <w:hyperlink w:anchor="_Toc238930433" w:history="1">
+          <w:hyperlink w:anchor="_Toc239435036" w:history="1">
             <w:r>
               <w:rPr>
                 <w:rStyle w:val="Hipervnculo"/>
@@ -3911,7 +4203,7 @@
                 <w:noProof/>
                 <w:webHidden/>
               </w:rPr>
-              <w:instrText xml:space="preserve"> PAGEREF _Toc238930433 \h </w:instrText>
+              <w:instrText xml:space="preserve"> PAGEREF _Toc239435036 \h </w:instrText>
             </w:r>
             <w:r>
               <w:rPr>
@@ -3931,7 +4223,7 @@
                 <w:noProof/>
                 <w:webHidden/>
               </w:rPr>
-              <w:t>25</w:t>
+              <w:t>28</w:t>
             </w:r>
             <w:r>
               <w:rPr>
@@ -3957,7 +4249,7 @@
               <w14:ligatures w14:val="standardContextual"/>
             </w:rPr>
           </w:pPr>
-          <w:hyperlink w:anchor="_Toc238930434" w:history="1">
+          <w:hyperlink w:anchor="_Toc239435037" w:history="1">
             <w:r>
               <w:rPr>
                 <w:rStyle w:val="Hipervnculo"/>
@@ -3984,7 +4276,7 @@
                 <w:noProof/>
                 <w:webHidden/>
               </w:rPr>
-              <w:instrText xml:space="preserve"> PAGEREF _Toc238930434 \h </w:instrText>
+              <w:instrText xml:space="preserve"> PAGEREF _Toc239435037 \h </w:instrText>
             </w:r>
             <w:r>
               <w:rPr>
@@ -4004,7 +4296,7 @@
                 <w:noProof/>
                 <w:webHidden/>
               </w:rPr>
-              <w:t>26</w:t>
+              <w:t>29</w:t>
             </w:r>
             <w:r>
               <w:rPr>
@@ -4030,7 +4322,7 @@
               <w14:ligatures w14:val="standardContextual"/>
             </w:rPr>
           </w:pPr>
-          <w:hyperlink w:anchor="_Toc238930435" w:history="1">
+          <w:hyperlink w:anchor="_Toc239435038" w:history="1">
             <w:r>
               <w:rPr>
                 <w:rStyle w:val="Hipervnculo"/>
@@ -4057,7 +4349,7 @@
                 <w:noProof/>
                 <w:webHidden/>
               </w:rPr>
-              <w:instrText xml:space="preserve"> PAGEREF _Toc238930435 \h </w:instrText>
+              <w:instrText xml:space="preserve"> PAGEREF _Toc239435038 \h </w:instrText>
             </w:r>
             <w:r>
               <w:rPr>
@@ -4077,7 +4369,7 @@
                 <w:noProof/>
                 <w:webHidden/>
               </w:rPr>
-              <w:t>27</w:t>
+              <w:t>30</w:t>
             </w:r>
             <w:r>
               <w:rPr>
@@ -4103,7 +4395,7 @@
               <w14:ligatures w14:val="standardContextual"/>
             </w:rPr>
           </w:pPr>
-          <w:hyperlink w:anchor="_Toc238930436" w:history="1">
+          <w:hyperlink w:anchor="_Toc239435039" w:history="1">
             <w:r>
               <w:rPr>
                 <w:rStyle w:val="Hipervnculo"/>
@@ -4130,7 +4422,7 @@
                 <w:noProof/>
                 <w:webHidden/>
               </w:rPr>
-              <w:instrText xml:space="preserve"> PAGEREF _Toc238930436 \h </w:instrText>
+              <w:instrText xml:space="preserve"> PAGEREF _Toc239435039 \h </w:instrText>
             </w:r>
             <w:r>
               <w:rPr>
@@ -4150,7 +4442,7 @@
                 <w:noProof/>
                 <w:webHidden/>
               </w:rPr>
-              <w:t>28</w:t>
+              <w:t>31</w:t>
             </w:r>
             <w:r>
               <w:rPr>
@@ -4176,7 +4468,7 @@
               <w14:ligatures w14:val="standardContextual"/>
             </w:rPr>
           </w:pPr>
-          <w:hyperlink w:anchor="_Toc238930437" w:history="1">
+          <w:hyperlink w:anchor="_Toc239435040" w:history="1">
             <w:r>
               <w:rPr>
                 <w:rStyle w:val="Hipervnculo"/>
@@ -4203,7 +4495,7 @@
                 <w:noProof/>
                 <w:webHidden/>
               </w:rPr>
-              <w:instrText xml:space="preserve"> PAGEREF _Toc238930437 \h </w:instrText>
+              <w:instrText xml:space="preserve"> PAGEREF _Toc239435040 \h </w:instrText>
             </w:r>
             <w:r>
               <w:rPr>
@@ -4223,7 +4515,7 @@
                 <w:noProof/>
                 <w:webHidden/>
               </w:rPr>
-              <w:t>29</w:t>
+              <w:t>32</w:t>
             </w:r>
             <w:r>
               <w:rPr>
@@ -4249,7 +4541,7 @@
               <w14:ligatures w14:val="standardContextual"/>
             </w:rPr>
           </w:pPr>
-          <w:hyperlink w:anchor="_Toc238930438" w:history="1">
+          <w:hyperlink w:anchor="_Toc239435041" w:history="1">
             <w:r>
               <w:rPr>
                 <w:rStyle w:val="Hipervnculo"/>
@@ -4276,7 +4568,7 @@
                 <w:noProof/>
                 <w:webHidden/>
               </w:rPr>
-              <w:instrText xml:space="preserve"> PAGEREF _Toc238930438 \h </w:instrText>
+              <w:instrText xml:space="preserve"> PAGEREF _Toc239435041 \h </w:instrText>
             </w:r>
             <w:r>
               <w:rPr>
@@ -4296,7 +4588,7 @@
                 <w:noProof/>
                 <w:webHidden/>
               </w:rPr>
-              <w:t>29</w:t>
+              <w:t>32</w:t>
             </w:r>
             <w:r>
               <w:rPr>
@@ -4322,7 +4614,7 @@
               <w14:ligatures w14:val="standardContextual"/>
             </w:rPr>
           </w:pPr>
-          <w:hyperlink w:anchor="_Toc238930439" w:history="1">
+          <w:hyperlink w:anchor="_Toc239435042" w:history="1">
             <w:r>
               <w:rPr>
                 <w:rStyle w:val="Hipervnculo"/>
@@ -4349,7 +4641,7 @@
                 <w:noProof/>
                 <w:webHidden/>
               </w:rPr>
-              <w:instrText xml:space="preserve"> PAGEREF _Toc238930439 \h </w:instrText>
+              <w:instrText xml:space="preserve"> PAGEREF _Toc239435042 \h </w:instrText>
             </w:r>
             <w:r>
               <w:rPr>
@@ -4369,7 +4661,7 @@
                 <w:noProof/>
                 <w:webHidden/>
               </w:rPr>
-              <w:t>30</w:t>
+              <w:t>33</w:t>
             </w:r>
             <w:r>
               <w:rPr>
@@ -4395,7 +4687,7 @@
               <w14:ligatures w14:val="standardContextual"/>
             </w:rPr>
           </w:pPr>
-          <w:hyperlink w:anchor="_Toc238930440" w:history="1">
+          <w:hyperlink w:anchor="_Toc239435043" w:history="1">
             <w:r>
               <w:rPr>
                 <w:rStyle w:val="Hipervnculo"/>
@@ -4422,7 +4714,7 @@
                 <w:noProof/>
                 <w:webHidden/>
               </w:rPr>
-              <w:instrText xml:space="preserve"> PAGEREF _Toc238930440 \h </w:instrText>
+              <w:instrText xml:space="preserve"> PAGEREF _Toc239435043 \h </w:instrText>
             </w:r>
             <w:r>
               <w:rPr>
@@ -4442,7 +4734,7 @@
                 <w:noProof/>
                 <w:webHidden/>
               </w:rPr>
-              <w:t>30</w:t>
+              <w:t>33</w:t>
             </w:r>
             <w:r>
               <w:rPr>
@@ -4468,7 +4760,7 @@
               <w14:ligatures w14:val="standardContextual"/>
             </w:rPr>
           </w:pPr>
-          <w:hyperlink w:anchor="_Toc238930441" w:history="1">
+          <w:hyperlink w:anchor="_Toc239435044" w:history="1">
             <w:r>
               <w:rPr>
                 <w:rStyle w:val="Hipervnculo"/>
@@ -4495,7 +4787,7 @@
                 <w:noProof/>
                 <w:webHidden/>
               </w:rPr>
-              <w:instrText xml:space="preserve"> PAGEREF _Toc238930441 \h </w:instrText>
+              <w:instrText xml:space="preserve"> PAGEREF _Toc239435044 \h </w:instrText>
             </w:r>
             <w:r>
               <w:rPr>
@@ -4515,7 +4807,7 @@
                 <w:noProof/>
                 <w:webHidden/>
               </w:rPr>
-              <w:t>30</w:t>
+              <w:t>33</w:t>
             </w:r>
             <w:r>
               <w:rPr>
@@ -4541,7 +4833,7 @@
               <w14:ligatures w14:val="standardContextual"/>
             </w:rPr>
           </w:pPr>
-          <w:hyperlink w:anchor="_Toc238930442" w:history="1">
+          <w:hyperlink w:anchor="_Toc239435045" w:history="1">
             <w:r>
               <w:rPr>
                 <w:rStyle w:val="Hipervnculo"/>
@@ -4568,7 +4860,7 @@
                 <w:noProof/>
                 <w:webHidden/>
               </w:rPr>
-              <w:instrText xml:space="preserve"> PAGEREF _Toc238930442 \h </w:instrText>
+              <w:instrText xml:space="preserve"> PAGEREF _Toc239435045 \h </w:instrText>
             </w:r>
             <w:r>
               <w:rPr>
@@ -4588,7 +4880,7 @@
                 <w:noProof/>
                 <w:webHidden/>
               </w:rPr>
-              <w:t>31</w:t>
+              <w:t>34</w:t>
             </w:r>
             <w:r>
               <w:rPr>
@@ -4614,7 +4906,7 @@
               <w14:ligatures w14:val="standardContextual"/>
             </w:rPr>
           </w:pPr>
-          <w:hyperlink w:anchor="_Toc238930443" w:history="1">
+          <w:hyperlink w:anchor="_Toc239435046" w:history="1">
             <w:r>
               <w:rPr>
                 <w:rStyle w:val="Hipervnculo"/>
@@ -4641,7 +4933,7 @@
                 <w:noProof/>
                 <w:webHidden/>
               </w:rPr>
-              <w:instrText xml:space="preserve"> PAGEREF _Toc238930443 \h </w:instrText>
+              <w:instrText xml:space="preserve"> PAGEREF _Toc239435046 \h </w:instrText>
             </w:r>
             <w:r>
               <w:rPr>
@@ -4661,7 +4953,7 @@
                 <w:noProof/>
                 <w:webHidden/>
               </w:rPr>
-              <w:t>32</w:t>
+              <w:t>35</w:t>
             </w:r>
             <w:r>
               <w:rPr>
@@ -4687,7 +4979,7 @@
               <w14:ligatures w14:val="standardContextual"/>
             </w:rPr>
           </w:pPr>
-          <w:hyperlink w:anchor="_Toc238930444" w:history="1">
+          <w:hyperlink w:anchor="_Toc239435047" w:history="1">
             <w:r>
               <w:rPr>
                 <w:rStyle w:val="Hipervnculo"/>
@@ -4714,7 +5006,7 @@
                 <w:noProof/>
                 <w:webHidden/>
               </w:rPr>
-              <w:instrText xml:space="preserve"> PAGEREF _Toc238930444 \h </w:instrText>
+              <w:instrText xml:space="preserve"> PAGEREF _Toc239435047 \h </w:instrText>
             </w:r>
             <w:r>
               <w:rPr>
@@ -4734,7 +5026,7 @@
                 <w:noProof/>
                 <w:webHidden/>
               </w:rPr>
-              <w:t>33</w:t>
+              <w:t>36</w:t>
             </w:r>
             <w:r>
               <w:rPr>
@@ -4760,7 +5052,7 @@
               <w14:ligatures w14:val="standardContextual"/>
             </w:rPr>
           </w:pPr>
-          <w:hyperlink w:anchor="_Toc238930445" w:history="1">
+          <w:hyperlink w:anchor="_Toc239435048" w:history="1">
             <w:r>
               <w:rPr>
                 <w:rStyle w:val="Hipervnculo"/>
@@ -4787,7 +5079,7 @@
                 <w:noProof/>
                 <w:webHidden/>
               </w:rPr>
-              <w:instrText xml:space="preserve"> PAGEREF _Toc238930445 \h </w:instrText>
+              <w:instrText xml:space="preserve"> PAGEREF _Toc239435048 \h </w:instrText>
             </w:r>
             <w:r>
               <w:rPr>
@@ -4807,7 +5099,7 @@
                 <w:noProof/>
                 <w:webHidden/>
               </w:rPr>
-              <w:t>35</w:t>
+              <w:t>38</w:t>
             </w:r>
             <w:r>
               <w:rPr>
@@ -4833,7 +5125,7 @@
               <w14:ligatures w14:val="standardContextual"/>
             </w:rPr>
           </w:pPr>
-          <w:hyperlink w:anchor="_Toc238930446" w:history="1">
+          <w:hyperlink w:anchor="_Toc239435049" w:history="1">
             <w:r>
               <w:rPr>
                 <w:rStyle w:val="Hipervnculo"/>
@@ -4860,7 +5152,7 @@
                 <w:noProof/>
                 <w:webHidden/>
               </w:rPr>
-              <w:instrText xml:space="preserve"> PAGEREF _Toc238930446 \h </w:instrText>
+              <w:instrText xml:space="preserve"> PAGEREF _Toc239435049 \h </w:instrText>
             </w:r>
             <w:r>
               <w:rPr>
@@ -4880,7 +5172,7 @@
                 <w:noProof/>
                 <w:webHidden/>
               </w:rPr>
-              <w:t>35</w:t>
+              <w:t>38</w:t>
             </w:r>
             <w:r>
               <w:rPr>
@@ -4906,7 +5198,7 @@
               <w14:ligatures w14:val="standardContextual"/>
             </w:rPr>
           </w:pPr>
-          <w:hyperlink w:anchor="_Toc238930447" w:history="1">
+          <w:hyperlink w:anchor="_Toc239435050" w:history="1">
             <w:r>
               <w:rPr>
                 <w:rStyle w:val="Hipervnculo"/>
@@ -4933,7 +5225,7 @@
                 <w:noProof/>
                 <w:webHidden/>
               </w:rPr>
-              <w:instrText xml:space="preserve"> PAGEREF _Toc238930447 \h </w:instrText>
+              <w:instrText xml:space="preserve"> PAGEREF _Toc239435050 \h </w:instrText>
             </w:r>
             <w:r>
               <w:rPr>
@@ -4953,7 +5245,7 @@
                 <w:noProof/>
                 <w:webHidden/>
               </w:rPr>
-              <w:t>35</w:t>
+              <w:t>38</w:t>
             </w:r>
             <w:r>
               <w:rPr>
@@ -4979,7 +5271,7 @@
               <w14:ligatures w14:val="standardContextual"/>
             </w:rPr>
           </w:pPr>
-          <w:hyperlink w:anchor="_Toc238930448" w:history="1">
+          <w:hyperlink w:anchor="_Toc239435051" w:history="1">
             <w:r>
               <w:rPr>
                 <w:rStyle w:val="Hipervnculo"/>
@@ -5006,7 +5298,7 @@
                 <w:noProof/>
                 <w:webHidden/>
               </w:rPr>
-              <w:instrText xml:space="preserve"> PAGEREF _Toc238930448 \h </w:instrText>
+              <w:instrText xml:space="preserve"> PAGEREF _Toc239435051 \h </w:instrText>
             </w:r>
             <w:r>
               <w:rPr>
@@ -5026,7 +5318,7 @@
                 <w:noProof/>
                 <w:webHidden/>
               </w:rPr>
-              <w:t>35</w:t>
+              <w:t>38</w:t>
             </w:r>
             <w:r>
               <w:rPr>
@@ -5052,7 +5344,7 @@
               <w14:ligatures w14:val="standardContextual"/>
             </w:rPr>
           </w:pPr>
-          <w:hyperlink w:anchor="_Toc238930449" w:history="1">
+          <w:hyperlink w:anchor="_Toc239435052" w:history="1">
             <w:r>
               <w:rPr>
                 <w:rStyle w:val="Hipervnculo"/>
@@ -5079,7 +5371,7 @@
                 <w:noProof/>
                 <w:webHidden/>
               </w:rPr>
-              <w:instrText xml:space="preserve"> PAGEREF _Toc238930449 \h </w:instrText>
+              <w:instrText xml:space="preserve"> PAGEREF _Toc239435052 \h </w:instrText>
             </w:r>
             <w:r>
               <w:rPr>
@@ -5099,7 +5391,7 @@
                 <w:noProof/>
                 <w:webHidden/>
               </w:rPr>
-              <w:t>36</w:t>
+              <w:t>39</w:t>
             </w:r>
             <w:r>
               <w:rPr>
@@ -5125,7 +5417,7 @@
               <w14:ligatures w14:val="standardContextual"/>
             </w:rPr>
           </w:pPr>
-          <w:hyperlink w:anchor="_Toc238930450" w:history="1">
+          <w:hyperlink w:anchor="_Toc239435053" w:history="1">
             <w:r>
               <w:rPr>
                 <w:rStyle w:val="Hipervnculo"/>
@@ -5152,7 +5444,7 @@
                 <w:noProof/>
                 <w:webHidden/>
               </w:rPr>
-              <w:instrText xml:space="preserve"> PAGEREF _Toc238930450 \h </w:instrText>
+              <w:instrText xml:space="preserve"> PAGEREF _Toc239435053 \h </w:instrText>
             </w:r>
             <w:r>
               <w:rPr>
@@ -5172,7 +5464,7 @@
                 <w:noProof/>
                 <w:webHidden/>
               </w:rPr>
-              <w:t>36</w:t>
+              <w:t>39</w:t>
             </w:r>
             <w:r>
               <w:rPr>
@@ -5198,7 +5490,7 @@
               <w14:ligatures w14:val="standardContextual"/>
             </w:rPr>
           </w:pPr>
-          <w:hyperlink w:anchor="_Toc238930451" w:history="1">
+          <w:hyperlink w:anchor="_Toc239435054" w:history="1">
             <w:r>
               <w:rPr>
                 <w:rStyle w:val="Hipervnculo"/>
@@ -5225,7 +5517,7 @@
                 <w:noProof/>
                 <w:webHidden/>
               </w:rPr>
-              <w:instrText xml:space="preserve"> PAGEREF _Toc238930451 \h </w:instrText>
+              <w:instrText xml:space="preserve"> PAGEREF _Toc239435054 \h </w:instrText>
             </w:r>
             <w:r>
               <w:rPr>
@@ -5245,7 +5537,7 @@
                 <w:noProof/>
                 <w:webHidden/>
               </w:rPr>
-              <w:t>36</w:t>
+              <w:t>39</w:t>
             </w:r>
             <w:r>
               <w:rPr>
@@ -5271,7 +5563,7 @@
               <w14:ligatures w14:val="standardContextual"/>
             </w:rPr>
           </w:pPr>
-          <w:hyperlink w:anchor="_Toc238930452" w:history="1">
+          <w:hyperlink w:anchor="_Toc239435055" w:history="1">
             <w:r>
               <w:rPr>
                 <w:rStyle w:val="Hipervnculo"/>
@@ -5298,7 +5590,7 @@
                 <w:noProof/>
                 <w:webHidden/>
               </w:rPr>
-              <w:instrText xml:space="preserve"> PAGEREF _Toc238930452 \h </w:instrText>
+              <w:instrText xml:space="preserve"> PAGEREF _Toc239435055 \h </w:instrText>
             </w:r>
             <w:r>
               <w:rPr>
@@ -5318,7 +5610,7 @@
                 <w:noProof/>
                 <w:webHidden/>
               </w:rPr>
-              <w:t>37</w:t>
+              <w:t>40</w:t>
             </w:r>
             <w:r>
               <w:rPr>
@@ -5344,7 +5636,7 @@
               <w14:ligatures w14:val="standardContextual"/>
             </w:rPr>
           </w:pPr>
-          <w:hyperlink w:anchor="_Toc238930453" w:history="1">
+          <w:hyperlink w:anchor="_Toc239435056" w:history="1">
             <w:r>
               <w:rPr>
                 <w:rStyle w:val="Hipervnculo"/>
@@ -5371,7 +5663,7 @@
                 <w:noProof/>
                 <w:webHidden/>
               </w:rPr>
-              <w:instrText xml:space="preserve"> PAGEREF _Toc238930453 \h </w:instrText>
+              <w:instrText xml:space="preserve"> PAGEREF _Toc239435056 \h </w:instrText>
             </w:r>
             <w:r>
               <w:rPr>
@@ -5391,7 +5683,7 @@
                 <w:noProof/>
                 <w:webHidden/>
               </w:rPr>
-              <w:t>38</w:t>
+              <w:t>41</w:t>
             </w:r>
             <w:r>
               <w:rPr>
@@ -5422,7 +5714,7 @@
       <w:pPr>
         <w:pStyle w:val="Ttulo1"/>
       </w:pPr>
-      <w:bookmarkStart w:id="3" w:name="_Toc238930408"/>
+      <w:bookmarkStart w:id="3" w:name="_Toc239435007"/>
       <w:r>
         <w:lastRenderedPageBreak/>
         <w:t>Table of Figures:</w:t>
@@ -6255,11 +6547,12 @@
       <w:pPr>
         <w:pStyle w:val="Ttulo1"/>
       </w:pPr>
-      <w:bookmarkStart w:id="4" w:name="_Toc238930409"/>
+      <w:bookmarkStart w:id="4" w:name="_Toc239435008"/>
       <w:r>
         <w:lastRenderedPageBreak/>
         <w:t>Introduction:</w:t>
       </w:r>
+      <w:bookmarkEnd w:id="4"/>
     </w:p>
     <w:p>
       <w:r>
@@ -6294,11 +6587,11 @@
     </w:p>
     <w:p>
       <w:r>
-        <w:t xml:space="preserve">This Master's Final Project applies that architecture to an Internet-connected radio-controlled (RC) vehicle. The prototype combines a Tamiya TT-01 Type E chassis, a Raspberry Pi 5, a Logitech C920 camera, a mobile-network dongle, a .NET device process, an ASP.NET Core signaling service, and a React browser interface. On the vehicle, the current video pipeline captures MJPEG frames and encodes H.264 in software before delivering the stream through WebRTC. In the browser, the operator can select the prototype device, </w:t>
+        <w:t xml:space="preserve">This Master's Final Project applies that architecture to an Internet-connected radio-controlled (RC) vehicle. The prototype combines a Tamiya TT-01 Type E chassis, a Raspberry Pi 5, a Logitech C920 camera, a mobile-network dongle, a .NET device process, an ASP.NET Core signaling service, and a React browser interface. On the vehicle, the current video pipeline captures MJPEG frames and encodes H.264 in software before delivering the stream through WebRTC. In the browser, the operator can select the prototype device, negotiate a session, view the live stream, and inspect the selected connectivity path. </w:t>
       </w:r>
       <w:r>
         <w:lastRenderedPageBreak/>
-        <w:t xml:space="preserve">negotiate a session, view the live stream, and inspect the selected connectivity path. Negotiated data channels establish the software structure for later control, command, telemetry, and </w:t>
+        <w:t xml:space="preserve">Negotiated data channels establish the software structure for later control, command, telemetry, and </w:t>
       </w:r>
       <w:proofErr w:type="gramStart"/>
       <w:r>
@@ -6327,10 +6620,12 @@
         <w:pStyle w:val="Ttulo2"/>
       </w:pPr>
       <w:bookmarkStart w:id="5" w:name="_Toc239434008"/>
+      <w:bookmarkStart w:id="6" w:name="_Toc239435009"/>
       <w:r>
         <w:t>Objectives</w:t>
       </w:r>
       <w:bookmarkEnd w:id="5"/>
+      <w:bookmarkEnd w:id="6"/>
     </w:p>
     <w:p>
       <w:r>
@@ -6386,11 +6681,13 @@
       <w:pPr>
         <w:pStyle w:val="Ttulo2"/>
       </w:pPr>
-      <w:bookmarkStart w:id="6" w:name="_Toc239434009"/>
+      <w:bookmarkStart w:id="7" w:name="_Toc239434009"/>
+      <w:bookmarkStart w:id="8" w:name="_Toc239435010"/>
       <w:r>
         <w:t>Scope and Limitations</w:t>
       </w:r>
-      <w:bookmarkEnd w:id="6"/>
+      <w:bookmarkEnd w:id="7"/>
+      <w:bookmarkEnd w:id="8"/>
     </w:p>
     <w:p>
       <w:r>
@@ -6415,11 +6712,11 @@
     </w:p>
     <w:p>
       <w:r>
-        <w:t xml:space="preserve">Several limits are material to the interpretation of the result. The measured value comes from one hardware configuration and a representative test setup; it is not a statistical characterization across mobility, coverage levels, </w:t>
+        <w:t xml:space="preserve">Several limits are material to the interpretation of the result. The measured value comes from one hardware configuration and a representative test setup; it is not a statistical characterization across mobility, coverage levels, packet loss, jitter, or every direct and relayed route. Although 5G is the target </w:t>
       </w:r>
       <w:r>
         <w:lastRenderedPageBreak/>
-        <w:t xml:space="preserve">packet loss, jitter, or every direct and relayed route. Although 5G is the target network for the project, the present iteration uses a Huawei 4G dongle for cost reasons. The 340 </w:t>
+        <w:t xml:space="preserve">network for the project, the present iteration uses a Huawei 4G dongle for cost reasons. The 340 </w:t>
       </w:r>
       <w:proofErr w:type="spellStart"/>
       <w:r>
@@ -6439,11 +6736,13 @@
       <w:pPr>
         <w:pStyle w:val="Ttulo2"/>
       </w:pPr>
-      <w:bookmarkStart w:id="7" w:name="_Toc239434010"/>
+      <w:bookmarkStart w:id="9" w:name="_Toc239434010"/>
+      <w:bookmarkStart w:id="10" w:name="_Toc239435011"/>
       <w:r>
         <w:t>Document Structure</w:t>
       </w:r>
-      <w:bookmarkEnd w:id="7"/>
+      <w:bookmarkEnd w:id="9"/>
+      <w:bookmarkEnd w:id="10"/>
     </w:p>
     <w:p>
       <w:r>
@@ -6459,6 +6758,7 @@
       <w:pPr>
         <w:pStyle w:val="Ttulo1"/>
       </w:pPr>
+      <w:bookmarkStart w:id="11" w:name="_Toc239435012"/>
       <w:r>
         <w:lastRenderedPageBreak/>
         <w:t>Hardware</w:t>
@@ -6466,7 +6766,7 @@
       <w:r>
         <w:t>:</w:t>
       </w:r>
-      <w:bookmarkEnd w:id="4"/>
+      <w:bookmarkEnd w:id="11"/>
     </w:p>
     <w:p>
       <w:r>
@@ -6509,7 +6809,7 @@
           <w:lang w:val="en-GB"/>
         </w:rPr>
       </w:pPr>
-      <w:bookmarkStart w:id="8" w:name="_Toc238930410"/>
+      <w:bookmarkStart w:id="12" w:name="_Toc239435013"/>
       <w:r>
         <w:rPr>
           <w:lang w:val="en-GB"/>
@@ -6522,7 +6822,7 @@
         </w:rPr>
         <w:t>:</w:t>
       </w:r>
-      <w:bookmarkEnd w:id="8"/>
+      <w:bookmarkEnd w:id="12"/>
     </w:p>
     <w:p>
       <w:pPr>
@@ -6531,14 +6831,14 @@
           <w:lang w:val="en-GB"/>
         </w:rPr>
       </w:pPr>
-      <w:bookmarkStart w:id="9" w:name="_Toc238930411"/>
+      <w:bookmarkStart w:id="13" w:name="_Toc239435014"/>
       <w:r>
         <w:rPr>
           <w:lang w:val="en-GB"/>
         </w:rPr>
         <w:t>RC Vehicle Chassis</w:t>
       </w:r>
-      <w:bookmarkEnd w:id="9"/>
+      <w:bookmarkEnd w:id="13"/>
     </w:p>
     <w:p>
       <w:r>
@@ -6639,8 +6939,8 @@
         <w:pStyle w:val="Descripcin"/>
         <w:jc w:val="center"/>
       </w:pPr>
-      <w:bookmarkStart w:id="10" w:name="_Toc231500490"/>
-      <w:bookmarkStart w:id="11" w:name="_Toc238930454"/>
+      <w:bookmarkStart w:id="14" w:name="_Toc231500490"/>
+      <w:bookmarkStart w:id="15" w:name="_Toc238930454"/>
       <w:r>
         <w:t xml:space="preserve">Figure </w:t>
       </w:r>
@@ -6665,8 +6965,8 @@
       <w:r>
         <w:t xml:space="preserve"> Tamiya Chassis</w:t>
       </w:r>
-      <w:bookmarkEnd w:id="10"/>
-      <w:bookmarkEnd w:id="11"/>
+      <w:bookmarkEnd w:id="14"/>
+      <w:bookmarkEnd w:id="15"/>
     </w:p>
     <w:p>
       <w:pPr>
@@ -6720,7 +7020,7 @@
         <w:pStyle w:val="Descripcin"/>
         <w:jc w:val="center"/>
       </w:pPr>
-      <w:bookmarkStart w:id="12" w:name="_Toc238930455"/>
+      <w:bookmarkStart w:id="16" w:name="_Toc238930455"/>
       <w:r>
         <w:t xml:space="preserve">Figure </w:t>
       </w:r>
@@ -6745,13 +7045,13 @@
       <w:r>
         <w:t xml:space="preserve"> STL Chassis</w:t>
       </w:r>
-      <w:bookmarkEnd w:id="12"/>
+      <w:bookmarkEnd w:id="16"/>
     </w:p>
     <w:p>
       <w:pPr>
         <w:pStyle w:val="Ttulo3"/>
       </w:pPr>
-      <w:bookmarkStart w:id="13" w:name="_Toc238930412"/>
+      <w:bookmarkStart w:id="17" w:name="_Toc239435015"/>
       <w:r>
         <w:t>Raspberry Pi</w:t>
       </w:r>
@@ -6761,7 +7061,7 @@
       <w:r>
         <w:t>:</w:t>
       </w:r>
-      <w:bookmarkEnd w:id="13"/>
+      <w:bookmarkEnd w:id="17"/>
     </w:p>
     <w:p>
       <w:r>
@@ -6809,7 +7109,7 @@
         </w:rPr>
         <w:lastRenderedPageBreak/>
         <w:drawing>
-          <wp:inline distT="0" distB="0" distL="0" distR="0" wp14:anchorId="78C8C91D" wp14:editId="3749084C">
+          <wp:inline distT="0" distB="0" distL="0" distR="0" wp14:anchorId="78C8C91D" wp14:editId="4125C96B">
             <wp:extent cx="5731510" cy="4350385"/>
             <wp:effectExtent l="0" t="0" r="2540" b="0"/>
             <wp:docPr id="214631915" name="Imagen 11" descr="RASPBERRY-PI RASPBERRY-PI 5 2G"/>
@@ -6863,7 +7163,7 @@
         <w:pStyle w:val="Descripcin"/>
         <w:jc w:val="center"/>
       </w:pPr>
-      <w:bookmarkStart w:id="14" w:name="_Toc238930456"/>
+      <w:bookmarkStart w:id="18" w:name="_Toc238930456"/>
       <w:r>
         <w:t xml:space="preserve">Figure </w:t>
       </w:r>
@@ -6888,17 +7188,17 @@
       <w:r>
         <w:t xml:space="preserve"> Raspberry Pi</w:t>
       </w:r>
-      <w:bookmarkEnd w:id="14"/>
+      <w:bookmarkEnd w:id="18"/>
     </w:p>
     <w:p>
       <w:pPr>
         <w:pStyle w:val="Ttulo3"/>
       </w:pPr>
-      <w:bookmarkStart w:id="15" w:name="_Toc238930413"/>
+      <w:bookmarkStart w:id="19" w:name="_Toc239435016"/>
       <w:r>
         <w:t>Camera:</w:t>
       </w:r>
-      <w:bookmarkEnd w:id="15"/>
+      <w:bookmarkEnd w:id="19"/>
     </w:p>
     <w:p>
       <w:r>
@@ -6981,7 +7281,7 @@
         <w:pStyle w:val="Descripcin"/>
         <w:jc w:val="center"/>
       </w:pPr>
-      <w:bookmarkStart w:id="16" w:name="_Toc238930457"/>
+      <w:bookmarkStart w:id="20" w:name="_Toc238930457"/>
       <w:r>
         <w:t xml:space="preserve">Figure </w:t>
       </w:r>
@@ -7006,17 +7306,17 @@
       <w:r>
         <w:t xml:space="preserve"> Logitech HD Pro C920</w:t>
       </w:r>
-      <w:bookmarkEnd w:id="16"/>
+      <w:bookmarkEnd w:id="20"/>
     </w:p>
     <w:p>
       <w:pPr>
         <w:pStyle w:val="Ttulo3"/>
       </w:pPr>
-      <w:bookmarkStart w:id="17" w:name="_Toc238930414"/>
+      <w:bookmarkStart w:id="21" w:name="_Toc239435017"/>
       <w:r>
         <w:t>5G Connectivity Dongle:</w:t>
       </w:r>
-      <w:bookmarkEnd w:id="17"/>
+      <w:bookmarkEnd w:id="21"/>
     </w:p>
     <w:p>
       <w:r>
@@ -7095,7 +7395,7 @@
         <w:pStyle w:val="Descripcin"/>
         <w:jc w:val="center"/>
       </w:pPr>
-      <w:bookmarkStart w:id="18" w:name="_Toc238930458"/>
+      <w:bookmarkStart w:id="22" w:name="_Toc238930458"/>
       <w:r>
         <w:t xml:space="preserve">Figure </w:t>
       </w:r>
@@ -7120,17 +7420,17 @@
       <w:r>
         <w:t xml:space="preserve"> Huawei 4G Dongle</w:t>
       </w:r>
-      <w:bookmarkEnd w:id="18"/>
+      <w:bookmarkEnd w:id="22"/>
     </w:p>
     <w:p>
       <w:pPr>
         <w:pStyle w:val="Ttulo3"/>
       </w:pPr>
-      <w:bookmarkStart w:id="19" w:name="_Toc238930415"/>
+      <w:bookmarkStart w:id="23" w:name="_Toc239435018"/>
       <w:r>
         <w:t>Power Supply System:</w:t>
       </w:r>
-      <w:bookmarkEnd w:id="19"/>
+      <w:bookmarkEnd w:id="23"/>
     </w:p>
     <w:p>
       <w:r>
@@ -7231,7 +7531,7 @@
         <w:pStyle w:val="Descripcin"/>
         <w:jc w:val="center"/>
       </w:pPr>
-      <w:bookmarkStart w:id="20" w:name="_Toc238930459"/>
+      <w:bookmarkStart w:id="24" w:name="_Toc238930459"/>
       <w:r>
         <w:t xml:space="preserve">Figure </w:t>
       </w:r>
@@ -7256,17 +7556,17 @@
       <w:r>
         <w:t xml:space="preserve"> NiMH Battery</w:t>
       </w:r>
-      <w:bookmarkEnd w:id="20"/>
+      <w:bookmarkEnd w:id="24"/>
     </w:p>
     <w:p>
       <w:pPr>
         <w:pStyle w:val="Ttulo2"/>
       </w:pPr>
-      <w:bookmarkStart w:id="21" w:name="_Toc238930416"/>
+      <w:bookmarkStart w:id="25" w:name="_Toc239435019"/>
       <w:r>
         <w:t>Design Considerations:</w:t>
       </w:r>
-      <w:bookmarkEnd w:id="21"/>
+      <w:bookmarkEnd w:id="25"/>
     </w:p>
     <w:p>
       <w:r>
@@ -7332,7 +7632,7 @@
       <w:pPr>
         <w:pStyle w:val="Ttulo1"/>
       </w:pPr>
-      <w:bookmarkStart w:id="22" w:name="_Toc238930417"/>
+      <w:bookmarkStart w:id="26" w:name="_Toc239435020"/>
       <w:r>
         <w:lastRenderedPageBreak/>
         <w:t xml:space="preserve">General </w:t>
@@ -7343,7 +7643,7 @@
       <w:r>
         <w:t>:</w:t>
       </w:r>
-      <w:bookmarkEnd w:id="22"/>
+      <w:bookmarkEnd w:id="26"/>
     </w:p>
     <w:p>
       <w:pPr>
@@ -7453,7 +7753,7 @@
           <w:lang w:val="en-GB"/>
         </w:rPr>
       </w:pPr>
-      <w:bookmarkStart w:id="23" w:name="_Toc238930460"/>
+      <w:bookmarkStart w:id="27" w:name="_Toc238930460"/>
       <w:r>
         <w:t xml:space="preserve">Figure </w:t>
       </w:r>
@@ -7478,50 +7778,50 @@
       <w:r>
         <w:t xml:space="preserve"> Signaling</w:t>
       </w:r>
-      <w:bookmarkEnd w:id="23"/>
+      <w:bookmarkEnd w:id="27"/>
     </w:p>
     <w:p>
       <w:pPr>
         <w:pStyle w:val="Ttulo2"/>
       </w:pPr>
-      <w:bookmarkStart w:id="24" w:name="_Toc238930418"/>
+      <w:bookmarkStart w:id="28" w:name="_Toc239435021"/>
       <w:r>
         <w:t>Architecture Components:</w:t>
       </w:r>
-      <w:bookmarkEnd w:id="24"/>
+      <w:bookmarkEnd w:id="28"/>
     </w:p>
     <w:p>
       <w:pPr>
         <w:pStyle w:val="Ttulo3"/>
       </w:pPr>
-      <w:bookmarkStart w:id="25" w:name="__RefHeading___Toc497_4194855202"/>
-      <w:bookmarkStart w:id="26" w:name="_Toc238930419"/>
-      <w:bookmarkEnd w:id="25"/>
+      <w:bookmarkStart w:id="29" w:name="__RefHeading___Toc497_4194855202"/>
+      <w:bookmarkStart w:id="30" w:name="_Toc239435022"/>
+      <w:bookmarkEnd w:id="29"/>
       <w:r>
         <w:t>Device (RC Car):</w:t>
       </w:r>
-      <w:bookmarkEnd w:id="26"/>
-    </w:p>
-    <w:p>
-      <w:r>
-        <w:t xml:space="preserve">The device is the physical endpoint installed on the vehicle. The Raspberry Pi 5 runs the local application, captures the stream from the forward-facing camera, creates the WebRTC peer connection, and interfaces with the </w:t>
+      <w:bookmarkEnd w:id="30"/>
+    </w:p>
+    <w:p>
+      <w:r>
+        <w:t xml:space="preserve">The device is the physical endpoint installed on the vehicle. The Raspberry Pi 5 runs the local application, captures the stream from the forward-facing camera, creates the WebRTC peer connection, and interfaces with the motor </w:t>
       </w:r>
       <w:r>
         <w:lastRenderedPageBreak/>
-        <w:t>motor and steering electronics. It reaches the Internet through the mobile connection and maintains a signaling connection with the application server so that it can announce its availability and receive session requests. During an active session, the device acts as the video producer and the consumer of the driving commands.</w:t>
+        <w:t>and steering electronics. It reaches the Internet through the mobile connection and maintains a signaling connection with the application server so that it can announce its availability and receive session requests. During an active session, the device acts as the video producer and the consumer of the driving commands.</w:t>
       </w:r>
     </w:p>
     <w:p>
       <w:pPr>
         <w:pStyle w:val="Ttulo3"/>
       </w:pPr>
-      <w:bookmarkStart w:id="27" w:name="__RefHeading___Toc499_4194855202"/>
-      <w:bookmarkStart w:id="28" w:name="_Toc238930420"/>
-      <w:bookmarkEnd w:id="27"/>
+      <w:bookmarkStart w:id="31" w:name="__RefHeading___Toc499_4194855202"/>
+      <w:bookmarkStart w:id="32" w:name="_Toc239435023"/>
+      <w:bookmarkEnd w:id="31"/>
       <w:r>
         <w:t>Application Server:</w:t>
       </w:r>
-      <w:bookmarkEnd w:id="28"/>
+      <w:bookmarkEnd w:id="32"/>
     </w:p>
     <w:p>
       <w:r>
@@ -7532,13 +7832,13 @@
       <w:pPr>
         <w:pStyle w:val="Ttulo3"/>
       </w:pPr>
-      <w:bookmarkStart w:id="29" w:name="__RefHeading___Toc501_4194855202"/>
-      <w:bookmarkStart w:id="30" w:name="_Toc238930421"/>
-      <w:bookmarkEnd w:id="29"/>
+      <w:bookmarkStart w:id="33" w:name="__RefHeading___Toc501_4194855202"/>
+      <w:bookmarkStart w:id="34" w:name="_Toc239435024"/>
+      <w:bookmarkEnd w:id="33"/>
       <w:r>
         <w:t>TURN Server:</w:t>
       </w:r>
-      <w:bookmarkEnd w:id="30"/>
+      <w:bookmarkEnd w:id="34"/>
     </w:p>
     <w:p>
       <w:r>
@@ -7555,13 +7855,13 @@
       <w:pPr>
         <w:pStyle w:val="Ttulo3"/>
       </w:pPr>
-      <w:bookmarkStart w:id="31" w:name="__RefHeading___Toc503_4194855202"/>
-      <w:bookmarkStart w:id="32" w:name="_Toc238930422"/>
-      <w:bookmarkEnd w:id="31"/>
+      <w:bookmarkStart w:id="35" w:name="__RefHeading___Toc503_4194855202"/>
+      <w:bookmarkStart w:id="36" w:name="_Toc239435025"/>
+      <w:bookmarkEnd w:id="35"/>
       <w:r>
         <w:t>Browser:</w:t>
       </w:r>
-      <w:bookmarkEnd w:id="32"/>
+      <w:bookmarkEnd w:id="36"/>
     </w:p>
     <w:p>
       <w:r>
@@ -7578,13 +7878,13 @@
       <w:pPr>
         <w:pStyle w:val="Ttulo2"/>
       </w:pPr>
-      <w:bookmarkStart w:id="33" w:name="__RefHeading___Toc505_4194855202"/>
-      <w:bookmarkStart w:id="34" w:name="_Toc238930423"/>
-      <w:bookmarkEnd w:id="33"/>
+      <w:bookmarkStart w:id="37" w:name="__RefHeading___Toc505_4194855202"/>
+      <w:bookmarkStart w:id="38" w:name="_Toc239435026"/>
+      <w:bookmarkEnd w:id="37"/>
       <w:r>
         <w:t>End-to-End Communication Flow:</w:t>
       </w:r>
-      <w:bookmarkEnd w:id="34"/>
+      <w:bookmarkEnd w:id="38"/>
     </w:p>
     <w:p>
       <w:r>
@@ -7690,18 +7990,15 @@
         <w:t xml:space="preserve">Bidirectional real-time operation. </w:t>
       </w:r>
       <w:r>
-        <w:t xml:space="preserve">During the active session, the Raspberry Pi captures and encodes frames from the onboard camera and sends the resulting video track to the player. The browser receives, decodes, and renders the stream for the operator. In the opposite direction, steering and throttle input collected by the user interface is serialized into compact control messages and transmitted over the WebRTC data channel. The device receives these messages and converts them into commands for the steering and motor interfaces. Media and control therefore share the negotiated </w:t>
-      </w:r>
-      <w:r>
+        <w:t>During the active session, the Raspberry Pi captures and encodes frames from the onboard camera and sends the resulting video track to the player. The browser receives, decodes, and renders the stream for the operator. In the opposite direction, steering and throttle input collected by the user interface is serialized into compact control messages and transmitted over the WebRTC data channel. The device receives these messages and converts them into commands for the steering and motor interfaces. Media and control therefore share the negotiated WebRTC route but remain logically separate streams with different timing and reliability requirements.</w:t>
+      </w:r>
+    </w:p>
+    <w:p>
+      <w:r>
+        <w:rPr>
+          <w:b/>
+        </w:rPr>
         <w:lastRenderedPageBreak/>
-        <w:t>WebRTC route but remain logically separate streams with different timing and reliability requirements.</w:t>
-      </w:r>
-    </w:p>
-    <w:p>
-      <w:r>
-        <w:rPr>
-          <w:b/>
-        </w:rPr>
         <w:t xml:space="preserve">Monitoring, recovery, and termination. </w:t>
       </w:r>
       <w:r>
@@ -7761,12 +8058,12 @@
       <w:pPr>
         <w:pStyle w:val="Ttulo1"/>
       </w:pPr>
-      <w:bookmarkStart w:id="35" w:name="_Toc238930424"/>
+      <w:bookmarkStart w:id="39" w:name="_Toc239435027"/>
       <w:r>
         <w:lastRenderedPageBreak/>
         <w:t>WebRTC:</w:t>
       </w:r>
-      <w:bookmarkEnd w:id="35"/>
+      <w:bookmarkEnd w:id="39"/>
     </w:p>
     <w:p>
       <w:r>
@@ -7855,7 +8152,7 @@
         <w:pStyle w:val="Descripcin"/>
         <w:jc w:val="center"/>
       </w:pPr>
-      <w:bookmarkStart w:id="36" w:name="_Toc238930461"/>
+      <w:bookmarkStart w:id="40" w:name="_Toc238930461"/>
       <w:r>
         <w:t xml:space="preserve">Figure </w:t>
       </w:r>
@@ -7888,14 +8185,14 @@
       <w:r>
         <w:t xml:space="preserve"> protocol Stack</w:t>
       </w:r>
-      <w:bookmarkEnd w:id="36"/>
+      <w:bookmarkEnd w:id="40"/>
     </w:p>
     <w:p>
       <w:pPr>
         <w:pStyle w:val="Ttulo2"/>
       </w:pPr>
-      <w:bookmarkStart w:id="37" w:name="_Toc238835774"/>
-      <w:bookmarkStart w:id="38" w:name="_Toc238930425"/>
+      <w:bookmarkStart w:id="41" w:name="_Toc238835774"/>
+      <w:bookmarkStart w:id="42" w:name="_Toc239435028"/>
       <w:r>
         <w:rPr>
           <w:rFonts w:ascii="Century Gothic" w:hAnsi="Century Gothic"/>
@@ -7903,8 +8200,8 @@
         <w:lastRenderedPageBreak/>
         <w:t>WebRTC Model and Connection Establishment</w:t>
       </w:r>
-      <w:bookmarkEnd w:id="37"/>
-      <w:bookmarkEnd w:id="38"/>
+      <w:bookmarkEnd w:id="41"/>
+      <w:bookmarkEnd w:id="42"/>
     </w:p>
     <w:p>
       <w:r>
@@ -7985,16 +8282,16 @@
       <w:pPr>
         <w:pStyle w:val="Ttulo2"/>
       </w:pPr>
-      <w:bookmarkStart w:id="39" w:name="_Toc238835775"/>
-      <w:bookmarkStart w:id="40" w:name="_Toc238930426"/>
+      <w:bookmarkStart w:id="43" w:name="_Toc238835775"/>
+      <w:bookmarkStart w:id="44" w:name="_Toc239435029"/>
       <w:r>
         <w:rPr>
           <w:rFonts w:ascii="Century Gothic" w:hAnsi="Century Gothic"/>
         </w:rPr>
         <w:t>Transport Stack and Data Channels</w:t>
       </w:r>
-      <w:bookmarkEnd w:id="39"/>
-      <w:bookmarkEnd w:id="40"/>
+      <w:bookmarkEnd w:id="43"/>
+      <w:bookmarkEnd w:id="44"/>
     </w:p>
     <w:p>
       <w:r>
@@ -8658,11 +8955,11 @@
       </w:r>
       <w:proofErr w:type="gramEnd"/>
       <w:r>
-        <w:t xml:space="preserve"> RTP profiles, so audio and video payloads and most control information are protected as </w:t>
+        <w:t xml:space="preserve"> RTP profiles, so audio and video payloads and most control information are protected as SRTP and </w:t>
       </w:r>
       <w:r>
         <w:lastRenderedPageBreak/>
-        <w:t>SRTP and SRTCP. Datagram TLS (DTLS) authenticates the endpoints using fingerprints exchanged in SDP and exports the keying material used by SRTP; the video frames themselves are not transported inside DTLS records.</w:t>
+        <w:t>SRTCP. Datagram TLS (DTLS) authenticates the endpoints using fingerprints exchanged in SDP and exports the keying material used by SRTP; the video frames themselves are not transported inside DTLS records.</w:t>
       </w:r>
     </w:p>
     <w:p>
@@ -8747,16 +9044,16 @@
       <w:pPr>
         <w:pStyle w:val="Ttulo2"/>
       </w:pPr>
-      <w:bookmarkStart w:id="41" w:name="_Toc238835776"/>
-      <w:bookmarkStart w:id="42" w:name="_Toc238930427"/>
+      <w:bookmarkStart w:id="45" w:name="_Toc238835776"/>
+      <w:bookmarkStart w:id="46" w:name="_Toc239435030"/>
       <w:r>
         <w:rPr>
           <w:rFonts w:ascii="Century Gothic" w:hAnsi="Century Gothic"/>
         </w:rPr>
         <w:t>Video Codecs</w:t>
       </w:r>
-      <w:bookmarkEnd w:id="41"/>
-      <w:bookmarkEnd w:id="42"/>
+      <w:bookmarkEnd w:id="45"/>
+      <w:bookmarkEnd w:id="46"/>
     </w:p>
     <w:p>
       <w:r>
@@ -9392,13 +9689,13 @@
       <w:pPr>
         <w:pStyle w:val="Ttulo2"/>
       </w:pPr>
-      <w:bookmarkStart w:id="43" w:name="_Toc238835777"/>
-      <w:bookmarkStart w:id="44" w:name="_Toc238930428"/>
+      <w:bookmarkStart w:id="47" w:name="_Toc238835777"/>
+      <w:bookmarkStart w:id="48" w:name="_Toc239435031"/>
       <w:r>
         <w:t>WHIP and WHEP</w:t>
       </w:r>
-      <w:bookmarkEnd w:id="43"/>
-      <w:bookmarkEnd w:id="44"/>
+      <w:bookmarkEnd w:id="47"/>
+      <w:bookmarkEnd w:id="48"/>
     </w:p>
     <w:p>
       <w:r>
@@ -9451,11 +9748,11 @@
       </w:r>
       <w:proofErr w:type="gramEnd"/>
       <w:r>
-        <w:t xml:space="preserve"> that the player answers through the session resource. PATCH supports ICE-related updates and DELETE ends playback. WHEP defines a unidirectional media-</w:t>
+        <w:t xml:space="preserve"> that the player answers through the session resource. PATCH supports ICE-related updates and DELETE ends playback. WHEP defines a unidirectional media-server-to-viewer </w:t>
       </w:r>
       <w:r>
         <w:lastRenderedPageBreak/>
-        <w:t xml:space="preserve">server-to-viewer profile rather than a general replacement for </w:t>
+        <w:t xml:space="preserve">profile rather than a general replacement for </w:t>
       </w:r>
       <w:proofErr w:type="spellStart"/>
       <w:r>
@@ -9480,12 +9777,12 @@
       <w:pPr>
         <w:pStyle w:val="Ttulo1"/>
       </w:pPr>
-      <w:bookmarkStart w:id="45" w:name="_Toc238930429"/>
+      <w:bookmarkStart w:id="49" w:name="_Toc239435032"/>
       <w:r>
         <w:lastRenderedPageBreak/>
         <w:t>Client:</w:t>
       </w:r>
-      <w:bookmarkEnd w:id="45"/>
+      <w:bookmarkEnd w:id="49"/>
     </w:p>
     <w:p>
       <w:r>
@@ -9512,13 +9809,13 @@
       <w:pPr>
         <w:pStyle w:val="Ttulo2"/>
       </w:pPr>
-      <w:bookmarkStart w:id="46" w:name="_Toc238857460"/>
-      <w:bookmarkStart w:id="47" w:name="_Toc238930430"/>
+      <w:bookmarkStart w:id="50" w:name="_Toc238857460"/>
+      <w:bookmarkStart w:id="51" w:name="_Toc239435033"/>
       <w:r>
         <w:t>Runtime Initialization and Configuration</w:t>
       </w:r>
-      <w:bookmarkEnd w:id="46"/>
-      <w:bookmarkEnd w:id="47"/>
+      <w:bookmarkEnd w:id="50"/>
+      <w:bookmarkEnd w:id="51"/>
     </w:p>
     <w:p>
       <w:r>
@@ -9722,16 +10019,16 @@
       <w:pPr>
         <w:pStyle w:val="Ttulo2"/>
       </w:pPr>
-      <w:bookmarkStart w:id="48" w:name="_Toc238857461"/>
-      <w:bookmarkStart w:id="49" w:name="_Toc238930431"/>
+      <w:bookmarkStart w:id="52" w:name="_Toc238857461"/>
+      <w:bookmarkStart w:id="53" w:name="_Toc239435034"/>
       <w:r>
         <w:rPr>
           <w:b w:val="0"/>
         </w:rPr>
         <w:t>Registration and Connectivity Lifecycle</w:t>
       </w:r>
-      <w:bookmarkEnd w:id="48"/>
-      <w:bookmarkEnd w:id="49"/>
+      <w:bookmarkEnd w:id="52"/>
+      <w:bookmarkEnd w:id="53"/>
     </w:p>
     <w:p>
       <w:proofErr w:type="spellStart"/>
@@ -9780,16 +10077,16 @@
           <w:rFonts w:ascii="Consolas" w:eastAsia="Consolas" w:hAnsi="Consolas"/>
           <w:sz w:val="21"/>
         </w:rPr>
+        <w:t>WebRtcSessionManager.SetIceServers</w:t>
+      </w:r>
+      <w:proofErr w:type="spellEnd"/>
+      <w:r>
+        <w:t>, allowing connectivity policy to remain server-controlled while peer connections are created locally on demand.</w:t>
+      </w:r>
+    </w:p>
+    <w:p>
+      <w:r>
         <w:lastRenderedPageBreak/>
-        <w:t>WebRtcSessionManager.SetIceServers</w:t>
-      </w:r>
-      <w:proofErr w:type="spellEnd"/>
-      <w:r>
-        <w:t>, allowing connectivity policy to remain server-controlled while peer connections are created locally on demand.</w:t>
-      </w:r>
-    </w:p>
-    <w:p>
-      <w:r>
         <w:t xml:space="preserve">A one-second </w:t>
       </w:r>
       <w:proofErr w:type="spellStart"/>
@@ -10929,13 +11226,13 @@
       <w:pPr>
         <w:pStyle w:val="Ttulo2"/>
       </w:pPr>
-      <w:bookmarkStart w:id="50" w:name="_Toc238857462"/>
-      <w:bookmarkStart w:id="51" w:name="_Toc238930432"/>
+      <w:bookmarkStart w:id="54" w:name="_Toc238857462"/>
+      <w:bookmarkStart w:id="55" w:name="_Toc239435035"/>
       <w:r>
         <w:t>WebRTC Session Negotiation</w:t>
       </w:r>
-      <w:bookmarkEnd w:id="50"/>
-      <w:bookmarkEnd w:id="51"/>
+      <w:bookmarkEnd w:id="54"/>
+      <w:bookmarkEnd w:id="55"/>
     </w:p>
     <w:p>
       <w:r>
@@ -11028,11 +11325,7 @@
       </w:r>
       <w:proofErr w:type="spellEnd"/>
       <w:r>
-        <w:t xml:space="preserve"> installs the remote description inside a short per-session critical </w:t>
-      </w:r>
-      <w:r>
-        <w:lastRenderedPageBreak/>
-        <w:t xml:space="preserve">section, marks the session ready for remote candidates, copies the pending candidate list, and flushes it after leaving the lock. </w:t>
+        <w:t xml:space="preserve"> installs the remote description inside a short per-session critical section, marks the session ready for remote candidates, copies the pending candidate list, and flushes it after leaving the lock. </w:t>
       </w:r>
       <w:proofErr w:type="spellStart"/>
       <w:r>
@@ -11044,7 +11337,11 @@
       </w:r>
       <w:proofErr w:type="spellEnd"/>
       <w:r>
-        <w:t xml:space="preserve"> applies candidates immediately once the remote description exists; candidates that arrive earlier are appended to the same session-local list. This ordering satisfies the WebRTC state machine without delaying unrelated peers. When the connection becomes connected, </w:t>
+        <w:t xml:space="preserve"> applies candidates immediately once the remote description exists; candidates that </w:t>
+      </w:r>
+      <w:r>
+        <w:lastRenderedPageBreak/>
+        <w:t xml:space="preserve">arrive earlier are appended to the same session-local list. This ordering satisfies the WebRTC state machine without delaying unrelated peers. When the connection becomes connected, </w:t>
       </w:r>
       <w:proofErr w:type="spellStart"/>
       <w:r>
@@ -11087,13 +11384,13 @@
       <w:pPr>
         <w:pStyle w:val="Ttulo2"/>
       </w:pPr>
-      <w:bookmarkStart w:id="52" w:name="_Toc238857463"/>
-      <w:bookmarkStart w:id="53" w:name="_Toc238930433"/>
+      <w:bookmarkStart w:id="56" w:name="_Toc238857463"/>
+      <w:bookmarkStart w:id="57" w:name="_Toc239435036"/>
       <w:r>
         <w:t>Latency-Oriented Code Complexity</w:t>
       </w:r>
-      <w:bookmarkEnd w:id="52"/>
-      <w:bookmarkEnd w:id="53"/>
+      <w:bookmarkEnd w:id="56"/>
+      <w:bookmarkEnd w:id="57"/>
     </w:p>
     <w:p>
       <w:r>
@@ -12120,7 +12417,6 @@
                 <w:rFonts w:eastAsia="Century Gothic"/>
                 <w:sz w:val="16"/>
               </w:rPr>
-              <w:lastRenderedPageBreak/>
               <w:t>Timestamp</w:t>
             </w:r>
           </w:p>
@@ -12282,6 +12578,7 @@
                 <w:rFonts w:eastAsia="Century Gothic"/>
                 <w:sz w:val="16"/>
               </w:rPr>
+              <w:lastRenderedPageBreak/>
               <w:t>Distribution</w:t>
             </w:r>
           </w:p>
@@ -12655,13 +12952,13 @@
       <w:pPr>
         <w:pStyle w:val="Ttulo2"/>
       </w:pPr>
-      <w:bookmarkStart w:id="54" w:name="_Toc238857464"/>
-      <w:bookmarkStart w:id="55" w:name="_Toc238930434"/>
+      <w:bookmarkStart w:id="58" w:name="_Toc238857464"/>
+      <w:bookmarkStart w:id="59" w:name="_Toc239435037"/>
       <w:r>
         <w:t>Camera-to-WebRTC Video Pipeline</w:t>
       </w:r>
-      <w:bookmarkEnd w:id="54"/>
-      <w:bookmarkEnd w:id="55"/>
+      <w:bookmarkEnd w:id="58"/>
+      <w:bookmarkEnd w:id="59"/>
     </w:p>
     <w:p>
       <w:r>
@@ -12801,7 +13098,6 @@
           <w:rFonts w:ascii="Consolas" w:eastAsia="Consolas" w:hAnsi="Consolas"/>
           <w:sz w:val="21"/>
         </w:rPr>
-        <w:lastRenderedPageBreak/>
         <w:t>ReceiveAsync</w:t>
       </w:r>
       <w:proofErr w:type="spellEnd"/>
@@ -12844,7 +13140,11 @@
       </w:r>
       <w:proofErr w:type="gramEnd"/>
       <w:r>
-        <w:t xml:space="preserve"> SPS and PPS parameter sets and prepends them to an IDR frame when the encoder did not repeat them, then performs a single sized allocation for the Annex-B access unit. </w:t>
+        <w:t xml:space="preserve"> SPS and PPS parameter sets and prepends them to an IDR frame when the encoder did not </w:t>
+      </w:r>
+      <w:r>
+        <w:lastRenderedPageBreak/>
+        <w:t xml:space="preserve">repeat them, then performs a single sized allocation for the Annex-B access unit. </w:t>
       </w:r>
       <w:proofErr w:type="spellStart"/>
       <w:r>
@@ -12871,13 +13171,13 @@
       <w:pPr>
         <w:pStyle w:val="Ttulo2"/>
       </w:pPr>
-      <w:bookmarkStart w:id="56" w:name="_Toc238857465"/>
-      <w:bookmarkStart w:id="57" w:name="_Toc238930435"/>
+      <w:bookmarkStart w:id="60" w:name="_Toc238857465"/>
+      <w:bookmarkStart w:id="61" w:name="_Toc239435038"/>
       <w:r>
         <w:t>Control, Commands, Telemetry, and Events</w:t>
       </w:r>
-      <w:bookmarkEnd w:id="56"/>
-      <w:bookmarkEnd w:id="57"/>
+      <w:bookmarkEnd w:id="60"/>
+      <w:bookmarkEnd w:id="61"/>
     </w:p>
     <w:p>
       <w:r>
@@ -13785,14 +14085,13 @@
       <w:pPr>
         <w:pStyle w:val="Ttulo2"/>
       </w:pPr>
-      <w:bookmarkStart w:id="58" w:name="_Toc238857466"/>
-      <w:bookmarkStart w:id="59" w:name="_Toc238930436"/>
-      <w:r>
-        <w:lastRenderedPageBreak/>
+      <w:bookmarkStart w:id="62" w:name="_Toc238857466"/>
+      <w:bookmarkStart w:id="63" w:name="_Toc239435039"/>
+      <w:r>
         <w:t>Runtime Resilience</w:t>
       </w:r>
-      <w:bookmarkEnd w:id="58"/>
-      <w:bookmarkEnd w:id="59"/>
+      <w:bookmarkEnd w:id="62"/>
+      <w:bookmarkEnd w:id="63"/>
     </w:p>
     <w:p>
       <w:r>
@@ -13824,7 +14123,11 @@
       </w:r>
       <w:proofErr w:type="spellEnd"/>
       <w:r>
-        <w:t xml:space="preserve"> process from retaining the camera or filling the socket. If </w:t>
+        <w:t xml:space="preserve"> process from retaining the camera or filling the </w:t>
+      </w:r>
+      <w:r>
+        <w:lastRenderedPageBreak/>
+        <w:t xml:space="preserve">socket. If </w:t>
       </w:r>
       <w:proofErr w:type="spellStart"/>
       <w:r>
@@ -13905,12 +14208,12 @@
       <w:pPr>
         <w:pStyle w:val="Ttulo1"/>
       </w:pPr>
-      <w:bookmarkStart w:id="60" w:name="_Toc238930437"/>
+      <w:bookmarkStart w:id="64" w:name="_Toc239435040"/>
       <w:r>
         <w:lastRenderedPageBreak/>
         <w:t>Server:</w:t>
       </w:r>
-      <w:bookmarkEnd w:id="60"/>
+      <w:bookmarkEnd w:id="64"/>
     </w:p>
     <w:p>
       <w:r>
@@ -14004,7 +14307,7 @@
         <w:pStyle w:val="Descripcin"/>
         <w:jc w:val="center"/>
       </w:pPr>
-      <w:bookmarkStart w:id="61" w:name="_Toc238930462"/>
+      <w:bookmarkStart w:id="65" w:name="_Toc238930462"/>
       <w:r>
         <w:t xml:space="preserve">Figure </w:t>
       </w:r>
@@ -14029,19 +14332,19 @@
       <w:r>
         <w:t xml:space="preserve"> Device Selection Interface</w:t>
       </w:r>
-      <w:bookmarkEnd w:id="61"/>
+      <w:bookmarkEnd w:id="65"/>
     </w:p>
     <w:p>
       <w:pPr>
         <w:pStyle w:val="Ttulo2"/>
       </w:pPr>
-      <w:bookmarkStart w:id="62" w:name="_Toc238857468"/>
-      <w:bookmarkStart w:id="63" w:name="_Toc238930438"/>
+      <w:bookmarkStart w:id="66" w:name="_Toc238857468"/>
+      <w:bookmarkStart w:id="67" w:name="_Toc239435041"/>
       <w:r>
         <w:t>Application Composition</w:t>
       </w:r>
-      <w:bookmarkEnd w:id="62"/>
-      <w:bookmarkEnd w:id="63"/>
+      <w:bookmarkEnd w:id="66"/>
+      <w:bookmarkEnd w:id="67"/>
     </w:p>
     <w:p>
       <w:proofErr w:type="spellStart"/>
@@ -14271,13 +14574,13 @@
       <w:pPr>
         <w:pStyle w:val="Ttulo2"/>
       </w:pPr>
-      <w:bookmarkStart w:id="64" w:name="_Toc238857469"/>
-      <w:bookmarkStart w:id="65" w:name="_Toc238930439"/>
+      <w:bookmarkStart w:id="68" w:name="_Toc238857469"/>
+      <w:bookmarkStart w:id="69" w:name="_Toc239435042"/>
       <w:r>
         <w:t>Device Discovery and Operator Entry</w:t>
       </w:r>
-      <w:bookmarkEnd w:id="64"/>
-      <w:bookmarkEnd w:id="65"/>
+      <w:bookmarkEnd w:id="68"/>
+      <w:bookmarkEnd w:id="69"/>
     </w:p>
     <w:p>
       <w:r>
@@ -14414,13 +14717,13 @@
       <w:pPr>
         <w:pStyle w:val="Ttulo2"/>
       </w:pPr>
-      <w:bookmarkStart w:id="66" w:name="_Toc238857470"/>
-      <w:bookmarkStart w:id="67" w:name="_Toc238930440"/>
+      <w:bookmarkStart w:id="70" w:name="_Toc238857470"/>
+      <w:bookmarkStart w:id="71" w:name="_Toc239435043"/>
       <w:r>
         <w:t>Signaling Session Coordination</w:t>
       </w:r>
-      <w:bookmarkEnd w:id="66"/>
-      <w:bookmarkEnd w:id="67"/>
+      <w:bookmarkEnd w:id="70"/>
+      <w:bookmarkEnd w:id="71"/>
     </w:p>
     <w:p>
       <w:proofErr w:type="spellStart"/>
@@ -14615,13 +14918,13 @@
       <w:pPr>
         <w:pStyle w:val="Ttulo2"/>
       </w:pPr>
-      <w:bookmarkStart w:id="68" w:name="_Toc238857471"/>
-      <w:bookmarkStart w:id="69" w:name="_Toc238930441"/>
+      <w:bookmarkStart w:id="72" w:name="_Toc238857471"/>
+      <w:bookmarkStart w:id="73" w:name="_Toc239435044"/>
       <w:r>
         <w:t>Offer, Answer, and ICE Exchange</w:t>
       </w:r>
-      <w:bookmarkEnd w:id="68"/>
-      <w:bookmarkEnd w:id="69"/>
+      <w:bookmarkEnd w:id="72"/>
+      <w:bookmarkEnd w:id="73"/>
     </w:p>
     <w:p>
       <w:r>
@@ -14679,11 +14982,7 @@
         <w:t>Control</w:t>
       </w:r>
       <w:r>
-        <w:t xml:space="preserve"> installs the offer as its remote description, creates and installs an answer, and returns it </w:t>
-      </w:r>
-      <w:r>
-        <w:lastRenderedPageBreak/>
-        <w:t xml:space="preserve">through </w:t>
+        <w:t xml:space="preserve"> installs the offer as its remote description, creates and installs an answer, and returns it through </w:t>
       </w:r>
       <w:proofErr w:type="spellStart"/>
       <w:r>
@@ -14691,6 +14990,7 @@
           <w:rFonts w:ascii="Consolas" w:eastAsia="Consolas" w:hAnsi="Consolas"/>
           <w:sz w:val="21"/>
         </w:rPr>
+        <w:lastRenderedPageBreak/>
         <w:t>SendAnswer</w:t>
       </w:r>
       <w:proofErr w:type="spellEnd"/>
@@ -16230,13 +16530,13 @@
       <w:pPr>
         <w:pStyle w:val="Ttulo2"/>
       </w:pPr>
-      <w:bookmarkStart w:id="70" w:name="_Toc238857472"/>
-      <w:bookmarkStart w:id="71" w:name="_Toc238930442"/>
+      <w:bookmarkStart w:id="74" w:name="_Toc238857472"/>
+      <w:bookmarkStart w:id="75" w:name="_Toc239435045"/>
       <w:r>
         <w:t>Browser Media and Control Session</w:t>
       </w:r>
-      <w:bookmarkEnd w:id="70"/>
-      <w:bookmarkEnd w:id="71"/>
+      <w:bookmarkEnd w:id="74"/>
+      <w:bookmarkEnd w:id="75"/>
     </w:p>
     <w:p>
       <w:proofErr w:type="spellStart"/>
@@ -16303,11 +16603,7 @@
       </w:r>
       <w:proofErr w:type="spellEnd"/>
       <w:r>
-        <w:t xml:space="preserve"> to place the first </w:t>
-      </w:r>
-      <w:r>
-        <w:lastRenderedPageBreak/>
-        <w:t xml:space="preserve">received </w:t>
+        <w:t xml:space="preserve"> to place the first received </w:t>
       </w:r>
       <w:proofErr w:type="spellStart"/>
       <w:r>
@@ -16356,6 +16652,7 @@
     </w:p>
     <w:p>
       <w:r>
+        <w:lastRenderedPageBreak/>
         <w:t xml:space="preserve">When </w:t>
       </w:r>
       <w:proofErr w:type="spellStart"/>
@@ -16397,13 +16694,13 @@
       <w:pPr>
         <w:pStyle w:val="Ttulo2"/>
       </w:pPr>
-      <w:bookmarkStart w:id="72" w:name="_Toc238857473"/>
-      <w:bookmarkStart w:id="73" w:name="_Toc238930443"/>
+      <w:bookmarkStart w:id="76" w:name="_Toc238857473"/>
+      <w:bookmarkStart w:id="77" w:name="_Toc239435046"/>
       <w:r>
         <w:t>Validation and Standardized Interfaces</w:t>
       </w:r>
-      <w:bookmarkEnd w:id="72"/>
-      <w:bookmarkEnd w:id="73"/>
+      <w:bookmarkEnd w:id="76"/>
+      <w:bookmarkEnd w:id="77"/>
     </w:p>
     <w:p>
       <w:proofErr w:type="spellStart"/>
@@ -16514,12 +16811,12 @@
       <w:pPr>
         <w:pStyle w:val="Ttulo1"/>
       </w:pPr>
-      <w:bookmarkStart w:id="74" w:name="_Toc238930444"/>
+      <w:bookmarkStart w:id="78" w:name="_Toc239435047"/>
       <w:r>
         <w:lastRenderedPageBreak/>
         <w:t>Conclusions:</w:t>
       </w:r>
-      <w:bookmarkEnd w:id="74"/>
+      <w:bookmarkEnd w:id="78"/>
     </w:p>
     <w:p>
       <w:r>
@@ -16603,7 +16900,7 @@
         <w:pStyle w:val="Descripcin"/>
         <w:jc w:val="center"/>
       </w:pPr>
-      <w:bookmarkStart w:id="75" w:name="_Toc238930463"/>
+      <w:bookmarkStart w:id="79" w:name="_Toc238930463"/>
       <w:r>
         <w:t xml:space="preserve">Figure </w:t>
       </w:r>
@@ -16628,7 +16925,7 @@
       <w:r>
         <w:t xml:space="preserve"> Glass-To-Glass latency test (340ms)</w:t>
       </w:r>
-      <w:bookmarkEnd w:id="75"/>
+      <w:bookmarkEnd w:id="79"/>
     </w:p>
     <w:p>
       <w:r>
@@ -16645,11 +16942,11 @@
     </w:p>
     <w:p>
       <w:r>
-        <w:t xml:space="preserve">Further latency reductions remain possible. The current Raspberry Pi 5 pipeline captures MJPEG and encodes it in software with libx264. Hardware H.264 output is expected to reduce encoding delay, CPU load, and memory traffic </w:t>
+        <w:t xml:space="preserve">Further latency reductions remain possible. The current Raspberry Pi 5 pipeline captures MJPEG and encodes it in software with libx264. Hardware H.264 output is expected to reduce encoding delay, CPU load, and memory traffic by removing that conversion stage, provided the encoder does not introduce </w:t>
       </w:r>
       <w:r>
         <w:lastRenderedPageBreak/>
-        <w:t>by removing that conversion stage, provided the encoder does not introduce unnecessary buffering. Likewise, replacing the prototype's 4G connection with a genuine 5G deployment, preferably 5G Standalone under suitable coverage and routing conditions, could reduce radio-access latency and jitter. This is an expected improvement that must be measured end to end rather than assumed from the network label alone.</w:t>
+        <w:t>unnecessary buffering. Likewise, replacing the prototype's 4G connection with a genuine 5G deployment, preferably 5G Standalone under suitable coverage and routing conditions, could reduce radio-access latency and jitter. This is an expected improvement that must be measured end to end rather than assumed from the network label alone.</w:t>
       </w:r>
     </w:p>
     <w:p>
@@ -16722,7 +17019,7 @@
       <w:pPr>
         <w:pStyle w:val="Descripcin"/>
       </w:pPr>
-      <w:bookmarkStart w:id="76" w:name="_Toc238930464"/>
+      <w:bookmarkStart w:id="80" w:name="_Toc238930464"/>
       <w:r>
         <w:t xml:space="preserve">Figure </w:t>
       </w:r>
@@ -16747,7 +17044,7 @@
       <w:r>
         <w:t xml:space="preserve"> Live vehicle video-stream</w:t>
       </w:r>
-      <w:bookmarkEnd w:id="76"/>
+      <w:bookmarkEnd w:id="80"/>
     </w:p>
     <w:p>
       <w:r>
@@ -16758,22 +17055,22 @@
       <w:pPr>
         <w:pStyle w:val="Ttulo1"/>
       </w:pPr>
-      <w:bookmarkStart w:id="77" w:name="_Toc238930445"/>
+      <w:bookmarkStart w:id="81" w:name="_Toc239435048"/>
       <w:r>
         <w:lastRenderedPageBreak/>
         <w:t>Future Work:</w:t>
       </w:r>
-      <w:bookmarkEnd w:id="77"/>
+      <w:bookmarkEnd w:id="81"/>
     </w:p>
     <w:p>
       <w:pPr>
         <w:pStyle w:val="Ttulo2"/>
       </w:pPr>
-      <w:bookmarkStart w:id="78" w:name="_Toc238930446"/>
+      <w:bookmarkStart w:id="82" w:name="_Toc239435049"/>
       <w:r>
         <w:t>Complete Remote Control and Safety</w:t>
       </w:r>
-      <w:bookmarkEnd w:id="78"/>
+      <w:bookmarkEnd w:id="82"/>
     </w:p>
     <w:p>
       <w:r>
@@ -16797,11 +17094,11 @@
       <w:pPr>
         <w:pStyle w:val="Ttulo2"/>
       </w:pPr>
-      <w:bookmarkStart w:id="79" w:name="_Toc238930447"/>
+      <w:bookmarkStart w:id="83" w:name="_Toc239435050"/>
       <w:r>
         <w:t>IPv6 and Mobile-Network Validation</w:t>
       </w:r>
-      <w:bookmarkEnd w:id="79"/>
+      <w:bookmarkEnd w:id="83"/>
     </w:p>
     <w:p>
       <w:r>
@@ -16828,11 +17125,11 @@
       <w:pPr>
         <w:pStyle w:val="Ttulo2"/>
       </w:pPr>
-      <w:bookmarkStart w:id="80" w:name="_Toc238930448"/>
+      <w:bookmarkStart w:id="84" w:name="_Toc239435051"/>
       <w:r>
         <w:t>Hardware H.264 Camera</w:t>
       </w:r>
-      <w:bookmarkEnd w:id="80"/>
+      <w:bookmarkEnd w:id="84"/>
     </w:p>
     <w:p>
       <w:r>
@@ -16855,22 +17152,22 @@
       </w:r>
       <w:proofErr w:type="spellEnd"/>
       <w:r>
-        <w:t xml:space="preserve">/V4L2 support, CPU usage, and measured glass-to-glass latency. Hardware encoding should be adopted </w:t>
+        <w:t xml:space="preserve">/V4L2 support, CPU usage, and measured glass-to-glass latency. Hardware encoding should be adopted only if the </w:t>
       </w:r>
       <w:r>
         <w:lastRenderedPageBreak/>
-        <w:t>only if the camera and capture path do not add buffering that offsets the expected improvement.</w:t>
+        <w:t>camera and capture path do not add buffering that offsets the expected improvement.</w:t>
       </w:r>
     </w:p>
     <w:p>
       <w:pPr>
         <w:pStyle w:val="Ttulo2"/>
       </w:pPr>
-      <w:bookmarkStart w:id="81" w:name="_Toc238930449"/>
+      <w:bookmarkStart w:id="85" w:name="_Toc239435052"/>
       <w:r>
         <w:t>Protected Electrical Design</w:t>
       </w:r>
-      <w:bookmarkEnd w:id="81"/>
+      <w:bookmarkEnd w:id="85"/>
     </w:p>
     <w:p>
       <w:r>
@@ -16881,11 +17178,11 @@
       <w:pPr>
         <w:pStyle w:val="Ttulo2"/>
       </w:pPr>
-      <w:bookmarkStart w:id="82" w:name="_Toc238930450"/>
+      <w:bookmarkStart w:id="86" w:name="_Toc239435053"/>
       <w:r>
         <w:t>Mechanical Integration</w:t>
       </w:r>
-      <w:bookmarkEnd w:id="82"/>
+      <w:bookmarkEnd w:id="86"/>
     </w:p>
     <w:p>
       <w:r>
@@ -16904,11 +17201,11 @@
       <w:pPr>
         <w:pStyle w:val="Ttulo2"/>
       </w:pPr>
-      <w:bookmarkStart w:id="83" w:name="_Toc238930451"/>
+      <w:bookmarkStart w:id="87" w:name="_Toc239435054"/>
       <w:r>
         <w:t>ESP32-P4 Integrated Rust Platform</w:t>
       </w:r>
-      <w:bookmarkEnd w:id="83"/>
+      <w:bookmarkEnd w:id="87"/>
     </w:p>
     <w:p>
       <w:r>
@@ -16967,12 +17264,12 @@
       <w:pPr>
         <w:pStyle w:val="Ttulo2"/>
       </w:pPr>
-      <w:bookmarkStart w:id="84" w:name="_Toc238930452"/>
+      <w:bookmarkStart w:id="88" w:name="_Toc239435055"/>
       <w:r>
         <w:lastRenderedPageBreak/>
         <w:t>Final System Evaluation</w:t>
       </w:r>
-      <w:bookmarkEnd w:id="84"/>
+      <w:bookmarkEnd w:id="88"/>
     </w:p>
     <w:p>
       <w:r>
@@ -16988,12 +17285,12 @@
       <w:pPr>
         <w:pStyle w:val="Ttulo1"/>
       </w:pPr>
-      <w:bookmarkStart w:id="85" w:name="_Toc238930453"/>
+      <w:bookmarkStart w:id="89" w:name="_Toc239435056"/>
       <w:r>
         <w:lastRenderedPageBreak/>
         <w:t>References:</w:t>
       </w:r>
-      <w:bookmarkEnd w:id="85"/>
+      <w:bookmarkEnd w:id="89"/>
     </w:p>
     <w:p>
       <w:pPr>
@@ -17872,7 +18169,7 @@
         </mc:Choice>
         <mc:Fallback>
           <w:pict>
-            <v:rect w14:anchorId="059CEE4C" id="Rectángulo 63" o:spid="_x0000_s1028" style="position:absolute;margin-left:0;margin-top:0;width:468.5pt;height:21.3pt;z-index:-251657216;visibility:visible;mso-wrap-style:square;mso-width-percent:1000;mso-height-percent:27;mso-top-percent:45;mso-wrap-distance-left:9.35pt;mso-wrap-distance-top:0;mso-wrap-distance-right:9.35pt;mso-wrap-distance-bottom:0;mso-position-horizontal:center;mso-position-horizontal-relative:margin;mso-position-vertical-relative:page;mso-width-percent:1000;mso-height-percent:27;mso-top-percent:45;mso-width-relative:margin;mso-height-relative:page;v-text-anchor:middle" o:gfxdata="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" o:allowoverlap="f" fillcolor="#a5300f [3204]" stroked="f" strokeweight="1pt">
+            <v:rect w14:anchorId="059CEE4C" id="Rectángulo 63" o:spid="_x0000_s1028" style="position:absolute;left:0;text-align:left;margin-left:0;margin-top:0;width:468.5pt;height:21.3pt;z-index:-251657216;visibility:visible;mso-wrap-style:square;mso-width-percent:1000;mso-height-percent:27;mso-top-percent:45;mso-wrap-distance-left:9.35pt;mso-wrap-distance-top:0;mso-wrap-distance-right:9.35pt;mso-wrap-distance-bottom:0;mso-position-horizontal:center;mso-position-horizontal-relative:margin;mso-position-vertical-relative:page;mso-width-percent:1000;mso-height-percent:27;mso-top-percent:45;mso-width-relative:margin;mso-height-relative:page;v-text-anchor:middle" o:gfxdata="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" o:allowoverlap="f" fillcolor="#a5300f [3204]" stroked="f" strokeweight="1pt">
               <v:textbox style="mso-fit-shape-to-text:t">
                 <w:txbxContent>
                   <w:sdt>
@@ -18656,7 +18953,10 @@
   <w:style w:type="paragraph" w:default="1" w:styleId="Normal">
     <w:name w:val="Normal"/>
     <w:qFormat/>
-    <w:rsid w:val="000724B3"/>
+    <w:rsid w:val="0066536D"/>
+    <w:pPr>
+      <w:jc w:val="both"/>
+    </w:pPr>
     <w:rPr>
       <w:rFonts w:ascii="Century Gothic" w:hAnsi="Century Gothic"/>
       <w:sz w:val="24"/>

</xml_diff>

<commit_message>
Revise document structure and update sections for clarity and organization
</commit_message>
<xml_diff>
--- a/TFM.docx
+++ b/TFM.docx
@@ -912,7 +912,7 @@
       <w:pPr>
         <w:pStyle w:val="Ttulo1"/>
       </w:pPr>
-      <w:bookmarkStart w:id="0" w:name="_Toc239435004"/>
+      <w:bookmarkStart w:id="0" w:name="_Toc239787683"/>
       <w:r>
         <w:rPr>
           <w:noProof/>
@@ -1660,7 +1660,7 @@
       <w:pPr>
         <w:pStyle w:val="Ttulo1"/>
       </w:pPr>
-      <w:bookmarkStart w:id="1" w:name="_Toc239435005"/>
+      <w:bookmarkStart w:id="1" w:name="_Toc239787684"/>
       <w:r>
         <w:lastRenderedPageBreak/>
         <w:t>Acknowledgements</w:t>
@@ -1744,7 +1744,7 @@
       <w:pPr>
         <w:pStyle w:val="Ttulo1"/>
       </w:pPr>
-      <w:bookmarkStart w:id="2" w:name="_Toc239435006"/>
+      <w:bookmarkStart w:id="2" w:name="_Toc239787685"/>
       <w:r>
         <w:lastRenderedPageBreak/>
         <w:t>Abstract:</w:t>
@@ -1845,7 +1845,7 @@
           <w:r>
             <w:fldChar w:fldCharType="separate"/>
           </w:r>
-          <w:hyperlink w:anchor="_Toc239435004" w:history="1">
+          <w:hyperlink w:anchor="_Toc239787683" w:history="1">
             <w:r>
               <w:rPr>
                 <w:noProof/>
@@ -1865,7 +1865,7 @@
                 <w:noProof/>
                 <w:webHidden/>
               </w:rPr>
-              <w:instrText xml:space="preserve"> PAGEREF _Toc239435004 \h </w:instrText>
+              <w:instrText xml:space="preserve"> PAGEREF _Toc239787683 \h </w:instrText>
             </w:r>
             <w:r>
               <w:rPr>
@@ -1911,7 +1911,7 @@
               <w14:ligatures w14:val="standardContextual"/>
             </w:rPr>
           </w:pPr>
-          <w:hyperlink w:anchor="_Toc239435005" w:history="1">
+          <w:hyperlink w:anchor="_Toc239787684" w:history="1">
             <w:r>
               <w:rPr>
                 <w:rStyle w:val="Hipervnculo"/>
@@ -1938,7 +1938,7 @@
                 <w:noProof/>
                 <w:webHidden/>
               </w:rPr>
-              <w:instrText xml:space="preserve"> PAGEREF _Toc239435005 \h </w:instrText>
+              <w:instrText xml:space="preserve"> PAGEREF _Toc239787684 \h </w:instrText>
             </w:r>
             <w:r>
               <w:rPr>
@@ -1984,7 +1984,7 @@
               <w14:ligatures w14:val="standardContextual"/>
             </w:rPr>
           </w:pPr>
-          <w:hyperlink w:anchor="_Toc239435006" w:history="1">
+          <w:hyperlink w:anchor="_Toc239787685" w:history="1">
             <w:r>
               <w:rPr>
                 <w:rStyle w:val="Hipervnculo"/>
@@ -2011,7 +2011,7 @@
                 <w:noProof/>
                 <w:webHidden/>
               </w:rPr>
-              <w:instrText xml:space="preserve"> PAGEREF _Toc239435006 \h </w:instrText>
+              <w:instrText xml:space="preserve"> PAGEREF _Toc239787685 \h </w:instrText>
             </w:r>
             <w:r>
               <w:rPr>
@@ -2057,7 +2057,7 @@
               <w14:ligatures w14:val="standardContextual"/>
             </w:rPr>
           </w:pPr>
-          <w:hyperlink w:anchor="_Toc239435007" w:history="1">
+          <w:hyperlink w:anchor="_Toc239787686" w:history="1">
             <w:r>
               <w:rPr>
                 <w:rStyle w:val="Hipervnculo"/>
@@ -2084,7 +2084,7 @@
                 <w:noProof/>
                 <w:webHidden/>
               </w:rPr>
-              <w:instrText xml:space="preserve"> PAGEREF _Toc239435007 \h </w:instrText>
+              <w:instrText xml:space="preserve"> PAGEREF _Toc239787686 \h </w:instrText>
             </w:r>
             <w:r>
               <w:rPr>
@@ -2130,7 +2130,7 @@
               <w14:ligatures w14:val="standardContextual"/>
             </w:rPr>
           </w:pPr>
-          <w:hyperlink w:anchor="_Toc239435008" w:history="1">
+          <w:hyperlink w:anchor="_Toc239787687" w:history="1">
             <w:r>
               <w:rPr>
                 <w:rStyle w:val="Hipervnculo"/>
@@ -2157,7 +2157,7 @@
                 <w:noProof/>
                 <w:webHidden/>
               </w:rPr>
-              <w:instrText xml:space="preserve"> PAGEREF _Toc239435008 \h </w:instrText>
+              <w:instrText xml:space="preserve"> PAGEREF _Toc239787687 \h </w:instrText>
             </w:r>
             <w:r>
               <w:rPr>
@@ -2203,7 +2203,7 @@
               <w14:ligatures w14:val="standardContextual"/>
             </w:rPr>
           </w:pPr>
-          <w:hyperlink w:anchor="_Toc239435009" w:history="1">
+          <w:hyperlink w:anchor="_Toc239787688" w:history="1">
             <w:r>
               <w:rPr>
                 <w:rStyle w:val="Hipervnculo"/>
@@ -2230,7 +2230,7 @@
                 <w:noProof/>
                 <w:webHidden/>
               </w:rPr>
-              <w:instrText xml:space="preserve"> PAGEREF _Toc239435009 \h </w:instrText>
+              <w:instrText xml:space="preserve"> PAGEREF _Toc239787688 \h </w:instrText>
             </w:r>
             <w:r>
               <w:rPr>
@@ -2276,7 +2276,7 @@
               <w14:ligatures w14:val="standardContextual"/>
             </w:rPr>
           </w:pPr>
-          <w:hyperlink w:anchor="_Toc239435010" w:history="1">
+          <w:hyperlink w:anchor="_Toc239787689" w:history="1">
             <w:r>
               <w:rPr>
                 <w:rStyle w:val="Hipervnculo"/>
@@ -2303,7 +2303,7 @@
                 <w:noProof/>
                 <w:webHidden/>
               </w:rPr>
-              <w:instrText xml:space="preserve"> PAGEREF _Toc239435010 \h </w:instrText>
+              <w:instrText xml:space="preserve"> PAGEREF _Toc239787689 \h </w:instrText>
             </w:r>
             <w:r>
               <w:rPr>
@@ -2349,7 +2349,7 @@
               <w14:ligatures w14:val="standardContextual"/>
             </w:rPr>
           </w:pPr>
-          <w:hyperlink w:anchor="_Toc239435011" w:history="1">
+          <w:hyperlink w:anchor="_Toc239787690" w:history="1">
             <w:r>
               <w:rPr>
                 <w:rStyle w:val="Hipervnculo"/>
@@ -2376,7 +2376,7 @@
                 <w:noProof/>
                 <w:webHidden/>
               </w:rPr>
-              <w:instrText xml:space="preserve"> PAGEREF _Toc239435011 \h </w:instrText>
+              <w:instrText xml:space="preserve"> PAGEREF _Toc239787690 \h </w:instrText>
             </w:r>
             <w:r>
               <w:rPr>
@@ -2422,12 +2422,160 @@
               <w14:ligatures w14:val="standardContextual"/>
             </w:rPr>
           </w:pPr>
-          <w:hyperlink w:anchor="_Toc239435012" w:history="1">
+          <w:hyperlink w:anchor="_Toc239787691" w:history="1">
             <w:r>
               <w:rPr>
                 <w:rStyle w:val="Hipervnculo"/>
                 <w:noProof/>
               </w:rPr>
+              <w:t>Motivation:</w:t>
+            </w:r>
+            <w:r>
+              <w:rPr>
+                <w:noProof/>
+                <w:webHidden/>
+              </w:rPr>
+              <w:tab/>
+            </w:r>
+            <w:r>
+              <w:rPr>
+                <w:noProof/>
+                <w:webHidden/>
+              </w:rPr>
+              <w:fldChar w:fldCharType="begin"/>
+            </w:r>
+            <w:r>
+              <w:rPr>
+                <w:noProof/>
+                <w:webHidden/>
+              </w:rPr>
+              <w:instrText xml:space="preserve"> PAGEREF _Toc239787691 \h </w:instrText>
+            </w:r>
+            <w:r>
+              <w:rPr>
+                <w:noProof/>
+                <w:webHidden/>
+              </w:rPr>
+            </w:r>
+            <w:r>
+              <w:rPr>
+                <w:noProof/>
+                <w:webHidden/>
+              </w:rPr>
+              <w:fldChar w:fldCharType="separate"/>
+            </w:r>
+            <w:r>
+              <w:rPr>
+                <w:noProof/>
+                <w:webHidden/>
+              </w:rPr>
+              <w:t>10</w:t>
+            </w:r>
+            <w:r>
+              <w:rPr>
+                <w:noProof/>
+                <w:webHidden/>
+              </w:rPr>
+              <w:fldChar w:fldCharType="end"/>
+            </w:r>
+          </w:hyperlink>
+        </w:p>
+        <w:p>
+          <w:pPr>
+            <w:pStyle w:val="TDC1"/>
+            <w:tabs>
+              <w:tab w:val="right" w:leader="dot" w:pos="9016"/>
+            </w:tabs>
+            <w:rPr>
+              <w:rFonts w:asciiTheme="minorHAnsi" w:eastAsiaTheme="minorEastAsia" w:hAnsiTheme="minorHAnsi"/>
+              <w:noProof/>
+              <w:kern w:val="2"/>
+              <w:szCs w:val="24"/>
+              <w:lang w:val="en-GB" w:eastAsia="en-GB"/>
+              <w14:ligatures w14:val="standardContextual"/>
+            </w:rPr>
+          </w:pPr>
+          <w:hyperlink w:anchor="_Toc239787692" w:history="1">
+            <w:r>
+              <w:rPr>
+                <w:rStyle w:val="Hipervnculo"/>
+                <w:bCs/>
+                <w:noProof/>
+                <w:lang w:val="en-GB"/>
+              </w:rPr>
+              <w:t>Initial Design</w:t>
+            </w:r>
+            <w:r>
+              <w:rPr>
+                <w:noProof/>
+                <w:webHidden/>
+              </w:rPr>
+              <w:tab/>
+            </w:r>
+            <w:r>
+              <w:rPr>
+                <w:noProof/>
+                <w:webHidden/>
+              </w:rPr>
+              <w:fldChar w:fldCharType="begin"/>
+            </w:r>
+            <w:r>
+              <w:rPr>
+                <w:noProof/>
+                <w:webHidden/>
+              </w:rPr>
+              <w:instrText xml:space="preserve"> PAGEREF _Toc239787692 \h </w:instrText>
+            </w:r>
+            <w:r>
+              <w:rPr>
+                <w:noProof/>
+                <w:webHidden/>
+              </w:rPr>
+            </w:r>
+            <w:r>
+              <w:rPr>
+                <w:noProof/>
+                <w:webHidden/>
+              </w:rPr>
+              <w:fldChar w:fldCharType="separate"/>
+            </w:r>
+            <w:r>
+              <w:rPr>
+                <w:noProof/>
+                <w:webHidden/>
+              </w:rPr>
+              <w:t>11</w:t>
+            </w:r>
+            <w:r>
+              <w:rPr>
+                <w:noProof/>
+                <w:webHidden/>
+              </w:rPr>
+              <w:fldChar w:fldCharType="end"/>
+            </w:r>
+          </w:hyperlink>
+        </w:p>
+        <w:p>
+          <w:pPr>
+            <w:pStyle w:val="TDC1"/>
+            <w:tabs>
+              <w:tab w:val="right" w:leader="dot" w:pos="9016"/>
+            </w:tabs>
+            <w:rPr>
+              <w:rFonts w:asciiTheme="minorHAnsi" w:eastAsiaTheme="minorEastAsia" w:hAnsiTheme="minorHAnsi"/>
+              <w:noProof/>
+              <w:kern w:val="2"/>
+              <w:szCs w:val="24"/>
+              <w:lang w:val="en-GB" w:eastAsia="en-GB"/>
+              <w14:ligatures w14:val="standardContextual"/>
+            </w:rPr>
+          </w:pPr>
+          <w:hyperlink w:anchor="_Toc239787693" w:history="1">
+            <w:r>
+              <w:rPr>
+                <w:rStyle w:val="Hipervnculo"/>
+                <w:noProof/>
+              </w:rPr>
               <w:t>Hardware:</w:t>
             </w:r>
             <w:r>
@@ -2449,7 +2597,7 @@
                 <w:noProof/>
                 <w:webHidden/>
               </w:rPr>
-              <w:instrText xml:space="preserve"> PAGEREF _Toc239435012 \h </w:instrText>
+              <w:instrText xml:space="preserve"> PAGEREF _Toc239787693 \h </w:instrText>
             </w:r>
             <w:r>
               <w:rPr>
@@ -2469,7 +2617,7 @@
                 <w:noProof/>
                 <w:webHidden/>
               </w:rPr>
-              <w:t>10</w:t>
+              <w:t>13</w:t>
             </w:r>
             <w:r>
               <w:rPr>
@@ -2495,7 +2643,7 @@
               <w14:ligatures w14:val="standardContextual"/>
             </w:rPr>
           </w:pPr>
-          <w:hyperlink w:anchor="_Toc239435013" w:history="1">
+          <w:hyperlink w:anchor="_Toc239787694" w:history="1">
             <w:r>
               <w:rPr>
                 <w:rStyle w:val="Hipervnculo"/>
@@ -2523,7 +2671,7 @@
                 <w:noProof/>
                 <w:webHidden/>
               </w:rPr>
-              <w:instrText xml:space="preserve"> PAGEREF _Toc239435013 \h </w:instrText>
+              <w:instrText xml:space="preserve"> PAGEREF _Toc239787694 \h </w:instrText>
             </w:r>
             <w:r>
               <w:rPr>
@@ -2543,7 +2691,7 @@
                 <w:noProof/>
                 <w:webHidden/>
               </w:rPr>
-              <w:t>10</w:t>
+              <w:t>13</w:t>
             </w:r>
             <w:r>
               <w:rPr>
@@ -2569,7 +2717,7 @@
               <w14:ligatures w14:val="standardContextual"/>
             </w:rPr>
           </w:pPr>
-          <w:hyperlink w:anchor="_Toc239435014" w:history="1">
+          <w:hyperlink w:anchor="_Toc239787695" w:history="1">
             <w:r>
               <w:rPr>
                 <w:rStyle w:val="Hipervnculo"/>
@@ -2597,7 +2745,7 @@
                 <w:noProof/>
                 <w:webHidden/>
               </w:rPr>
-              <w:instrText xml:space="preserve"> PAGEREF _Toc239435014 \h </w:instrText>
+              <w:instrText xml:space="preserve"> PAGEREF _Toc239787695 \h </w:instrText>
             </w:r>
             <w:r>
               <w:rPr>
@@ -2617,7 +2765,7 @@
                 <w:noProof/>
                 <w:webHidden/>
               </w:rPr>
-              <w:t>10</w:t>
+              <w:t>13</w:t>
             </w:r>
             <w:r>
               <w:rPr>
@@ -2643,7 +2791,7 @@
               <w14:ligatures w14:val="standardContextual"/>
             </w:rPr>
           </w:pPr>
-          <w:hyperlink w:anchor="_Toc239435015" w:history="1">
+          <w:hyperlink w:anchor="_Toc239787696" w:history="1">
             <w:r>
               <w:rPr>
                 <w:rStyle w:val="Hipervnculo"/>
@@ -2670,7 +2818,7 @@
                 <w:noProof/>
                 <w:webHidden/>
               </w:rPr>
-              <w:instrText xml:space="preserve"> PAGEREF _Toc239435015 \h </w:instrText>
+              <w:instrText xml:space="preserve"> PAGEREF _Toc239787696 \h </w:instrText>
             </w:r>
             <w:r>
               <w:rPr>
@@ -2690,7 +2838,7 @@
                 <w:noProof/>
                 <w:webHidden/>
               </w:rPr>
-              <w:t>11</w:t>
+              <w:t>14</w:t>
             </w:r>
             <w:r>
               <w:rPr>
@@ -2716,7 +2864,7 @@
               <w14:ligatures w14:val="standardContextual"/>
             </w:rPr>
           </w:pPr>
-          <w:hyperlink w:anchor="_Toc239435016" w:history="1">
+          <w:hyperlink w:anchor="_Toc239787697" w:history="1">
             <w:r>
               <w:rPr>
                 <w:rStyle w:val="Hipervnculo"/>
@@ -2743,7 +2891,7 @@
                 <w:noProof/>
                 <w:webHidden/>
               </w:rPr>
-              <w:instrText xml:space="preserve"> PAGEREF _Toc239435016 \h </w:instrText>
+              <w:instrText xml:space="preserve"> PAGEREF _Toc239787697 \h </w:instrText>
             </w:r>
             <w:r>
               <w:rPr>
@@ -2763,7 +2911,7 @@
                 <w:noProof/>
                 <w:webHidden/>
               </w:rPr>
-              <w:t>12</w:t>
+              <w:t>15</w:t>
             </w:r>
             <w:r>
               <w:rPr>
@@ -2789,7 +2937,7 @@
               <w14:ligatures w14:val="standardContextual"/>
             </w:rPr>
           </w:pPr>
-          <w:hyperlink w:anchor="_Toc239435017" w:history="1">
+          <w:hyperlink w:anchor="_Toc239787698" w:history="1">
             <w:r>
               <w:rPr>
                 <w:rStyle w:val="Hipervnculo"/>
@@ -2816,7 +2964,7 @@
                 <w:noProof/>
                 <w:webHidden/>
               </w:rPr>
-              <w:instrText xml:space="preserve"> PAGEREF _Toc239435017 \h </w:instrText>
+              <w:instrText xml:space="preserve"> PAGEREF _Toc239787698 \h </w:instrText>
             </w:r>
             <w:r>
               <w:rPr>
@@ -2836,7 +2984,7 @@
                 <w:noProof/>
                 <w:webHidden/>
               </w:rPr>
-              <w:t>13</w:t>
+              <w:t>16</w:t>
             </w:r>
             <w:r>
               <w:rPr>
@@ -2862,7 +3010,7 @@
               <w14:ligatures w14:val="standardContextual"/>
             </w:rPr>
           </w:pPr>
-          <w:hyperlink w:anchor="_Toc239435018" w:history="1">
+          <w:hyperlink w:anchor="_Toc239787699" w:history="1">
             <w:r>
               <w:rPr>
                 <w:rStyle w:val="Hipervnculo"/>
@@ -2889,7 +3037,7 @@
                 <w:noProof/>
                 <w:webHidden/>
               </w:rPr>
-              <w:instrText xml:space="preserve"> PAGEREF _Toc239435018 \h </w:instrText>
+              <w:instrText xml:space="preserve"> PAGEREF _Toc239787699 \h </w:instrText>
             </w:r>
             <w:r>
               <w:rPr>
@@ -2909,7 +3057,7 @@
                 <w:noProof/>
                 <w:webHidden/>
               </w:rPr>
-              <w:t>13</w:t>
+              <w:t>16</w:t>
             </w:r>
             <w:r>
               <w:rPr>
@@ -2935,7 +3083,7 @@
               <w14:ligatures w14:val="standardContextual"/>
             </w:rPr>
           </w:pPr>
-          <w:hyperlink w:anchor="_Toc239435019" w:history="1">
+          <w:hyperlink w:anchor="_Toc239787700" w:history="1">
             <w:r>
               <w:rPr>
                 <w:rStyle w:val="Hipervnculo"/>
@@ -2962,7 +3110,7 @@
                 <w:noProof/>
                 <w:webHidden/>
               </w:rPr>
-              <w:instrText xml:space="preserve"> PAGEREF _Toc239435019 \h </w:instrText>
+              <w:instrText xml:space="preserve"> PAGEREF _Toc239787700 \h </w:instrText>
             </w:r>
             <w:r>
               <w:rPr>
@@ -2982,7 +3130,7 @@
                 <w:noProof/>
                 <w:webHidden/>
               </w:rPr>
-              <w:t>14</w:t>
+              <w:t>17</w:t>
             </w:r>
             <w:r>
               <w:rPr>
@@ -3008,7 +3156,7 @@
               <w14:ligatures w14:val="standardContextual"/>
             </w:rPr>
           </w:pPr>
-          <w:hyperlink w:anchor="_Toc239435020" w:history="1">
+          <w:hyperlink w:anchor="_Toc239787701" w:history="1">
             <w:r>
               <w:rPr>
                 <w:rStyle w:val="Hipervnculo"/>
@@ -3035,7 +3183,7 @@
                 <w:noProof/>
                 <w:webHidden/>
               </w:rPr>
-              <w:instrText xml:space="preserve"> PAGEREF _Toc239435020 \h </w:instrText>
+              <w:instrText xml:space="preserve"> PAGEREF _Toc239787701 \h </w:instrText>
             </w:r>
             <w:r>
               <w:rPr>
@@ -3055,7 +3203,7 @@
                 <w:noProof/>
                 <w:webHidden/>
               </w:rPr>
-              <w:t>16</w:t>
+              <w:t>19</w:t>
             </w:r>
             <w:r>
               <w:rPr>
@@ -3081,7 +3229,7 @@
               <w14:ligatures w14:val="standardContextual"/>
             </w:rPr>
           </w:pPr>
-          <w:hyperlink w:anchor="_Toc239435021" w:history="1">
+          <w:hyperlink w:anchor="_Toc239787702" w:history="1">
             <w:r>
               <w:rPr>
                 <w:rStyle w:val="Hipervnculo"/>
@@ -3108,7 +3256,7 @@
                 <w:noProof/>
                 <w:webHidden/>
               </w:rPr>
-              <w:instrText xml:space="preserve"> PAGEREF _Toc239435021 \h </w:instrText>
+              <w:instrText xml:space="preserve"> PAGEREF _Toc239787702 \h </w:instrText>
             </w:r>
             <w:r>
               <w:rPr>
@@ -3128,7 +3276,7 @@
                 <w:noProof/>
                 <w:webHidden/>
               </w:rPr>
-              <w:t>16</w:t>
+              <w:t>19</w:t>
             </w:r>
             <w:r>
               <w:rPr>
@@ -3154,7 +3302,7 @@
               <w14:ligatures w14:val="standardContextual"/>
             </w:rPr>
           </w:pPr>
-          <w:hyperlink w:anchor="_Toc239435022" w:history="1">
+          <w:hyperlink w:anchor="_Toc239787703" w:history="1">
             <w:r>
               <w:rPr>
                 <w:rStyle w:val="Hipervnculo"/>
@@ -3181,7 +3329,7 @@
                 <w:noProof/>
                 <w:webHidden/>
               </w:rPr>
-              <w:instrText xml:space="preserve"> PAGEREF _Toc239435022 \h </w:instrText>
+              <w:instrText xml:space="preserve"> PAGEREF _Toc239787703 \h </w:instrText>
             </w:r>
             <w:r>
               <w:rPr>
@@ -3201,7 +3349,7 @@
                 <w:noProof/>
                 <w:webHidden/>
               </w:rPr>
-              <w:t>16</w:t>
+              <w:t>19</w:t>
             </w:r>
             <w:r>
               <w:rPr>
@@ -3227,7 +3375,7 @@
               <w14:ligatures w14:val="standardContextual"/>
             </w:rPr>
           </w:pPr>
-          <w:hyperlink w:anchor="_Toc239435023" w:history="1">
+          <w:hyperlink w:anchor="_Toc239787704" w:history="1">
             <w:r>
               <w:rPr>
                 <w:rStyle w:val="Hipervnculo"/>
@@ -3254,7 +3402,7 @@
                 <w:noProof/>
                 <w:webHidden/>
               </w:rPr>
-              <w:instrText xml:space="preserve"> PAGEREF _Toc239435023 \h </w:instrText>
+              <w:instrText xml:space="preserve"> PAGEREF _Toc239787704 \h </w:instrText>
             </w:r>
             <w:r>
               <w:rPr>
@@ -3274,7 +3422,7 @@
                 <w:noProof/>
                 <w:webHidden/>
               </w:rPr>
-              <w:t>17</w:t>
+              <w:t>20</w:t>
             </w:r>
             <w:r>
               <w:rPr>
@@ -3300,7 +3448,7 @@
               <w14:ligatures w14:val="standardContextual"/>
             </w:rPr>
           </w:pPr>
-          <w:hyperlink w:anchor="_Toc239435024" w:history="1">
+          <w:hyperlink w:anchor="_Toc239787705" w:history="1">
             <w:r>
               <w:rPr>
                 <w:rStyle w:val="Hipervnculo"/>
@@ -3327,7 +3475,7 @@
                 <w:noProof/>
                 <w:webHidden/>
               </w:rPr>
-              <w:instrText xml:space="preserve"> PAGEREF _Toc239435024 \h </w:instrText>
+              <w:instrText xml:space="preserve"> PAGEREF _Toc239787705 \h </w:instrText>
             </w:r>
             <w:r>
               <w:rPr>
@@ -3347,7 +3495,7 @@
                 <w:noProof/>
                 <w:webHidden/>
               </w:rPr>
-              <w:t>17</w:t>
+              <w:t>20</w:t>
             </w:r>
             <w:r>
               <w:rPr>
@@ -3373,7 +3521,7 @@
               <w14:ligatures w14:val="standardContextual"/>
             </w:rPr>
           </w:pPr>
-          <w:hyperlink w:anchor="_Toc239435025" w:history="1">
+          <w:hyperlink w:anchor="_Toc239787706" w:history="1">
             <w:r>
               <w:rPr>
                 <w:rStyle w:val="Hipervnculo"/>
@@ -3400,7 +3548,7 @@
                 <w:noProof/>
                 <w:webHidden/>
               </w:rPr>
-              <w:instrText xml:space="preserve"> PAGEREF _Toc239435025 \h </w:instrText>
+              <w:instrText xml:space="preserve"> PAGEREF _Toc239787706 \h </w:instrText>
             </w:r>
             <w:r>
               <w:rPr>
@@ -3420,7 +3568,7 @@
                 <w:noProof/>
                 <w:webHidden/>
               </w:rPr>
-              <w:t>17</w:t>
+              <w:t>20</w:t>
             </w:r>
             <w:r>
               <w:rPr>
@@ -3446,7 +3594,7 @@
               <w14:ligatures w14:val="standardContextual"/>
             </w:rPr>
           </w:pPr>
-          <w:hyperlink w:anchor="_Toc239435026" w:history="1">
+          <w:hyperlink w:anchor="_Toc239787707" w:history="1">
             <w:r>
               <w:rPr>
                 <w:rStyle w:val="Hipervnculo"/>
@@ -3473,7 +3621,7 @@
                 <w:noProof/>
                 <w:webHidden/>
               </w:rPr>
-              <w:instrText xml:space="preserve"> PAGEREF _Toc239435026 \h </w:instrText>
+              <w:instrText xml:space="preserve"> PAGEREF _Toc239787707 \h </w:instrText>
             </w:r>
             <w:r>
               <w:rPr>
@@ -3493,7 +3641,7 @@
                 <w:noProof/>
                 <w:webHidden/>
               </w:rPr>
-              <w:t>17</w:t>
+              <w:t>20</w:t>
             </w:r>
             <w:r>
               <w:rPr>
@@ -3519,7 +3667,7 @@
               <w14:ligatures w14:val="standardContextual"/>
             </w:rPr>
           </w:pPr>
-          <w:hyperlink w:anchor="_Toc239435027" w:history="1">
+          <w:hyperlink w:anchor="_Toc239787708" w:history="1">
             <w:r>
               <w:rPr>
                 <w:rStyle w:val="Hipervnculo"/>
@@ -3546,7 +3694,7 @@
                 <w:noProof/>
                 <w:webHidden/>
               </w:rPr>
-              <w:instrText xml:space="preserve"> PAGEREF _Toc239435027 \h </w:instrText>
+              <w:instrText xml:space="preserve"> PAGEREF _Toc239787708 \h </w:instrText>
             </w:r>
             <w:r>
               <w:rPr>
@@ -3566,7 +3714,7 @@
                 <w:noProof/>
                 <w:webHidden/>
               </w:rPr>
-              <w:t>20</w:t>
+              <w:t>23</w:t>
             </w:r>
             <w:r>
               <w:rPr>
@@ -3592,7 +3740,7 @@
               <w14:ligatures w14:val="standardContextual"/>
             </w:rPr>
           </w:pPr>
-          <w:hyperlink w:anchor="_Toc239435028" w:history="1">
+          <w:hyperlink w:anchor="_Toc239787709" w:history="1">
             <w:r>
               <w:rPr>
                 <w:rStyle w:val="Hipervnculo"/>
@@ -3619,7 +3767,7 @@
                 <w:noProof/>
                 <w:webHidden/>
               </w:rPr>
-              <w:instrText xml:space="preserve"> PAGEREF _Toc239435028 \h </w:instrText>
+              <w:instrText xml:space="preserve"> PAGEREF _Toc239787709 \h </w:instrText>
             </w:r>
             <w:r>
               <w:rPr>
@@ -3639,7 +3787,7 @@
                 <w:noProof/>
                 <w:webHidden/>
               </w:rPr>
-              <w:t>21</w:t>
+              <w:t>24</w:t>
             </w:r>
             <w:r>
               <w:rPr>
@@ -3665,7 +3813,7 @@
               <w14:ligatures w14:val="standardContextual"/>
             </w:rPr>
           </w:pPr>
-          <w:hyperlink w:anchor="_Toc239435029" w:history="1">
+          <w:hyperlink w:anchor="_Toc239787710" w:history="1">
             <w:r>
               <w:rPr>
                 <w:rStyle w:val="Hipervnculo"/>
@@ -3692,7 +3840,7 @@
                 <w:noProof/>
                 <w:webHidden/>
               </w:rPr>
-              <w:instrText xml:space="preserve"> PAGEREF _Toc239435029 \h </w:instrText>
+              <w:instrText xml:space="preserve"> PAGEREF _Toc239787710 \h </w:instrText>
             </w:r>
             <w:r>
               <w:rPr>
@@ -3712,7 +3860,7 @@
                 <w:noProof/>
                 <w:webHidden/>
               </w:rPr>
-              <w:t>22</w:t>
+              <w:t>25</w:t>
             </w:r>
             <w:r>
               <w:rPr>
@@ -3738,7 +3886,7 @@
               <w14:ligatures w14:val="standardContextual"/>
             </w:rPr>
           </w:pPr>
-          <w:hyperlink w:anchor="_Toc239435030" w:history="1">
+          <w:hyperlink w:anchor="_Toc239787711" w:history="1">
             <w:r>
               <w:rPr>
                 <w:rStyle w:val="Hipervnculo"/>
@@ -3765,7 +3913,7 @@
                 <w:noProof/>
                 <w:webHidden/>
               </w:rPr>
-              <w:instrText xml:space="preserve"> PAGEREF _Toc239435030 \h </w:instrText>
+              <w:instrText xml:space="preserve"> PAGEREF _Toc239787711 \h </w:instrText>
             </w:r>
             <w:r>
               <w:rPr>
@@ -3785,7 +3933,7 @@
                 <w:noProof/>
                 <w:webHidden/>
               </w:rPr>
-              <w:t>23</w:t>
+              <w:t>26</w:t>
             </w:r>
             <w:r>
               <w:rPr>
@@ -3811,7 +3959,7 @@
               <w14:ligatures w14:val="standardContextual"/>
             </w:rPr>
           </w:pPr>
-          <w:hyperlink w:anchor="_Toc239435031" w:history="1">
+          <w:hyperlink w:anchor="_Toc239787712" w:history="1">
             <w:r>
               <w:rPr>
                 <w:rStyle w:val="Hipervnculo"/>
@@ -3838,7 +3986,7 @@
                 <w:noProof/>
                 <w:webHidden/>
               </w:rPr>
-              <w:instrText xml:space="preserve"> PAGEREF _Toc239435031 \h </w:instrText>
+              <w:instrText xml:space="preserve"> PAGEREF _Toc239787712 \h </w:instrText>
             </w:r>
             <w:r>
               <w:rPr>
@@ -3858,7 +4006,7 @@
                 <w:noProof/>
                 <w:webHidden/>
               </w:rPr>
-              <w:t>24</w:t>
+              <w:t>27</w:t>
             </w:r>
             <w:r>
               <w:rPr>
@@ -3884,12 +4032,85 @@
               <w14:ligatures w14:val="standardContextual"/>
             </w:rPr>
           </w:pPr>
-          <w:hyperlink w:anchor="_Toc239435032" w:history="1">
+          <w:hyperlink w:anchor="_Toc239787713" w:history="1">
             <w:r>
               <w:rPr>
                 <w:rStyle w:val="Hipervnculo"/>
                 <w:noProof/>
               </w:rPr>
+              <w:t>Implementation:</w:t>
+            </w:r>
+            <w:r>
+              <w:rPr>
+                <w:noProof/>
+                <w:webHidden/>
+              </w:rPr>
+              <w:tab/>
+            </w:r>
+            <w:r>
+              <w:rPr>
+                <w:noProof/>
+                <w:webHidden/>
+              </w:rPr>
+              <w:fldChar w:fldCharType="begin"/>
+            </w:r>
+            <w:r>
+              <w:rPr>
+                <w:noProof/>
+                <w:webHidden/>
+              </w:rPr>
+              <w:instrText xml:space="preserve"> PAGEREF _Toc239787713 \h </w:instrText>
+            </w:r>
+            <w:r>
+              <w:rPr>
+                <w:noProof/>
+                <w:webHidden/>
+              </w:rPr>
+            </w:r>
+            <w:r>
+              <w:rPr>
+                <w:noProof/>
+                <w:webHidden/>
+              </w:rPr>
+              <w:fldChar w:fldCharType="separate"/>
+            </w:r>
+            <w:r>
+              <w:rPr>
+                <w:noProof/>
+                <w:webHidden/>
+              </w:rPr>
+              <w:t>29</w:t>
+            </w:r>
+            <w:r>
+              <w:rPr>
+                <w:noProof/>
+                <w:webHidden/>
+              </w:rPr>
+              <w:fldChar w:fldCharType="end"/>
+            </w:r>
+          </w:hyperlink>
+        </w:p>
+        <w:p>
+          <w:pPr>
+            <w:pStyle w:val="TDC1"/>
+            <w:tabs>
+              <w:tab w:val="right" w:leader="dot" w:pos="9016"/>
+            </w:tabs>
+            <w:rPr>
+              <w:rFonts w:asciiTheme="minorHAnsi" w:eastAsiaTheme="minorEastAsia" w:hAnsiTheme="minorHAnsi"/>
+              <w:noProof/>
+              <w:kern w:val="2"/>
+              <w:szCs w:val="24"/>
+              <w:lang w:val="en-GB" w:eastAsia="en-GB"/>
+              <w14:ligatures w14:val="standardContextual"/>
+            </w:rPr>
+          </w:pPr>
+          <w:hyperlink w:anchor="_Toc239787714" w:history="1">
+            <w:r>
+              <w:rPr>
+                <w:rStyle w:val="Hipervnculo"/>
+                <w:noProof/>
+              </w:rPr>
               <w:t>Client:</w:t>
             </w:r>
             <w:r>
@@ -3911,7 +4132,7 @@
                 <w:noProof/>
                 <w:webHidden/>
               </w:rPr>
-              <w:instrText xml:space="preserve"> PAGEREF _Toc239435032 \h </w:instrText>
+              <w:instrText xml:space="preserve"> PAGEREF _Toc239787714 \h </w:instrText>
             </w:r>
             <w:r>
               <w:rPr>
@@ -3931,7 +4152,7 @@
                 <w:noProof/>
                 <w:webHidden/>
               </w:rPr>
-              <w:t>26</w:t>
+              <w:t>31</w:t>
             </w:r>
             <w:r>
               <w:rPr>
@@ -3957,7 +4178,7 @@
               <w14:ligatures w14:val="standardContextual"/>
             </w:rPr>
           </w:pPr>
-          <w:hyperlink w:anchor="_Toc239435033" w:history="1">
+          <w:hyperlink w:anchor="_Toc239787715" w:history="1">
             <w:r>
               <w:rPr>
                 <w:rStyle w:val="Hipervnculo"/>
@@ -3984,7 +4205,7 @@
                 <w:noProof/>
                 <w:webHidden/>
               </w:rPr>
-              <w:instrText xml:space="preserve"> PAGEREF _Toc239435033 \h </w:instrText>
+              <w:instrText xml:space="preserve"> PAGEREF _Toc239787715 \h </w:instrText>
             </w:r>
             <w:r>
               <w:rPr>
@@ -4004,7 +4225,7 @@
                 <w:noProof/>
                 <w:webHidden/>
               </w:rPr>
-              <w:t>26</w:t>
+              <w:t>31</w:t>
             </w:r>
             <w:r>
               <w:rPr>
@@ -4030,7 +4251,7 @@
               <w14:ligatures w14:val="standardContextual"/>
             </w:rPr>
           </w:pPr>
-          <w:hyperlink w:anchor="_Toc239435034" w:history="1">
+          <w:hyperlink w:anchor="_Toc239787716" w:history="1">
             <w:r>
               <w:rPr>
                 <w:rStyle w:val="Hipervnculo"/>
@@ -4057,7 +4278,7 @@
                 <w:noProof/>
                 <w:webHidden/>
               </w:rPr>
-              <w:instrText xml:space="preserve"> PAGEREF _Toc239435034 \h </w:instrText>
+              <w:instrText xml:space="preserve"> PAGEREF _Toc239787716 \h </w:instrText>
             </w:r>
             <w:r>
               <w:rPr>
@@ -4077,7 +4298,7 @@
                 <w:noProof/>
                 <w:webHidden/>
               </w:rPr>
-              <w:t>26</w:t>
+              <w:t>31</w:t>
             </w:r>
             <w:r>
               <w:rPr>
@@ -4103,7 +4324,7 @@
               <w14:ligatures w14:val="standardContextual"/>
             </w:rPr>
           </w:pPr>
-          <w:hyperlink w:anchor="_Toc239435035" w:history="1">
+          <w:hyperlink w:anchor="_Toc239787717" w:history="1">
             <w:r>
               <w:rPr>
                 <w:rStyle w:val="Hipervnculo"/>
@@ -4130,7 +4351,7 @@
                 <w:noProof/>
                 <w:webHidden/>
               </w:rPr>
-              <w:instrText xml:space="preserve"> PAGEREF _Toc239435035 \h </w:instrText>
+              <w:instrText xml:space="preserve"> PAGEREF _Toc239787717 \h </w:instrText>
             </w:r>
             <w:r>
               <w:rPr>
@@ -4150,7 +4371,7 @@
                 <w:noProof/>
                 <w:webHidden/>
               </w:rPr>
-              <w:t>27</w:t>
+              <w:t>32</w:t>
             </w:r>
             <w:r>
               <w:rPr>
@@ -4176,7 +4397,7 @@
               <w14:ligatures w14:val="standardContextual"/>
             </w:rPr>
           </w:pPr>
-          <w:hyperlink w:anchor="_Toc239435036" w:history="1">
+          <w:hyperlink w:anchor="_Toc239787718" w:history="1">
             <w:r>
               <w:rPr>
                 <w:rStyle w:val="Hipervnculo"/>
@@ -4203,7 +4424,7 @@
                 <w:noProof/>
                 <w:webHidden/>
               </w:rPr>
-              <w:instrText xml:space="preserve"> PAGEREF _Toc239435036 \h </w:instrText>
+              <w:instrText xml:space="preserve"> PAGEREF _Toc239787718 \h </w:instrText>
             </w:r>
             <w:r>
               <w:rPr>
@@ -4223,7 +4444,7 @@
                 <w:noProof/>
                 <w:webHidden/>
               </w:rPr>
-              <w:t>28</w:t>
+              <w:t>33</w:t>
             </w:r>
             <w:r>
               <w:rPr>
@@ -4249,7 +4470,7 @@
               <w14:ligatures w14:val="standardContextual"/>
             </w:rPr>
           </w:pPr>
-          <w:hyperlink w:anchor="_Toc239435037" w:history="1">
+          <w:hyperlink w:anchor="_Toc239787719" w:history="1">
             <w:r>
               <w:rPr>
                 <w:rStyle w:val="Hipervnculo"/>
@@ -4276,7 +4497,7 @@
                 <w:noProof/>
                 <w:webHidden/>
               </w:rPr>
-              <w:instrText xml:space="preserve"> PAGEREF _Toc239435037 \h </w:instrText>
+              <w:instrText xml:space="preserve"> PAGEREF _Toc239787719 \h </w:instrText>
             </w:r>
             <w:r>
               <w:rPr>
@@ -4296,7 +4517,7 @@
                 <w:noProof/>
                 <w:webHidden/>
               </w:rPr>
-              <w:t>29</w:t>
+              <w:t>34</w:t>
             </w:r>
             <w:r>
               <w:rPr>
@@ -4322,7 +4543,7 @@
               <w14:ligatures w14:val="standardContextual"/>
             </w:rPr>
           </w:pPr>
-          <w:hyperlink w:anchor="_Toc239435038" w:history="1">
+          <w:hyperlink w:anchor="_Toc239787720" w:history="1">
             <w:r>
               <w:rPr>
                 <w:rStyle w:val="Hipervnculo"/>
@@ -4349,7 +4570,7 @@
                 <w:noProof/>
                 <w:webHidden/>
               </w:rPr>
-              <w:instrText xml:space="preserve"> PAGEREF _Toc239435038 \h </w:instrText>
+              <w:instrText xml:space="preserve"> PAGEREF _Toc239787720 \h </w:instrText>
             </w:r>
             <w:r>
               <w:rPr>
@@ -4369,7 +4590,7 @@
                 <w:noProof/>
                 <w:webHidden/>
               </w:rPr>
-              <w:t>30</w:t>
+              <w:t>35</w:t>
             </w:r>
             <w:r>
               <w:rPr>
@@ -4395,7 +4616,7 @@
               <w14:ligatures w14:val="standardContextual"/>
             </w:rPr>
           </w:pPr>
-          <w:hyperlink w:anchor="_Toc239435039" w:history="1">
+          <w:hyperlink w:anchor="_Toc239787721" w:history="1">
             <w:r>
               <w:rPr>
                 <w:rStyle w:val="Hipervnculo"/>
@@ -4422,7 +4643,7 @@
                 <w:noProof/>
                 <w:webHidden/>
               </w:rPr>
-              <w:instrText xml:space="preserve"> PAGEREF _Toc239435039 \h </w:instrText>
+              <w:instrText xml:space="preserve"> PAGEREF _Toc239787721 \h </w:instrText>
             </w:r>
             <w:r>
               <w:rPr>
@@ -4442,7 +4663,7 @@
                 <w:noProof/>
                 <w:webHidden/>
               </w:rPr>
-              <w:t>31</w:t>
+              <w:t>35</w:t>
             </w:r>
             <w:r>
               <w:rPr>
@@ -4468,7 +4689,7 @@
               <w14:ligatures w14:val="standardContextual"/>
             </w:rPr>
           </w:pPr>
-          <w:hyperlink w:anchor="_Toc239435040" w:history="1">
+          <w:hyperlink w:anchor="_Toc239787722" w:history="1">
             <w:r>
               <w:rPr>
                 <w:rStyle w:val="Hipervnculo"/>
@@ -4495,7 +4716,7 @@
                 <w:noProof/>
                 <w:webHidden/>
               </w:rPr>
-              <w:instrText xml:space="preserve"> PAGEREF _Toc239435040 \h </w:instrText>
+              <w:instrText xml:space="preserve"> PAGEREF _Toc239787722 \h </w:instrText>
             </w:r>
             <w:r>
               <w:rPr>
@@ -4515,7 +4736,7 @@
                 <w:noProof/>
                 <w:webHidden/>
               </w:rPr>
-              <w:t>32</w:t>
+              <w:t>37</w:t>
             </w:r>
             <w:r>
               <w:rPr>
@@ -4541,7 +4762,7 @@
               <w14:ligatures w14:val="standardContextual"/>
             </w:rPr>
           </w:pPr>
-          <w:hyperlink w:anchor="_Toc239435041" w:history="1">
+          <w:hyperlink w:anchor="_Toc239787723" w:history="1">
             <w:r>
               <w:rPr>
                 <w:rStyle w:val="Hipervnculo"/>
@@ -4568,7 +4789,7 @@
                 <w:noProof/>
                 <w:webHidden/>
               </w:rPr>
-              <w:instrText xml:space="preserve"> PAGEREF _Toc239435041 \h </w:instrText>
+              <w:instrText xml:space="preserve"> PAGEREF _Toc239787723 \h </w:instrText>
             </w:r>
             <w:r>
               <w:rPr>
@@ -4588,7 +4809,7 @@
                 <w:noProof/>
                 <w:webHidden/>
               </w:rPr>
-              <w:t>32</w:t>
+              <w:t>37</w:t>
             </w:r>
             <w:r>
               <w:rPr>
@@ -4614,7 +4835,7 @@
               <w14:ligatures w14:val="standardContextual"/>
             </w:rPr>
           </w:pPr>
-          <w:hyperlink w:anchor="_Toc239435042" w:history="1">
+          <w:hyperlink w:anchor="_Toc239787724" w:history="1">
             <w:r>
               <w:rPr>
                 <w:rStyle w:val="Hipervnculo"/>
@@ -4641,7 +4862,7 @@
                 <w:noProof/>
                 <w:webHidden/>
               </w:rPr>
-              <w:instrText xml:space="preserve"> PAGEREF _Toc239435042 \h </w:instrText>
+              <w:instrText xml:space="preserve"> PAGEREF _Toc239787724 \h </w:instrText>
             </w:r>
             <w:r>
               <w:rPr>
@@ -4661,7 +4882,7 @@
                 <w:noProof/>
                 <w:webHidden/>
               </w:rPr>
-              <w:t>33</w:t>
+              <w:t>38</w:t>
             </w:r>
             <w:r>
               <w:rPr>
@@ -4687,7 +4908,7 @@
               <w14:ligatures w14:val="standardContextual"/>
             </w:rPr>
           </w:pPr>
-          <w:hyperlink w:anchor="_Toc239435043" w:history="1">
+          <w:hyperlink w:anchor="_Toc239787725" w:history="1">
             <w:r>
               <w:rPr>
                 <w:rStyle w:val="Hipervnculo"/>
@@ -4714,7 +4935,7 @@
                 <w:noProof/>
                 <w:webHidden/>
               </w:rPr>
-              <w:instrText xml:space="preserve"> PAGEREF _Toc239435043 \h </w:instrText>
+              <w:instrText xml:space="preserve"> PAGEREF _Toc239787725 \h </w:instrText>
             </w:r>
             <w:r>
               <w:rPr>
@@ -4734,7 +4955,7 @@
                 <w:noProof/>
                 <w:webHidden/>
               </w:rPr>
-              <w:t>33</w:t>
+              <w:t>38</w:t>
             </w:r>
             <w:r>
               <w:rPr>
@@ -4760,7 +4981,7 @@
               <w14:ligatures w14:val="standardContextual"/>
             </w:rPr>
           </w:pPr>
-          <w:hyperlink w:anchor="_Toc239435044" w:history="1">
+          <w:hyperlink w:anchor="_Toc239787726" w:history="1">
             <w:r>
               <w:rPr>
                 <w:rStyle w:val="Hipervnculo"/>
@@ -4787,7 +5008,7 @@
                 <w:noProof/>
                 <w:webHidden/>
               </w:rPr>
-              <w:instrText xml:space="preserve"> PAGEREF _Toc239435044 \h </w:instrText>
+              <w:instrText xml:space="preserve"> PAGEREF _Toc239787726 \h </w:instrText>
             </w:r>
             <w:r>
               <w:rPr>
@@ -4807,7 +5028,7 @@
                 <w:noProof/>
                 <w:webHidden/>
               </w:rPr>
-              <w:t>33</w:t>
+              <w:t>38</w:t>
             </w:r>
             <w:r>
               <w:rPr>
@@ -4833,7 +5054,7 @@
               <w14:ligatures w14:val="standardContextual"/>
             </w:rPr>
           </w:pPr>
-          <w:hyperlink w:anchor="_Toc239435045" w:history="1">
+          <w:hyperlink w:anchor="_Toc239787727" w:history="1">
             <w:r>
               <w:rPr>
                 <w:rStyle w:val="Hipervnculo"/>
@@ -4860,7 +5081,7 @@
                 <w:noProof/>
                 <w:webHidden/>
               </w:rPr>
-              <w:instrText xml:space="preserve"> PAGEREF _Toc239435045 \h </w:instrText>
+              <w:instrText xml:space="preserve"> PAGEREF _Toc239787727 \h </w:instrText>
             </w:r>
             <w:r>
               <w:rPr>
@@ -4880,7 +5101,7 @@
                 <w:noProof/>
                 <w:webHidden/>
               </w:rPr>
-              <w:t>34</w:t>
+              <w:t>39</w:t>
             </w:r>
             <w:r>
               <w:rPr>
@@ -4906,7 +5127,7 @@
               <w14:ligatures w14:val="standardContextual"/>
             </w:rPr>
           </w:pPr>
-          <w:hyperlink w:anchor="_Toc239435046" w:history="1">
+          <w:hyperlink w:anchor="_Toc239787728" w:history="1">
             <w:r>
               <w:rPr>
                 <w:rStyle w:val="Hipervnculo"/>
@@ -4933,7 +5154,7 @@
                 <w:noProof/>
                 <w:webHidden/>
               </w:rPr>
-              <w:instrText xml:space="preserve"> PAGEREF _Toc239435046 \h </w:instrText>
+              <w:instrText xml:space="preserve"> PAGEREF _Toc239787728 \h </w:instrText>
             </w:r>
             <w:r>
               <w:rPr>
@@ -4953,7 +5174,7 @@
                 <w:noProof/>
                 <w:webHidden/>
               </w:rPr>
-              <w:t>35</w:t>
+              <w:t>40</w:t>
             </w:r>
             <w:r>
               <w:rPr>
@@ -4979,7 +5200,7 @@
               <w14:ligatures w14:val="standardContextual"/>
             </w:rPr>
           </w:pPr>
-          <w:hyperlink w:anchor="_Toc239435047" w:history="1">
+          <w:hyperlink w:anchor="_Toc239787729" w:history="1">
             <w:r>
               <w:rPr>
                 <w:rStyle w:val="Hipervnculo"/>
@@ -5006,7 +5227,7 @@
                 <w:noProof/>
                 <w:webHidden/>
               </w:rPr>
-              <w:instrText xml:space="preserve"> PAGEREF _Toc239435047 \h </w:instrText>
+              <w:instrText xml:space="preserve"> PAGEREF _Toc239787729 \h </w:instrText>
             </w:r>
             <w:r>
               <w:rPr>
@@ -5026,7 +5247,7 @@
                 <w:noProof/>
                 <w:webHidden/>
               </w:rPr>
-              <w:t>36</w:t>
+              <w:t>41</w:t>
             </w:r>
             <w:r>
               <w:rPr>
@@ -5052,7 +5273,7 @@
               <w14:ligatures w14:val="standardContextual"/>
             </w:rPr>
           </w:pPr>
-          <w:hyperlink w:anchor="_Toc239435048" w:history="1">
+          <w:hyperlink w:anchor="_Toc239787730" w:history="1">
             <w:r>
               <w:rPr>
                 <w:rStyle w:val="Hipervnculo"/>
@@ -5079,7 +5300,7 @@
                 <w:noProof/>
                 <w:webHidden/>
               </w:rPr>
-              <w:instrText xml:space="preserve"> PAGEREF _Toc239435048 \h </w:instrText>
+              <w:instrText xml:space="preserve"> PAGEREF _Toc239787730 \h </w:instrText>
             </w:r>
             <w:r>
               <w:rPr>
@@ -5099,7 +5320,7 @@
                 <w:noProof/>
                 <w:webHidden/>
               </w:rPr>
-              <w:t>38</w:t>
+              <w:t>43</w:t>
             </w:r>
             <w:r>
               <w:rPr>
@@ -5125,7 +5346,7 @@
               <w14:ligatures w14:val="standardContextual"/>
             </w:rPr>
           </w:pPr>
-          <w:hyperlink w:anchor="_Toc239435049" w:history="1">
+          <w:hyperlink w:anchor="_Toc239787731" w:history="1">
             <w:r>
               <w:rPr>
                 <w:rStyle w:val="Hipervnculo"/>
@@ -5152,7 +5373,7 @@
                 <w:noProof/>
                 <w:webHidden/>
               </w:rPr>
-              <w:instrText xml:space="preserve"> PAGEREF _Toc239435049 \h </w:instrText>
+              <w:instrText xml:space="preserve"> PAGEREF _Toc239787731 \h </w:instrText>
             </w:r>
             <w:r>
               <w:rPr>
@@ -5172,7 +5393,7 @@
                 <w:noProof/>
                 <w:webHidden/>
               </w:rPr>
-              <w:t>38</w:t>
+              <w:t>43</w:t>
             </w:r>
             <w:r>
               <w:rPr>
@@ -5198,7 +5419,7 @@
               <w14:ligatures w14:val="standardContextual"/>
             </w:rPr>
           </w:pPr>
-          <w:hyperlink w:anchor="_Toc239435050" w:history="1">
+          <w:hyperlink w:anchor="_Toc239787732" w:history="1">
             <w:r>
               <w:rPr>
                 <w:rStyle w:val="Hipervnculo"/>
@@ -5225,7 +5446,7 @@
                 <w:noProof/>
                 <w:webHidden/>
               </w:rPr>
-              <w:instrText xml:space="preserve"> PAGEREF _Toc239435050 \h </w:instrText>
+              <w:instrText xml:space="preserve"> PAGEREF _Toc239787732 \h </w:instrText>
             </w:r>
             <w:r>
               <w:rPr>
@@ -5245,7 +5466,7 @@
                 <w:noProof/>
                 <w:webHidden/>
               </w:rPr>
-              <w:t>38</w:t>
+              <w:t>43</w:t>
             </w:r>
             <w:r>
               <w:rPr>
@@ -5271,7 +5492,7 @@
               <w14:ligatures w14:val="standardContextual"/>
             </w:rPr>
           </w:pPr>
-          <w:hyperlink w:anchor="_Toc239435051" w:history="1">
+          <w:hyperlink w:anchor="_Toc239787733" w:history="1">
             <w:r>
               <w:rPr>
                 <w:rStyle w:val="Hipervnculo"/>
@@ -5298,7 +5519,7 @@
                 <w:noProof/>
                 <w:webHidden/>
               </w:rPr>
-              <w:instrText xml:space="preserve"> PAGEREF _Toc239435051 \h </w:instrText>
+              <w:instrText xml:space="preserve"> PAGEREF _Toc239787733 \h </w:instrText>
             </w:r>
             <w:r>
               <w:rPr>
@@ -5318,7 +5539,7 @@
                 <w:noProof/>
                 <w:webHidden/>
               </w:rPr>
-              <w:t>38</w:t>
+              <w:t>43</w:t>
             </w:r>
             <w:r>
               <w:rPr>
@@ -5344,7 +5565,7 @@
               <w14:ligatures w14:val="standardContextual"/>
             </w:rPr>
           </w:pPr>
-          <w:hyperlink w:anchor="_Toc239435052" w:history="1">
+          <w:hyperlink w:anchor="_Toc239787734" w:history="1">
             <w:r>
               <w:rPr>
                 <w:rStyle w:val="Hipervnculo"/>
@@ -5371,7 +5592,7 @@
                 <w:noProof/>
                 <w:webHidden/>
               </w:rPr>
-              <w:instrText xml:space="preserve"> PAGEREF _Toc239435052 \h </w:instrText>
+              <w:instrText xml:space="preserve"> PAGEREF _Toc239787734 \h </w:instrText>
             </w:r>
             <w:r>
               <w:rPr>
@@ -5391,7 +5612,7 @@
                 <w:noProof/>
                 <w:webHidden/>
               </w:rPr>
-              <w:t>39</w:t>
+              <w:t>44</w:t>
             </w:r>
             <w:r>
               <w:rPr>
@@ -5417,7 +5638,7 @@
               <w14:ligatures w14:val="standardContextual"/>
             </w:rPr>
           </w:pPr>
-          <w:hyperlink w:anchor="_Toc239435053" w:history="1">
+          <w:hyperlink w:anchor="_Toc239787735" w:history="1">
             <w:r>
               <w:rPr>
                 <w:rStyle w:val="Hipervnculo"/>
@@ -5444,7 +5665,7 @@
                 <w:noProof/>
                 <w:webHidden/>
               </w:rPr>
-              <w:instrText xml:space="preserve"> PAGEREF _Toc239435053 \h </w:instrText>
+              <w:instrText xml:space="preserve"> PAGEREF _Toc239787735 \h </w:instrText>
             </w:r>
             <w:r>
               <w:rPr>
@@ -5464,7 +5685,7 @@
                 <w:noProof/>
                 <w:webHidden/>
               </w:rPr>
-              <w:t>39</w:t>
+              <w:t>44</w:t>
             </w:r>
             <w:r>
               <w:rPr>
@@ -5490,7 +5711,7 @@
               <w14:ligatures w14:val="standardContextual"/>
             </w:rPr>
           </w:pPr>
-          <w:hyperlink w:anchor="_Toc239435054" w:history="1">
+          <w:hyperlink w:anchor="_Toc239787736" w:history="1">
             <w:r>
               <w:rPr>
                 <w:rStyle w:val="Hipervnculo"/>
@@ -5517,7 +5738,7 @@
                 <w:noProof/>
                 <w:webHidden/>
               </w:rPr>
-              <w:instrText xml:space="preserve"> PAGEREF _Toc239435054 \h </w:instrText>
+              <w:instrText xml:space="preserve"> PAGEREF _Toc239787736 \h </w:instrText>
             </w:r>
             <w:r>
               <w:rPr>
@@ -5537,7 +5758,7 @@
                 <w:noProof/>
                 <w:webHidden/>
               </w:rPr>
-              <w:t>39</w:t>
+              <w:t>44</w:t>
             </w:r>
             <w:r>
               <w:rPr>
@@ -5563,7 +5784,7 @@
               <w14:ligatures w14:val="standardContextual"/>
             </w:rPr>
           </w:pPr>
-          <w:hyperlink w:anchor="_Toc239435055" w:history="1">
+          <w:hyperlink w:anchor="_Toc239787737" w:history="1">
             <w:r>
               <w:rPr>
                 <w:rStyle w:val="Hipervnculo"/>
@@ -5590,7 +5811,7 @@
                 <w:noProof/>
                 <w:webHidden/>
               </w:rPr>
-              <w:instrText xml:space="preserve"> PAGEREF _Toc239435055 \h </w:instrText>
+              <w:instrText xml:space="preserve"> PAGEREF _Toc239787737 \h </w:instrText>
             </w:r>
             <w:r>
               <w:rPr>
@@ -5610,7 +5831,7 @@
                 <w:noProof/>
                 <w:webHidden/>
               </w:rPr>
-              <w:t>40</w:t>
+              <w:t>45</w:t>
             </w:r>
             <w:r>
               <w:rPr>
@@ -5636,7 +5857,7 @@
               <w14:ligatures w14:val="standardContextual"/>
             </w:rPr>
           </w:pPr>
-          <w:hyperlink w:anchor="_Toc239435056" w:history="1">
+          <w:hyperlink w:anchor="_Toc239787738" w:history="1">
             <w:r>
               <w:rPr>
                 <w:rStyle w:val="Hipervnculo"/>
@@ -5663,7 +5884,7 @@
                 <w:noProof/>
                 <w:webHidden/>
               </w:rPr>
-              <w:instrText xml:space="preserve"> PAGEREF _Toc239435056 \h </w:instrText>
+              <w:instrText xml:space="preserve"> PAGEREF _Toc239787738 \h </w:instrText>
             </w:r>
             <w:r>
               <w:rPr>
@@ -5683,7 +5904,7 @@
                 <w:noProof/>
                 <w:webHidden/>
               </w:rPr>
-              <w:t>41</w:t>
+              <w:t>46</w:t>
             </w:r>
             <w:r>
               <w:rPr>
@@ -5714,7 +5935,7 @@
       <w:pPr>
         <w:pStyle w:val="Ttulo1"/>
       </w:pPr>
-      <w:bookmarkStart w:id="3" w:name="_Toc239435007"/>
+      <w:bookmarkStart w:id="3" w:name="_Toc239787686"/>
       <w:r>
         <w:lastRenderedPageBreak/>
         <w:t>Table of Figures:</w:t>
@@ -5745,7 +5966,7 @@
       <w:r>
         <w:fldChar w:fldCharType="separate"/>
       </w:r>
-      <w:hyperlink w:anchor="_Toc238930454" w:history="1">
+      <w:hyperlink w:anchor="_Toc239787739" w:history="1">
         <w:r>
           <w:rPr>
             <w:rStyle w:val="Hipervnculo"/>
@@ -5772,445 +5993,7 @@
             <w:noProof/>
             <w:webHidden/>
           </w:rPr>
-          <w:instrText xml:space="preserve"> PAGEREF _Toc238930454 \h </w:instrText>
-        </w:r>
-        <w:r>
-          <w:rPr>
-            <w:noProof/>
-            <w:webHidden/>
-          </w:rPr>
-        </w:r>
-        <w:r>
-          <w:rPr>
-            <w:noProof/>
-            <w:webHidden/>
-          </w:rPr>
-          <w:fldChar w:fldCharType="separate"/>
-        </w:r>
-        <w:r>
-          <w:rPr>
-            <w:noProof/>
-            <w:webHidden/>
-          </w:rPr>
-          <w:t>7</w:t>
-        </w:r>
-        <w:r>
-          <w:rPr>
-            <w:noProof/>
-            <w:webHidden/>
-          </w:rPr>
-          <w:fldChar w:fldCharType="end"/>
-        </w:r>
-      </w:hyperlink>
-    </w:p>
-    <w:p>
-      <w:pPr>
-        <w:pStyle w:val="Tabladeilustraciones"/>
-        <w:tabs>
-          <w:tab w:val="right" w:leader="dot" w:pos="9016"/>
-        </w:tabs>
-        <w:rPr>
-          <w:rFonts w:asciiTheme="minorHAnsi" w:eastAsiaTheme="minorEastAsia" w:hAnsiTheme="minorHAnsi"/>
-          <w:noProof/>
-          <w:kern w:val="2"/>
-          <w:szCs w:val="24"/>
-          <w:lang w:val="en-GB" w:eastAsia="en-GB"/>
-          <w14:ligatures w14:val="standardContextual"/>
-        </w:rPr>
-      </w:pPr>
-      <w:hyperlink w:anchor="_Toc238930455" w:history="1">
-        <w:r>
-          <w:rPr>
-            <w:rStyle w:val="Hipervnculo"/>
-            <w:noProof/>
-          </w:rPr>
-          <w:t>Figure 2 STL Chassis</w:t>
-        </w:r>
-        <w:r>
-          <w:rPr>
-            <w:noProof/>
-            <w:webHidden/>
-          </w:rPr>
-          <w:tab/>
-        </w:r>
-        <w:r>
-          <w:rPr>
-            <w:noProof/>
-            <w:webHidden/>
-          </w:rPr>
-          <w:fldChar w:fldCharType="begin"/>
-        </w:r>
-        <w:r>
-          <w:rPr>
-            <w:noProof/>
-            <w:webHidden/>
-          </w:rPr>
-          <w:instrText xml:space="preserve"> PAGEREF _Toc238930455 \h </w:instrText>
-        </w:r>
-        <w:r>
-          <w:rPr>
-            <w:noProof/>
-            <w:webHidden/>
-          </w:rPr>
-        </w:r>
-        <w:r>
-          <w:rPr>
-            <w:noProof/>
-            <w:webHidden/>
-          </w:rPr>
-          <w:fldChar w:fldCharType="separate"/>
-        </w:r>
-        <w:r>
-          <w:rPr>
-            <w:noProof/>
-            <w:webHidden/>
-          </w:rPr>
-          <w:t>8</w:t>
-        </w:r>
-        <w:r>
-          <w:rPr>
-            <w:noProof/>
-            <w:webHidden/>
-          </w:rPr>
-          <w:fldChar w:fldCharType="end"/>
-        </w:r>
-      </w:hyperlink>
-    </w:p>
-    <w:p>
-      <w:pPr>
-        <w:pStyle w:val="Tabladeilustraciones"/>
-        <w:tabs>
-          <w:tab w:val="right" w:leader="dot" w:pos="9016"/>
-        </w:tabs>
-        <w:rPr>
-          <w:rFonts w:asciiTheme="minorHAnsi" w:eastAsiaTheme="minorEastAsia" w:hAnsiTheme="minorHAnsi"/>
-          <w:noProof/>
-          <w:kern w:val="2"/>
-          <w:szCs w:val="24"/>
-          <w:lang w:val="en-GB" w:eastAsia="en-GB"/>
-          <w14:ligatures w14:val="standardContextual"/>
-        </w:rPr>
-      </w:pPr>
-      <w:hyperlink w:anchor="_Toc238930456" w:history="1">
-        <w:r>
-          <w:rPr>
-            <w:rStyle w:val="Hipervnculo"/>
-            <w:noProof/>
-          </w:rPr>
-          <w:t>Figure 3 Raspberry Pi</w:t>
-        </w:r>
-        <w:r>
-          <w:rPr>
-            <w:noProof/>
-            <w:webHidden/>
-          </w:rPr>
-          <w:tab/>
-        </w:r>
-        <w:r>
-          <w:rPr>
-            <w:noProof/>
-            <w:webHidden/>
-          </w:rPr>
-          <w:fldChar w:fldCharType="begin"/>
-        </w:r>
-        <w:r>
-          <w:rPr>
-            <w:noProof/>
-            <w:webHidden/>
-          </w:rPr>
-          <w:instrText xml:space="preserve"> PAGEREF _Toc238930456 \h </w:instrText>
-        </w:r>
-        <w:r>
-          <w:rPr>
-            <w:noProof/>
-            <w:webHidden/>
-          </w:rPr>
-        </w:r>
-        <w:r>
-          <w:rPr>
-            <w:noProof/>
-            <w:webHidden/>
-          </w:rPr>
-          <w:fldChar w:fldCharType="separate"/>
-        </w:r>
-        <w:r>
-          <w:rPr>
-            <w:noProof/>
-            <w:webHidden/>
-          </w:rPr>
-          <w:t>9</w:t>
-        </w:r>
-        <w:r>
-          <w:rPr>
-            <w:noProof/>
-            <w:webHidden/>
-          </w:rPr>
-          <w:fldChar w:fldCharType="end"/>
-        </w:r>
-      </w:hyperlink>
-    </w:p>
-    <w:p>
-      <w:pPr>
-        <w:pStyle w:val="Tabladeilustraciones"/>
-        <w:tabs>
-          <w:tab w:val="right" w:leader="dot" w:pos="9016"/>
-        </w:tabs>
-        <w:rPr>
-          <w:rFonts w:asciiTheme="minorHAnsi" w:eastAsiaTheme="minorEastAsia" w:hAnsiTheme="minorHAnsi"/>
-          <w:noProof/>
-          <w:kern w:val="2"/>
-          <w:szCs w:val="24"/>
-          <w:lang w:val="en-GB" w:eastAsia="en-GB"/>
-          <w14:ligatures w14:val="standardContextual"/>
-        </w:rPr>
-      </w:pPr>
-      <w:hyperlink w:anchor="_Toc238930457" w:history="1">
-        <w:r>
-          <w:rPr>
-            <w:rStyle w:val="Hipervnculo"/>
-            <w:noProof/>
-          </w:rPr>
-          <w:t>Figure 4 Logitech HD Pro C920</w:t>
-        </w:r>
-        <w:r>
-          <w:rPr>
-            <w:noProof/>
-            <w:webHidden/>
-          </w:rPr>
-          <w:tab/>
-        </w:r>
-        <w:r>
-          <w:rPr>
-            <w:noProof/>
-            <w:webHidden/>
-          </w:rPr>
-          <w:fldChar w:fldCharType="begin"/>
-        </w:r>
-        <w:r>
-          <w:rPr>
-            <w:noProof/>
-            <w:webHidden/>
-          </w:rPr>
-          <w:instrText xml:space="preserve"> PAGEREF _Toc238930457 \h </w:instrText>
-        </w:r>
-        <w:r>
-          <w:rPr>
-            <w:noProof/>
-            <w:webHidden/>
-          </w:rPr>
-        </w:r>
-        <w:r>
-          <w:rPr>
-            <w:noProof/>
-            <w:webHidden/>
-          </w:rPr>
-          <w:fldChar w:fldCharType="separate"/>
-        </w:r>
-        <w:r>
-          <w:rPr>
-            <w:noProof/>
-            <w:webHidden/>
-          </w:rPr>
-          <w:t>10</w:t>
-        </w:r>
-        <w:r>
-          <w:rPr>
-            <w:noProof/>
-            <w:webHidden/>
-          </w:rPr>
-          <w:fldChar w:fldCharType="end"/>
-        </w:r>
-      </w:hyperlink>
-    </w:p>
-    <w:p>
-      <w:pPr>
-        <w:pStyle w:val="Tabladeilustraciones"/>
-        <w:tabs>
-          <w:tab w:val="right" w:leader="dot" w:pos="9016"/>
-        </w:tabs>
-        <w:rPr>
-          <w:rFonts w:asciiTheme="minorHAnsi" w:eastAsiaTheme="minorEastAsia" w:hAnsiTheme="minorHAnsi"/>
-          <w:noProof/>
-          <w:kern w:val="2"/>
-          <w:szCs w:val="24"/>
-          <w:lang w:val="en-GB" w:eastAsia="en-GB"/>
-          <w14:ligatures w14:val="standardContextual"/>
-        </w:rPr>
-      </w:pPr>
-      <w:hyperlink w:anchor="_Toc238930458" w:history="1">
-        <w:r>
-          <w:rPr>
-            <w:rStyle w:val="Hipervnculo"/>
-            <w:noProof/>
-          </w:rPr>
-          <w:t>Figure 5 Huawei 4G Dongle</w:t>
-        </w:r>
-        <w:r>
-          <w:rPr>
-            <w:noProof/>
-            <w:webHidden/>
-          </w:rPr>
-          <w:tab/>
-        </w:r>
-        <w:r>
-          <w:rPr>
-            <w:noProof/>
-            <w:webHidden/>
-          </w:rPr>
-          <w:fldChar w:fldCharType="begin"/>
-        </w:r>
-        <w:r>
-          <w:rPr>
-            <w:noProof/>
-            <w:webHidden/>
-          </w:rPr>
-          <w:instrText xml:space="preserve"> PAGEREF _Toc238930458 \h </w:instrText>
-        </w:r>
-        <w:r>
-          <w:rPr>
-            <w:noProof/>
-            <w:webHidden/>
-          </w:rPr>
-        </w:r>
-        <w:r>
-          <w:rPr>
-            <w:noProof/>
-            <w:webHidden/>
-          </w:rPr>
-          <w:fldChar w:fldCharType="separate"/>
-        </w:r>
-        <w:r>
-          <w:rPr>
-            <w:noProof/>
-            <w:webHidden/>
-          </w:rPr>
-          <w:t>10</w:t>
-        </w:r>
-        <w:r>
-          <w:rPr>
-            <w:noProof/>
-            <w:webHidden/>
-          </w:rPr>
-          <w:fldChar w:fldCharType="end"/>
-        </w:r>
-      </w:hyperlink>
-    </w:p>
-    <w:p>
-      <w:pPr>
-        <w:pStyle w:val="Tabladeilustraciones"/>
-        <w:tabs>
-          <w:tab w:val="right" w:leader="dot" w:pos="9016"/>
-        </w:tabs>
-        <w:rPr>
-          <w:rFonts w:asciiTheme="minorHAnsi" w:eastAsiaTheme="minorEastAsia" w:hAnsiTheme="minorHAnsi"/>
-          <w:noProof/>
-          <w:kern w:val="2"/>
-          <w:szCs w:val="24"/>
-          <w:lang w:val="en-GB" w:eastAsia="en-GB"/>
-          <w14:ligatures w14:val="standardContextual"/>
-        </w:rPr>
-      </w:pPr>
-      <w:hyperlink w:anchor="_Toc238930459" w:history="1">
-        <w:r>
-          <w:rPr>
-            <w:rStyle w:val="Hipervnculo"/>
-            <w:noProof/>
-          </w:rPr>
-          <w:t>Figure 6 NiMH Battery</w:t>
-        </w:r>
-        <w:r>
-          <w:rPr>
-            <w:noProof/>
-            <w:webHidden/>
-          </w:rPr>
-          <w:tab/>
-        </w:r>
-        <w:r>
-          <w:rPr>
-            <w:noProof/>
-            <w:webHidden/>
-          </w:rPr>
-          <w:fldChar w:fldCharType="begin"/>
-        </w:r>
-        <w:r>
-          <w:rPr>
-            <w:noProof/>
-            <w:webHidden/>
-          </w:rPr>
-          <w:instrText xml:space="preserve"> PAGEREF _Toc238930459 \h </w:instrText>
-        </w:r>
-        <w:r>
-          <w:rPr>
-            <w:noProof/>
-            <w:webHidden/>
-          </w:rPr>
-        </w:r>
-        <w:r>
-          <w:rPr>
-            <w:noProof/>
-            <w:webHidden/>
-          </w:rPr>
-          <w:fldChar w:fldCharType="separate"/>
-        </w:r>
-        <w:r>
-          <w:rPr>
-            <w:noProof/>
-            <w:webHidden/>
-          </w:rPr>
-          <w:t>11</w:t>
-        </w:r>
-        <w:r>
-          <w:rPr>
-            <w:noProof/>
-            <w:webHidden/>
-          </w:rPr>
-          <w:fldChar w:fldCharType="end"/>
-        </w:r>
-      </w:hyperlink>
-    </w:p>
-    <w:p>
-      <w:pPr>
-        <w:pStyle w:val="Tabladeilustraciones"/>
-        <w:tabs>
-          <w:tab w:val="right" w:leader="dot" w:pos="9016"/>
-        </w:tabs>
-        <w:rPr>
-          <w:rFonts w:asciiTheme="minorHAnsi" w:eastAsiaTheme="minorEastAsia" w:hAnsiTheme="minorHAnsi"/>
-          <w:noProof/>
-          <w:kern w:val="2"/>
-          <w:szCs w:val="24"/>
-          <w:lang w:val="en-GB" w:eastAsia="en-GB"/>
-          <w14:ligatures w14:val="standardContextual"/>
-        </w:rPr>
-      </w:pPr>
-      <w:hyperlink w:anchor="_Toc238930460" w:history="1">
-        <w:r>
-          <w:rPr>
-            <w:rStyle w:val="Hipervnculo"/>
-            <w:noProof/>
-          </w:rPr>
-          <w:t>Figure 7 Signaling</w:t>
-        </w:r>
-        <w:r>
-          <w:rPr>
-            <w:noProof/>
-            <w:webHidden/>
-          </w:rPr>
-          <w:tab/>
-        </w:r>
-        <w:r>
-          <w:rPr>
-            <w:noProof/>
-            <w:webHidden/>
-          </w:rPr>
-          <w:fldChar w:fldCharType="begin"/>
-        </w:r>
-        <w:r>
-          <w:rPr>
-            <w:noProof/>
-            <w:webHidden/>
-          </w:rPr>
-          <w:instrText xml:space="preserve"> PAGEREF _Toc238930460 \h </w:instrText>
+          <w:instrText xml:space="preserve"> PAGEREF _Toc239787739 \h </w:instrText>
         </w:r>
         <w:r>
           <w:rPr>
@@ -6256,13 +6039,13 @@
           <w14:ligatures w14:val="standardContextual"/>
         </w:rPr>
       </w:pPr>
-      <w:hyperlink w:anchor="_Toc238930461" w:history="1">
+      <w:hyperlink w:anchor="_Toc239787740" w:history="1">
         <w:r>
           <w:rPr>
             <w:rStyle w:val="Hipervnculo"/>
             <w:noProof/>
           </w:rPr>
-          <w:t>Figure 8 WebRtc protocol Stack</w:t>
+          <w:t>Figure 2 STL Chassis</w:t>
         </w:r>
         <w:r>
           <w:rPr>
@@ -6283,7 +6066,299 @@
             <w:noProof/>
             <w:webHidden/>
           </w:rPr>
-          <w:instrText xml:space="preserve"> PAGEREF _Toc238930461 \h </w:instrText>
+          <w:instrText xml:space="preserve"> PAGEREF _Toc239787740 \h </w:instrText>
+        </w:r>
+        <w:r>
+          <w:rPr>
+            <w:noProof/>
+            <w:webHidden/>
+          </w:rPr>
+        </w:r>
+        <w:r>
+          <w:rPr>
+            <w:noProof/>
+            <w:webHidden/>
+          </w:rPr>
+          <w:fldChar w:fldCharType="separate"/>
+        </w:r>
+        <w:r>
+          <w:rPr>
+            <w:noProof/>
+            <w:webHidden/>
+          </w:rPr>
+          <w:t>14</w:t>
+        </w:r>
+        <w:r>
+          <w:rPr>
+            <w:noProof/>
+            <w:webHidden/>
+          </w:rPr>
+          <w:fldChar w:fldCharType="end"/>
+        </w:r>
+      </w:hyperlink>
+    </w:p>
+    <w:p>
+      <w:pPr>
+        <w:pStyle w:val="Tabladeilustraciones"/>
+        <w:tabs>
+          <w:tab w:val="right" w:leader="dot" w:pos="9016"/>
+        </w:tabs>
+        <w:rPr>
+          <w:rFonts w:asciiTheme="minorHAnsi" w:eastAsiaTheme="minorEastAsia" w:hAnsiTheme="minorHAnsi"/>
+          <w:noProof/>
+          <w:kern w:val="2"/>
+          <w:szCs w:val="24"/>
+          <w:lang w:val="en-GB" w:eastAsia="en-GB"/>
+          <w14:ligatures w14:val="standardContextual"/>
+        </w:rPr>
+      </w:pPr>
+      <w:hyperlink w:anchor="_Toc239787741" w:history="1">
+        <w:r>
+          <w:rPr>
+            <w:rStyle w:val="Hipervnculo"/>
+            <w:noProof/>
+          </w:rPr>
+          <w:t>Figure 3 Raspberry Pi</w:t>
+        </w:r>
+        <w:r>
+          <w:rPr>
+            <w:noProof/>
+            <w:webHidden/>
+          </w:rPr>
+          <w:tab/>
+        </w:r>
+        <w:r>
+          <w:rPr>
+            <w:noProof/>
+            <w:webHidden/>
+          </w:rPr>
+          <w:fldChar w:fldCharType="begin"/>
+        </w:r>
+        <w:r>
+          <w:rPr>
+            <w:noProof/>
+            <w:webHidden/>
+          </w:rPr>
+          <w:instrText xml:space="preserve"> PAGEREF _Toc239787741 \h </w:instrText>
+        </w:r>
+        <w:r>
+          <w:rPr>
+            <w:noProof/>
+            <w:webHidden/>
+          </w:rPr>
+        </w:r>
+        <w:r>
+          <w:rPr>
+            <w:noProof/>
+            <w:webHidden/>
+          </w:rPr>
+          <w:fldChar w:fldCharType="separate"/>
+        </w:r>
+        <w:r>
+          <w:rPr>
+            <w:noProof/>
+            <w:webHidden/>
+          </w:rPr>
+          <w:t>15</w:t>
+        </w:r>
+        <w:r>
+          <w:rPr>
+            <w:noProof/>
+            <w:webHidden/>
+          </w:rPr>
+          <w:fldChar w:fldCharType="end"/>
+        </w:r>
+      </w:hyperlink>
+    </w:p>
+    <w:p>
+      <w:pPr>
+        <w:pStyle w:val="Tabladeilustraciones"/>
+        <w:tabs>
+          <w:tab w:val="right" w:leader="dot" w:pos="9016"/>
+        </w:tabs>
+        <w:rPr>
+          <w:rFonts w:asciiTheme="minorHAnsi" w:eastAsiaTheme="minorEastAsia" w:hAnsiTheme="minorHAnsi"/>
+          <w:noProof/>
+          <w:kern w:val="2"/>
+          <w:szCs w:val="24"/>
+          <w:lang w:val="en-GB" w:eastAsia="en-GB"/>
+          <w14:ligatures w14:val="standardContextual"/>
+        </w:rPr>
+      </w:pPr>
+      <w:hyperlink w:anchor="_Toc239787742" w:history="1">
+        <w:r>
+          <w:rPr>
+            <w:rStyle w:val="Hipervnculo"/>
+            <w:noProof/>
+          </w:rPr>
+          <w:t>Figure 4 Logitech HD Pro C920</w:t>
+        </w:r>
+        <w:r>
+          <w:rPr>
+            <w:noProof/>
+            <w:webHidden/>
+          </w:rPr>
+          <w:tab/>
+        </w:r>
+        <w:r>
+          <w:rPr>
+            <w:noProof/>
+            <w:webHidden/>
+          </w:rPr>
+          <w:fldChar w:fldCharType="begin"/>
+        </w:r>
+        <w:r>
+          <w:rPr>
+            <w:noProof/>
+            <w:webHidden/>
+          </w:rPr>
+          <w:instrText xml:space="preserve"> PAGEREF _Toc239787742 \h </w:instrText>
+        </w:r>
+        <w:r>
+          <w:rPr>
+            <w:noProof/>
+            <w:webHidden/>
+          </w:rPr>
+        </w:r>
+        <w:r>
+          <w:rPr>
+            <w:noProof/>
+            <w:webHidden/>
+          </w:rPr>
+          <w:fldChar w:fldCharType="separate"/>
+        </w:r>
+        <w:r>
+          <w:rPr>
+            <w:noProof/>
+            <w:webHidden/>
+          </w:rPr>
+          <w:t>16</w:t>
+        </w:r>
+        <w:r>
+          <w:rPr>
+            <w:noProof/>
+            <w:webHidden/>
+          </w:rPr>
+          <w:fldChar w:fldCharType="end"/>
+        </w:r>
+      </w:hyperlink>
+    </w:p>
+    <w:p>
+      <w:pPr>
+        <w:pStyle w:val="Tabladeilustraciones"/>
+        <w:tabs>
+          <w:tab w:val="right" w:leader="dot" w:pos="9016"/>
+        </w:tabs>
+        <w:rPr>
+          <w:rFonts w:asciiTheme="minorHAnsi" w:eastAsiaTheme="minorEastAsia" w:hAnsiTheme="minorHAnsi"/>
+          <w:noProof/>
+          <w:kern w:val="2"/>
+          <w:szCs w:val="24"/>
+          <w:lang w:val="en-GB" w:eastAsia="en-GB"/>
+          <w14:ligatures w14:val="standardContextual"/>
+        </w:rPr>
+      </w:pPr>
+      <w:hyperlink w:anchor="_Toc239787743" w:history="1">
+        <w:r>
+          <w:rPr>
+            <w:rStyle w:val="Hipervnculo"/>
+            <w:noProof/>
+          </w:rPr>
+          <w:t>Figure 5 Huawei 4G Dongle</w:t>
+        </w:r>
+        <w:r>
+          <w:rPr>
+            <w:noProof/>
+            <w:webHidden/>
+          </w:rPr>
+          <w:tab/>
+        </w:r>
+        <w:r>
+          <w:rPr>
+            <w:noProof/>
+            <w:webHidden/>
+          </w:rPr>
+          <w:fldChar w:fldCharType="begin"/>
+        </w:r>
+        <w:r>
+          <w:rPr>
+            <w:noProof/>
+            <w:webHidden/>
+          </w:rPr>
+          <w:instrText xml:space="preserve"> PAGEREF _Toc239787743 \h </w:instrText>
+        </w:r>
+        <w:r>
+          <w:rPr>
+            <w:noProof/>
+            <w:webHidden/>
+          </w:rPr>
+        </w:r>
+        <w:r>
+          <w:rPr>
+            <w:noProof/>
+            <w:webHidden/>
+          </w:rPr>
+          <w:fldChar w:fldCharType="separate"/>
+        </w:r>
+        <w:r>
+          <w:rPr>
+            <w:noProof/>
+            <w:webHidden/>
+          </w:rPr>
+          <w:t>16</w:t>
+        </w:r>
+        <w:r>
+          <w:rPr>
+            <w:noProof/>
+            <w:webHidden/>
+          </w:rPr>
+          <w:fldChar w:fldCharType="end"/>
+        </w:r>
+      </w:hyperlink>
+    </w:p>
+    <w:p>
+      <w:pPr>
+        <w:pStyle w:val="Tabladeilustraciones"/>
+        <w:tabs>
+          <w:tab w:val="right" w:leader="dot" w:pos="9016"/>
+        </w:tabs>
+        <w:rPr>
+          <w:rFonts w:asciiTheme="minorHAnsi" w:eastAsiaTheme="minorEastAsia" w:hAnsiTheme="minorHAnsi"/>
+          <w:noProof/>
+          <w:kern w:val="2"/>
+          <w:szCs w:val="24"/>
+          <w:lang w:val="en-GB" w:eastAsia="en-GB"/>
+          <w14:ligatures w14:val="standardContextual"/>
+        </w:rPr>
+      </w:pPr>
+      <w:hyperlink w:anchor="_Toc239787744" w:history="1">
+        <w:r>
+          <w:rPr>
+            <w:rStyle w:val="Hipervnculo"/>
+            <w:noProof/>
+          </w:rPr>
+          <w:t>Figure 6 NiMH Battery</w:t>
+        </w:r>
+        <w:r>
+          <w:rPr>
+            <w:noProof/>
+            <w:webHidden/>
+          </w:rPr>
+          <w:tab/>
+        </w:r>
+        <w:r>
+          <w:rPr>
+            <w:noProof/>
+            <w:webHidden/>
+          </w:rPr>
+          <w:fldChar w:fldCharType="begin"/>
+        </w:r>
+        <w:r>
+          <w:rPr>
+            <w:noProof/>
+            <w:webHidden/>
+          </w:rPr>
+          <w:instrText xml:space="preserve"> PAGEREF _Toc239787744 \h </w:instrText>
         </w:r>
         <w:r>
           <w:rPr>
@@ -6329,7 +6404,153 @@
           <w14:ligatures w14:val="standardContextual"/>
         </w:rPr>
       </w:pPr>
-      <w:hyperlink w:anchor="_Toc238930462" w:history="1">
+      <w:hyperlink w:anchor="_Toc239787745" w:history="1">
+        <w:r>
+          <w:rPr>
+            <w:rStyle w:val="Hipervnculo"/>
+            <w:noProof/>
+          </w:rPr>
+          <w:t>Figure 7 Signaling</w:t>
+        </w:r>
+        <w:r>
+          <w:rPr>
+            <w:noProof/>
+            <w:webHidden/>
+          </w:rPr>
+          <w:tab/>
+        </w:r>
+        <w:r>
+          <w:rPr>
+            <w:noProof/>
+            <w:webHidden/>
+          </w:rPr>
+          <w:fldChar w:fldCharType="begin"/>
+        </w:r>
+        <w:r>
+          <w:rPr>
+            <w:noProof/>
+            <w:webHidden/>
+          </w:rPr>
+          <w:instrText xml:space="preserve"> PAGEREF _Toc239787745 \h </w:instrText>
+        </w:r>
+        <w:r>
+          <w:rPr>
+            <w:noProof/>
+            <w:webHidden/>
+          </w:rPr>
+        </w:r>
+        <w:r>
+          <w:rPr>
+            <w:noProof/>
+            <w:webHidden/>
+          </w:rPr>
+          <w:fldChar w:fldCharType="separate"/>
+        </w:r>
+        <w:r>
+          <w:rPr>
+            <w:noProof/>
+            <w:webHidden/>
+          </w:rPr>
+          <w:t>19</w:t>
+        </w:r>
+        <w:r>
+          <w:rPr>
+            <w:noProof/>
+            <w:webHidden/>
+          </w:rPr>
+          <w:fldChar w:fldCharType="end"/>
+        </w:r>
+      </w:hyperlink>
+    </w:p>
+    <w:p>
+      <w:pPr>
+        <w:pStyle w:val="Tabladeilustraciones"/>
+        <w:tabs>
+          <w:tab w:val="right" w:leader="dot" w:pos="9016"/>
+        </w:tabs>
+        <w:rPr>
+          <w:rFonts w:asciiTheme="minorHAnsi" w:eastAsiaTheme="minorEastAsia" w:hAnsiTheme="minorHAnsi"/>
+          <w:noProof/>
+          <w:kern w:val="2"/>
+          <w:szCs w:val="24"/>
+          <w:lang w:val="en-GB" w:eastAsia="en-GB"/>
+          <w14:ligatures w14:val="standardContextual"/>
+        </w:rPr>
+      </w:pPr>
+      <w:hyperlink w:anchor="_Toc239787746" w:history="1">
+        <w:r>
+          <w:rPr>
+            <w:rStyle w:val="Hipervnculo"/>
+            <w:noProof/>
+          </w:rPr>
+          <w:t>Figure 8 WebRtc protocol Stack</w:t>
+        </w:r>
+        <w:r>
+          <w:rPr>
+            <w:noProof/>
+            <w:webHidden/>
+          </w:rPr>
+          <w:tab/>
+        </w:r>
+        <w:r>
+          <w:rPr>
+            <w:noProof/>
+            <w:webHidden/>
+          </w:rPr>
+          <w:fldChar w:fldCharType="begin"/>
+        </w:r>
+        <w:r>
+          <w:rPr>
+            <w:noProof/>
+            <w:webHidden/>
+          </w:rPr>
+          <w:instrText xml:space="preserve"> PAGEREF _Toc239787746 \h </w:instrText>
+        </w:r>
+        <w:r>
+          <w:rPr>
+            <w:noProof/>
+            <w:webHidden/>
+          </w:rPr>
+        </w:r>
+        <w:r>
+          <w:rPr>
+            <w:noProof/>
+            <w:webHidden/>
+          </w:rPr>
+          <w:fldChar w:fldCharType="separate"/>
+        </w:r>
+        <w:r>
+          <w:rPr>
+            <w:noProof/>
+            <w:webHidden/>
+          </w:rPr>
+          <w:t>23</w:t>
+        </w:r>
+        <w:r>
+          <w:rPr>
+            <w:noProof/>
+            <w:webHidden/>
+          </w:rPr>
+          <w:fldChar w:fldCharType="end"/>
+        </w:r>
+      </w:hyperlink>
+    </w:p>
+    <w:p>
+      <w:pPr>
+        <w:pStyle w:val="Tabladeilustraciones"/>
+        <w:tabs>
+          <w:tab w:val="right" w:leader="dot" w:pos="9016"/>
+        </w:tabs>
+        <w:rPr>
+          <w:rFonts w:asciiTheme="minorHAnsi" w:eastAsiaTheme="minorEastAsia" w:hAnsiTheme="minorHAnsi"/>
+          <w:noProof/>
+          <w:kern w:val="2"/>
+          <w:szCs w:val="24"/>
+          <w:lang w:val="en-GB" w:eastAsia="en-GB"/>
+          <w14:ligatures w14:val="standardContextual"/>
+        </w:rPr>
+      </w:pPr>
+      <w:hyperlink w:anchor="_Toc239787747" w:history="1">
         <w:r>
           <w:rPr>
             <w:rStyle w:val="Hipervnculo"/>
@@ -6356,7 +6577,7 @@
             <w:noProof/>
             <w:webHidden/>
           </w:rPr>
-          <w:instrText xml:space="preserve"> PAGEREF _Toc238930462 \h </w:instrText>
+          <w:instrText xml:space="preserve"> PAGEREF _Toc239787747 \h </w:instrText>
         </w:r>
         <w:r>
           <w:rPr>
@@ -6376,7 +6597,7 @@
             <w:noProof/>
             <w:webHidden/>
           </w:rPr>
-          <w:t>29</w:t>
+          <w:t>37</w:t>
         </w:r>
         <w:r>
           <w:rPr>
@@ -6402,7 +6623,7 @@
           <w14:ligatures w14:val="standardContextual"/>
         </w:rPr>
       </w:pPr>
-      <w:hyperlink w:anchor="_Toc238930463" w:history="1">
+      <w:hyperlink w:anchor="_Toc239787748" w:history="1">
         <w:r>
           <w:rPr>
             <w:rStyle w:val="Hipervnculo"/>
@@ -6429,7 +6650,7 @@
             <w:noProof/>
             <w:webHidden/>
           </w:rPr>
-          <w:instrText xml:space="preserve"> PAGEREF _Toc238930463 \h </w:instrText>
+          <w:instrText xml:space="preserve"> PAGEREF _Toc239787748 \h </w:instrText>
         </w:r>
         <w:r>
           <w:rPr>
@@ -6449,7 +6670,7 @@
             <w:noProof/>
             <w:webHidden/>
           </w:rPr>
-          <w:t>33</w:t>
+          <w:t>41</w:t>
         </w:r>
         <w:r>
           <w:rPr>
@@ -6475,7 +6696,7 @@
           <w14:ligatures w14:val="standardContextual"/>
         </w:rPr>
       </w:pPr>
-      <w:hyperlink w:anchor="_Toc238930464" w:history="1">
+      <w:hyperlink w:anchor="_Toc239787749" w:history="1">
         <w:r>
           <w:rPr>
             <w:rStyle w:val="Hipervnculo"/>
@@ -6502,7 +6723,7 @@
             <w:noProof/>
             <w:webHidden/>
           </w:rPr>
-          <w:instrText xml:space="preserve"> PAGEREF _Toc238930464 \h </w:instrText>
+          <w:instrText xml:space="preserve"> PAGEREF _Toc239787749 \h </w:instrText>
         </w:r>
         <w:r>
           <w:rPr>
@@ -6522,7 +6743,7 @@
             <w:noProof/>
             <w:webHidden/>
           </w:rPr>
-          <w:t>34</w:t>
+          <w:t>42</w:t>
         </w:r>
         <w:r>
           <w:rPr>
@@ -6547,7 +6768,7 @@
       <w:pPr>
         <w:pStyle w:val="Ttulo1"/>
       </w:pPr>
-      <w:bookmarkStart w:id="4" w:name="_Toc239435008"/>
+      <w:bookmarkStart w:id="4" w:name="_Toc239787687"/>
       <w:r>
         <w:lastRenderedPageBreak/>
         <w:t>Introduction:</w:t>
@@ -6620,7 +6841,7 @@
         <w:pStyle w:val="Ttulo2"/>
       </w:pPr>
       <w:bookmarkStart w:id="5" w:name="_Toc239434008"/>
-      <w:bookmarkStart w:id="6" w:name="_Toc239435009"/>
+      <w:bookmarkStart w:id="6" w:name="_Toc239787688"/>
       <w:r>
         <w:t>Objectives</w:t>
       </w:r>
@@ -6682,7 +6903,7 @@
         <w:pStyle w:val="Ttulo2"/>
       </w:pPr>
       <w:bookmarkStart w:id="7" w:name="_Toc239434009"/>
-      <w:bookmarkStart w:id="8" w:name="_Toc239435010"/>
+      <w:bookmarkStart w:id="8" w:name="_Toc239787689"/>
       <w:r>
         <w:t>Scope and Limitations</w:t>
       </w:r>
@@ -6737,7 +6958,7 @@
         <w:pStyle w:val="Ttulo2"/>
       </w:pPr>
       <w:bookmarkStart w:id="9" w:name="_Toc239434010"/>
-      <w:bookmarkStart w:id="10" w:name="_Toc239435011"/>
+      <w:bookmarkStart w:id="10" w:name="_Toc239787690"/>
       <w:r>
         <w:t>Document Structure</w:t>
       </w:r>
@@ -6758,7 +6979,348 @@
       <w:pPr>
         <w:pStyle w:val="Ttulo1"/>
       </w:pPr>
-      <w:bookmarkStart w:id="11" w:name="_Toc239435012"/>
+      <w:bookmarkStart w:id="11" w:name="_Toc239787691"/>
+      <w:r>
+        <w:lastRenderedPageBreak/>
+        <w:t>Motivation:</w:t>
+      </w:r>
+      <w:bookmarkEnd w:id="11"/>
+    </w:p>
+    <w:p>
+      <w:pPr>
+        <w:rPr>
+          <w:lang w:val="en-GB"/>
+        </w:rPr>
+      </w:pPr>
+      <w:r>
+        <w:rPr>
+          <w:lang w:val="en-GB"/>
+        </w:rPr>
+        <w:t>I chose this project because I wanted to recover the enjoyment that first drew me to programming. I still like writing software, but my work had increasingly become a routine of emails and coordination, leaving less room for the practical work I enjoyed. I wanted a project of my own that would give me a reason to experiment again. Building something physical offered a way to step away from that routine and see software produce a result I could observe directly.</w:t>
+      </w:r>
+    </w:p>
+    <w:p>
+      <w:pPr>
+        <w:rPr>
+          <w:lang w:val="en-GB"/>
+        </w:rPr>
+      </w:pPr>
+      <w:r>
+        <w:rPr>
+          <w:lang w:val="en-GB"/>
+        </w:rPr>
+        <w:t xml:space="preserve">An RC vehicle gave that desire a concrete form. A camera mounted on a real chassis turns a communication problem into something visible: an image </w:t>
+      </w:r>
+      <w:proofErr w:type="gramStart"/>
+      <w:r>
+        <w:rPr>
+          <w:lang w:val="en-GB"/>
+        </w:rPr>
+        <w:t>has to</w:t>
+      </w:r>
+      <w:proofErr w:type="gramEnd"/>
+      <w:r>
+        <w:rPr>
+          <w:lang w:val="en-GB"/>
+        </w:rPr>
+        <w:t xml:space="preserve"> travel from the vehicle to the operator, and any delay becomes part of the experience. Working towards remote operation also brings software into contact with power supplies, mechanical assembly, and the limitations of a mobile connection. This combination appealed to me because progress would depend on making the different parts work together in a tangible prototype.</w:t>
+      </w:r>
+    </w:p>
+    <w:p>
+      <w:pPr>
+        <w:rPr>
+          <w:lang w:val="en-GB"/>
+        </w:rPr>
+      </w:pPr>
+      <w:r>
+        <w:rPr>
+          <w:lang w:val="en-GB"/>
+        </w:rPr>
+        <w:t>There is also a more personal reason behind the choice. When I was a child, I wanted to become a combat pilot. That is a dream I do not expect to fulfil, but the interest in flying and operating a vehicle from its own point of view has stayed with me. Creating a system that lets me see through an onboard camera gives that interest a practical direction. It is something I can build with the programming knowledge I have and the technical skills I can develop through the project.</w:t>
+      </w:r>
+    </w:p>
+    <w:p>
+      <w:pPr>
+        <w:rPr>
+          <w:lang w:val="en-GB"/>
+        </w:rPr>
+      </w:pPr>
+      <w:r>
+        <w:rPr>
+          <w:lang w:val="en-GB"/>
+        </w:rPr>
+        <w:t>The RC car gives this ambition a manageable starting point. The prototype allows me to learn about the communication path on the ground, while leaving vehicle control and more demanding applications for later stages. Flight remains a personal aspiration beyond the scope of this thesis. For now, the achievement I seek is a working foundation: a physical vehicle whose live view can reach a remote browser with a measured and useful response time. I need to learn to walk before I can fly, and this project is my first step.</w:t>
+      </w:r>
+    </w:p>
+    <w:p>
+      <w:pPr>
+        <w:jc w:val="left"/>
+        <w:rPr>
+          <w:lang w:val="en-GB"/>
+        </w:rPr>
+      </w:pPr>
+      <w:r>
+        <w:rPr>
+          <w:lang w:val="en-GB"/>
+        </w:rPr>
+        <w:br w:type="page"/>
+      </w:r>
+    </w:p>
+    <w:p>
+      <w:pPr>
+        <w:pStyle w:val="Ttulo1"/>
+        <w:rPr>
+          <w:lang w:val="en-GB"/>
+        </w:rPr>
+      </w:pPr>
+      <w:bookmarkStart w:id="12" w:name="_Toc239787692"/>
+      <w:r>
+        <w:rPr>
+          <w:bCs/>
+          <w:lang w:val="en-GB"/>
+        </w:rPr>
+        <w:lastRenderedPageBreak/>
+        <w:t>Initial Design</w:t>
+      </w:r>
+      <w:bookmarkEnd w:id="12"/>
+    </w:p>
+    <w:p>
+      <w:pPr>
+        <w:rPr>
+          <w:lang w:val="en-GB"/>
+        </w:rPr>
+      </w:pPr>
+      <w:r>
+        <w:rPr>
+          <w:lang w:val="en-GB"/>
+        </w:rPr>
+        <w:t xml:space="preserve">The project began with browser experiments before the camera pipeline was moved to the physical vehicle. This starting point provided a small environment in which to explore the WebRTC connection model and distinguish media transport from the messages needed to establish a session. The earliest recorded test, in February 2026, created two </w:t>
+      </w:r>
+      <w:proofErr w:type="spellStart"/>
+      <w:r>
+        <w:rPr>
+          <w:lang w:val="en-GB"/>
+        </w:rPr>
+        <w:t>RTCPeerConnection</w:t>
+      </w:r>
+      <w:proofErr w:type="spellEnd"/>
+      <w:r>
+        <w:rPr>
+          <w:lang w:val="en-GB"/>
+        </w:rPr>
+        <w:t xml:space="preserve"> objects in the same browser tab. Camera and microphone tracks were captured locally, while session descriptions and ICE candidates were exchanged directly between the two objects. The received stream was displayed beside the local preview.</w:t>
+      </w:r>
+    </w:p>
+    <w:p>
+      <w:pPr>
+        <w:rPr>
+          <w:lang w:val="en-GB"/>
+        </w:rPr>
+      </w:pPr>
+      <w:r>
+        <w:rPr>
+          <w:lang w:val="en-GB"/>
+        </w:rPr>
+        <w:t xml:space="preserve">The next experiments separated the caller and callee, followed by distinct video sender and receiver pages. These pages used </w:t>
+      </w:r>
+      <w:proofErr w:type="spellStart"/>
+      <w:r>
+        <w:rPr>
+          <w:lang w:val="en-GB"/>
+        </w:rPr>
+        <w:t>BroadcastChannel</w:t>
+      </w:r>
+      <w:proofErr w:type="spellEnd"/>
+      <w:r>
+        <w:rPr>
+          <w:lang w:val="en-GB"/>
+        </w:rPr>
+        <w:t xml:space="preserve"> to exchange </w:t>
+      </w:r>
+      <w:proofErr w:type="spellStart"/>
+      <w:r>
+        <w:rPr>
+          <w:lang w:val="en-GB"/>
+        </w:rPr>
+        <w:t>signaling</w:t>
+      </w:r>
+      <w:proofErr w:type="spellEnd"/>
+      <w:r>
+        <w:rPr>
+          <w:lang w:val="en-GB"/>
+        </w:rPr>
+        <w:t xml:space="preserve"> messages between browser contexts and configured a public Google STUN server. They remained local browser experiments: </w:t>
+      </w:r>
+      <w:proofErr w:type="spellStart"/>
+      <w:r>
+        <w:rPr>
+          <w:lang w:val="en-GB"/>
+        </w:rPr>
+        <w:t>BroadcastChannel</w:t>
+      </w:r>
+      <w:proofErr w:type="spellEnd"/>
+      <w:r>
+        <w:rPr>
+          <w:lang w:val="en-GB"/>
+        </w:rPr>
+        <w:t xml:space="preserve"> did not provide the Internet </w:t>
+      </w:r>
+      <w:proofErr w:type="spellStart"/>
+      <w:r>
+        <w:rPr>
+          <w:lang w:val="en-GB"/>
+        </w:rPr>
+        <w:t>signaling</w:t>
+      </w:r>
+      <w:proofErr w:type="spellEnd"/>
+      <w:r>
+        <w:rPr>
+          <w:lang w:val="en-GB"/>
+        </w:rPr>
+        <w:t xml:space="preserve"> service required for an independently connected vehicle. Nevertheless, the separation made the publishing and viewing responsibilities explicit before introducing a central application server.</w:t>
+      </w:r>
+    </w:p>
+    <w:p>
+      <w:pPr>
+        <w:rPr>
+          <w:lang w:val="en-GB"/>
+        </w:rPr>
+      </w:pPr>
+      <w:r>
+        <w:rPr>
+          <w:lang w:val="en-GB"/>
+        </w:rPr>
+        <w:t xml:space="preserve">The first networked architecture combined a React browser frontend with an ASP.NET Core backend and a </w:t>
+      </w:r>
+      <w:proofErr w:type="spellStart"/>
+      <w:r>
+        <w:rPr>
+          <w:lang w:val="en-GB"/>
+        </w:rPr>
+        <w:t>SignalR</w:t>
+      </w:r>
+      <w:proofErr w:type="spellEnd"/>
+      <w:r>
+        <w:rPr>
+          <w:lang w:val="en-GB"/>
+        </w:rPr>
+        <w:t xml:space="preserve"> hub. </w:t>
+      </w:r>
+      <w:proofErr w:type="spellStart"/>
+      <w:r>
+        <w:rPr>
+          <w:lang w:val="en-GB"/>
+        </w:rPr>
+        <w:t>SignalR</w:t>
+      </w:r>
+      <w:proofErr w:type="spellEnd"/>
+      <w:r>
+        <w:rPr>
+          <w:lang w:val="en-GB"/>
+        </w:rPr>
+        <w:t xml:space="preserve"> replaced the local exchange mechanism with a persistent connection through which peers could discover one another and forward session descriptions and ICE candidates. A browser served as the video source during this stage, while another browser received and displayed the stream. This provided a prototype of the eventual device-to-browser interaction without yet requiring native camera capture on the Raspberry Pi.</w:t>
+      </w:r>
+    </w:p>
+    <w:p>
+      <w:pPr>
+        <w:rPr>
+          <w:lang w:val="en-GB"/>
+        </w:rPr>
+      </w:pPr>
+      <w:r>
+        <w:rPr>
+          <w:lang w:val="en-GB"/>
+        </w:rPr>
+        <w:t xml:space="preserve">The component responsibilities were distinct. The publishing endpoint acquired media and added its tracks to a WebRTC peer connection. The receiving endpoint negotiated compatible media parameters and attached the remote stream to a video element. The application server carried the coordination messages that allowed these endpoints to establish their connection. It did not decode, encode, or redistribute the video. This distinction between </w:t>
+      </w:r>
+      <w:proofErr w:type="spellStart"/>
+      <w:r>
+        <w:rPr>
+          <w:lang w:val="en-GB"/>
+        </w:rPr>
+        <w:t>signaling</w:t>
+      </w:r>
+      <w:proofErr w:type="spellEnd"/>
+      <w:r>
+        <w:rPr>
+          <w:lang w:val="en-GB"/>
+        </w:rPr>
+        <w:t xml:space="preserve"> and media remained central to the architecture as the prototype evolved.</w:t>
+      </w:r>
+    </w:p>
+    <w:p>
+      <w:pPr>
+        <w:rPr>
+          <w:lang w:val="en-GB"/>
+        </w:rPr>
+      </w:pPr>
+      <w:r>
+        <w:rPr>
+          <w:lang w:val="en-GB"/>
+        </w:rPr>
+        <w:t xml:space="preserve">STUN formed part of the initial connectivity configuration. It allowed ICE to discover server-reflexive candidates in addition to local addresses, providing possible paths for communication across address translation. However, discovering a public-facing address did not establish that the other endpoint could reach it. The initial design therefore represented a direct-connection </w:t>
+      </w:r>
+      <w:r>
+        <w:rPr>
+          <w:lang w:val="en-GB"/>
+        </w:rPr>
+        <w:lastRenderedPageBreak/>
+        <w:t>starting point rather than a guarantee of connectivity across every mobile carrier, router, or firewall. TURN relay configuration was added later as the implementation developed.</w:t>
+      </w:r>
+    </w:p>
+    <w:p>
+      <w:pPr>
+        <w:rPr>
+          <w:lang w:val="en-GB"/>
+        </w:rPr>
+      </w:pPr>
+      <w:r>
+        <w:rPr>
+          <w:lang w:val="en-GB"/>
+        </w:rPr>
+        <w:t>The physical vehicle introduced a further integration stage. The intended onboard role was to capture the camera image and publish it to the operator through the same general WebRTC model. The native .NET device service and its Raspberry Pi camera integration appeared later in the repository history. They should therefore be understood as developments of the browser prototype, rather than components already present in the earliest experiments.</w:t>
+      </w:r>
+    </w:p>
+    <w:p>
+      <w:pPr>
+        <w:rPr>
+          <w:lang w:val="en-GB"/>
+        </w:rPr>
+      </w:pPr>
+      <w:r>
+        <w:rPr>
+          <w:lang w:val="en-GB"/>
+        </w:rPr>
+        <w:t xml:space="preserve">This progression established the design's main boundary: a central service for </w:t>
+      </w:r>
+      <w:proofErr w:type="spellStart"/>
+      <w:r>
+        <w:rPr>
+          <w:lang w:val="en-GB"/>
+        </w:rPr>
+        <w:t>signaling</w:t>
+      </w:r>
+      <w:proofErr w:type="spellEnd"/>
+      <w:r>
+        <w:rPr>
+          <w:lang w:val="en-GB"/>
+        </w:rPr>
+        <w:t>, with a separate media path between publishing and viewing endpoints, directly or through a relay when required. The Hardware chapter describes the selected physical components, while General Architecture explains the resulting system and its connection flow. The initial design presented here provides the starting point for that final architecture and for the implementation steps described later.</w:t>
+      </w:r>
+    </w:p>
+    <w:p>
+      <w:pPr>
+        <w:jc w:val="left"/>
+      </w:pPr>
+      <w:r>
+        <w:br w:type="page"/>
+      </w:r>
+    </w:p>
+    <w:p>
+      <w:pPr>
+        <w:pStyle w:val="Ttulo1"/>
+      </w:pPr>
+      <w:bookmarkStart w:id="13" w:name="_Toc239787693"/>
       <w:r>
         <w:lastRenderedPageBreak/>
         <w:t>Hardware</w:t>
@@ -6766,7 +7328,7 @@
       <w:r>
         <w:t>:</w:t>
       </w:r>
-      <w:bookmarkEnd w:id="11"/>
+      <w:bookmarkEnd w:id="13"/>
     </w:p>
     <w:p>
       <w:r>
@@ -6809,7 +7371,7 @@
           <w:lang w:val="en-GB"/>
         </w:rPr>
       </w:pPr>
-      <w:bookmarkStart w:id="12" w:name="_Toc239435013"/>
+      <w:bookmarkStart w:id="14" w:name="_Toc239787694"/>
       <w:r>
         <w:rPr>
           <w:lang w:val="en-GB"/>
@@ -6822,7 +7384,7 @@
         </w:rPr>
         <w:t>:</w:t>
       </w:r>
-      <w:bookmarkEnd w:id="12"/>
+      <w:bookmarkEnd w:id="14"/>
     </w:p>
     <w:p>
       <w:pPr>
@@ -6831,14 +7393,14 @@
           <w:lang w:val="en-GB"/>
         </w:rPr>
       </w:pPr>
-      <w:bookmarkStart w:id="13" w:name="_Toc239435014"/>
+      <w:bookmarkStart w:id="15" w:name="_Toc239787695"/>
       <w:r>
         <w:rPr>
           <w:lang w:val="en-GB"/>
         </w:rPr>
         <w:t>RC Vehicle Chassis</w:t>
       </w:r>
-      <w:bookmarkEnd w:id="13"/>
+      <w:bookmarkEnd w:id="15"/>
     </w:p>
     <w:p>
       <w:r>
@@ -6939,8 +7501,8 @@
         <w:pStyle w:val="Descripcin"/>
         <w:jc w:val="center"/>
       </w:pPr>
-      <w:bookmarkStart w:id="14" w:name="_Toc231500490"/>
-      <w:bookmarkStart w:id="15" w:name="_Toc238930454"/>
+      <w:bookmarkStart w:id="16" w:name="_Toc231500490"/>
+      <w:bookmarkStart w:id="17" w:name="_Toc239787739"/>
       <w:r>
         <w:t xml:space="preserve">Figure </w:t>
       </w:r>
@@ -6965,8 +7527,8 @@
       <w:r>
         <w:t xml:space="preserve"> Tamiya Chassis</w:t>
       </w:r>
-      <w:bookmarkEnd w:id="14"/>
-      <w:bookmarkEnd w:id="15"/>
+      <w:bookmarkEnd w:id="16"/>
+      <w:bookmarkEnd w:id="17"/>
     </w:p>
     <w:p>
       <w:pPr>
@@ -7020,7 +7582,7 @@
         <w:pStyle w:val="Descripcin"/>
         <w:jc w:val="center"/>
       </w:pPr>
-      <w:bookmarkStart w:id="16" w:name="_Toc238930455"/>
+      <w:bookmarkStart w:id="18" w:name="_Toc239787740"/>
       <w:r>
         <w:t xml:space="preserve">Figure </w:t>
       </w:r>
@@ -7045,13 +7607,13 @@
       <w:r>
         <w:t xml:space="preserve"> STL Chassis</w:t>
       </w:r>
-      <w:bookmarkEnd w:id="16"/>
+      <w:bookmarkEnd w:id="18"/>
     </w:p>
     <w:p>
       <w:pPr>
         <w:pStyle w:val="Ttulo3"/>
       </w:pPr>
-      <w:bookmarkStart w:id="17" w:name="_Toc239435015"/>
+      <w:bookmarkStart w:id="19" w:name="_Toc239787696"/>
       <w:r>
         <w:t>Raspberry Pi</w:t>
       </w:r>
@@ -7061,7 +7623,7 @@
       <w:r>
         <w:t>:</w:t>
       </w:r>
-      <w:bookmarkEnd w:id="17"/>
+      <w:bookmarkEnd w:id="19"/>
     </w:p>
     <w:p>
       <w:r>
@@ -7109,7 +7671,7 @@
         </w:rPr>
         <w:lastRenderedPageBreak/>
         <w:drawing>
-          <wp:inline distT="0" distB="0" distL="0" distR="0" wp14:anchorId="78C8C91D" wp14:editId="4125C96B">
+          <wp:inline distT="0" distB="0" distL="0" distR="0" wp14:anchorId="78C8C91D" wp14:editId="727A2EF5">
             <wp:extent cx="5731510" cy="4350385"/>
             <wp:effectExtent l="0" t="0" r="2540" b="0"/>
             <wp:docPr id="214631915" name="Imagen 11" descr="RASPBERRY-PI RASPBERRY-PI 5 2G"/>
@@ -7163,7 +7725,7 @@
         <w:pStyle w:val="Descripcin"/>
         <w:jc w:val="center"/>
       </w:pPr>
-      <w:bookmarkStart w:id="18" w:name="_Toc238930456"/>
+      <w:bookmarkStart w:id="20" w:name="_Toc239787741"/>
       <w:r>
         <w:t xml:space="preserve">Figure </w:t>
       </w:r>
@@ -7188,17 +7750,17 @@
       <w:r>
         <w:t xml:space="preserve"> Raspberry Pi</w:t>
       </w:r>
-      <w:bookmarkEnd w:id="18"/>
+      <w:bookmarkEnd w:id="20"/>
     </w:p>
     <w:p>
       <w:pPr>
         <w:pStyle w:val="Ttulo3"/>
       </w:pPr>
-      <w:bookmarkStart w:id="19" w:name="_Toc239435016"/>
+      <w:bookmarkStart w:id="21" w:name="_Toc239787697"/>
       <w:r>
         <w:t>Camera:</w:t>
       </w:r>
-      <w:bookmarkEnd w:id="19"/>
+      <w:bookmarkEnd w:id="21"/>
     </w:p>
     <w:p>
       <w:r>
@@ -7281,7 +7843,7 @@
         <w:pStyle w:val="Descripcin"/>
         <w:jc w:val="center"/>
       </w:pPr>
-      <w:bookmarkStart w:id="20" w:name="_Toc238930457"/>
+      <w:bookmarkStart w:id="22" w:name="_Toc239787742"/>
       <w:r>
         <w:t xml:space="preserve">Figure </w:t>
       </w:r>
@@ -7306,17 +7868,17 @@
       <w:r>
         <w:t xml:space="preserve"> Logitech HD Pro C920</w:t>
       </w:r>
-      <w:bookmarkEnd w:id="20"/>
+      <w:bookmarkEnd w:id="22"/>
     </w:p>
     <w:p>
       <w:pPr>
         <w:pStyle w:val="Ttulo3"/>
       </w:pPr>
-      <w:bookmarkStart w:id="21" w:name="_Toc239435017"/>
+      <w:bookmarkStart w:id="23" w:name="_Toc239787698"/>
       <w:r>
         <w:t>5G Connectivity Dongle:</w:t>
       </w:r>
-      <w:bookmarkEnd w:id="21"/>
+      <w:bookmarkEnd w:id="23"/>
     </w:p>
     <w:p>
       <w:r>
@@ -7395,7 +7957,7 @@
         <w:pStyle w:val="Descripcin"/>
         <w:jc w:val="center"/>
       </w:pPr>
-      <w:bookmarkStart w:id="22" w:name="_Toc238930458"/>
+      <w:bookmarkStart w:id="24" w:name="_Toc239787743"/>
       <w:r>
         <w:t xml:space="preserve">Figure </w:t>
       </w:r>
@@ -7420,17 +7982,17 @@
       <w:r>
         <w:t xml:space="preserve"> Huawei 4G Dongle</w:t>
       </w:r>
-      <w:bookmarkEnd w:id="22"/>
+      <w:bookmarkEnd w:id="24"/>
     </w:p>
     <w:p>
       <w:pPr>
         <w:pStyle w:val="Ttulo3"/>
       </w:pPr>
-      <w:bookmarkStart w:id="23" w:name="_Toc239435018"/>
+      <w:bookmarkStart w:id="25" w:name="_Toc239787699"/>
       <w:r>
         <w:t>Power Supply System:</w:t>
       </w:r>
-      <w:bookmarkEnd w:id="23"/>
+      <w:bookmarkEnd w:id="25"/>
     </w:p>
     <w:p>
       <w:r>
@@ -7531,7 +8093,7 @@
         <w:pStyle w:val="Descripcin"/>
         <w:jc w:val="center"/>
       </w:pPr>
-      <w:bookmarkStart w:id="24" w:name="_Toc238930459"/>
+      <w:bookmarkStart w:id="26" w:name="_Toc239787744"/>
       <w:r>
         <w:t xml:space="preserve">Figure </w:t>
       </w:r>
@@ -7556,17 +8118,17 @@
       <w:r>
         <w:t xml:space="preserve"> NiMH Battery</w:t>
       </w:r>
-      <w:bookmarkEnd w:id="24"/>
+      <w:bookmarkEnd w:id="26"/>
     </w:p>
     <w:p>
       <w:pPr>
         <w:pStyle w:val="Ttulo2"/>
       </w:pPr>
-      <w:bookmarkStart w:id="25" w:name="_Toc239435019"/>
+      <w:bookmarkStart w:id="27" w:name="_Toc239787700"/>
       <w:r>
         <w:t>Design Considerations:</w:t>
       </w:r>
-      <w:bookmarkEnd w:id="25"/>
+      <w:bookmarkEnd w:id="27"/>
     </w:p>
     <w:p>
       <w:r>
@@ -7632,7 +8194,7 @@
       <w:pPr>
         <w:pStyle w:val="Ttulo1"/>
       </w:pPr>
-      <w:bookmarkStart w:id="26" w:name="_Toc239435020"/>
+      <w:bookmarkStart w:id="28" w:name="_Toc239787701"/>
       <w:r>
         <w:lastRenderedPageBreak/>
         <w:t xml:space="preserve">General </w:t>
@@ -7643,7 +8205,7 @@
       <w:r>
         <w:t>:</w:t>
       </w:r>
-      <w:bookmarkEnd w:id="26"/>
+      <w:bookmarkEnd w:id="28"/>
     </w:p>
     <w:p>
       <w:pPr>
@@ -7753,7 +8315,7 @@
           <w:lang w:val="en-GB"/>
         </w:rPr>
       </w:pPr>
-      <w:bookmarkStart w:id="27" w:name="_Toc238930460"/>
+      <w:bookmarkStart w:id="29" w:name="_Toc239787745"/>
       <w:r>
         <w:t xml:space="preserve">Figure </w:t>
       </w:r>
@@ -7778,29 +8340,29 @@
       <w:r>
         <w:t xml:space="preserve"> Signaling</w:t>
       </w:r>
-      <w:bookmarkEnd w:id="27"/>
+      <w:bookmarkEnd w:id="29"/>
     </w:p>
     <w:p>
       <w:pPr>
         <w:pStyle w:val="Ttulo2"/>
       </w:pPr>
-      <w:bookmarkStart w:id="28" w:name="_Toc239435021"/>
+      <w:bookmarkStart w:id="30" w:name="_Toc239787702"/>
       <w:r>
         <w:t>Architecture Components:</w:t>
       </w:r>
-      <w:bookmarkEnd w:id="28"/>
+      <w:bookmarkEnd w:id="30"/>
     </w:p>
     <w:p>
       <w:pPr>
         <w:pStyle w:val="Ttulo3"/>
       </w:pPr>
-      <w:bookmarkStart w:id="29" w:name="__RefHeading___Toc497_4194855202"/>
-      <w:bookmarkStart w:id="30" w:name="_Toc239435022"/>
-      <w:bookmarkEnd w:id="29"/>
+      <w:bookmarkStart w:id="31" w:name="__RefHeading___Toc497_4194855202"/>
+      <w:bookmarkStart w:id="32" w:name="_Toc239787703"/>
+      <w:bookmarkEnd w:id="31"/>
       <w:r>
         <w:t>Device (RC Car):</w:t>
       </w:r>
-      <w:bookmarkEnd w:id="30"/>
+      <w:bookmarkEnd w:id="32"/>
     </w:p>
     <w:p>
       <w:r>
@@ -7815,13 +8377,13 @@
       <w:pPr>
         <w:pStyle w:val="Ttulo3"/>
       </w:pPr>
-      <w:bookmarkStart w:id="31" w:name="__RefHeading___Toc499_4194855202"/>
-      <w:bookmarkStart w:id="32" w:name="_Toc239435023"/>
-      <w:bookmarkEnd w:id="31"/>
+      <w:bookmarkStart w:id="33" w:name="__RefHeading___Toc499_4194855202"/>
+      <w:bookmarkStart w:id="34" w:name="_Toc239787704"/>
+      <w:bookmarkEnd w:id="33"/>
       <w:r>
         <w:t>Application Server:</w:t>
       </w:r>
-      <w:bookmarkEnd w:id="32"/>
+      <w:bookmarkEnd w:id="34"/>
     </w:p>
     <w:p>
       <w:r>
@@ -7832,13 +8394,13 @@
       <w:pPr>
         <w:pStyle w:val="Ttulo3"/>
       </w:pPr>
-      <w:bookmarkStart w:id="33" w:name="__RefHeading___Toc501_4194855202"/>
-      <w:bookmarkStart w:id="34" w:name="_Toc239435024"/>
-      <w:bookmarkEnd w:id="33"/>
+      <w:bookmarkStart w:id="35" w:name="__RefHeading___Toc501_4194855202"/>
+      <w:bookmarkStart w:id="36" w:name="_Toc239787705"/>
+      <w:bookmarkEnd w:id="35"/>
       <w:r>
         <w:t>TURN Server:</w:t>
       </w:r>
-      <w:bookmarkEnd w:id="34"/>
+      <w:bookmarkEnd w:id="36"/>
     </w:p>
     <w:p>
       <w:r>
@@ -7855,13 +8417,13 @@
       <w:pPr>
         <w:pStyle w:val="Ttulo3"/>
       </w:pPr>
-      <w:bookmarkStart w:id="35" w:name="__RefHeading___Toc503_4194855202"/>
-      <w:bookmarkStart w:id="36" w:name="_Toc239435025"/>
-      <w:bookmarkEnd w:id="35"/>
+      <w:bookmarkStart w:id="37" w:name="__RefHeading___Toc503_4194855202"/>
+      <w:bookmarkStart w:id="38" w:name="_Toc239787706"/>
+      <w:bookmarkEnd w:id="37"/>
       <w:r>
         <w:t>Browser:</w:t>
       </w:r>
-      <w:bookmarkEnd w:id="36"/>
+      <w:bookmarkEnd w:id="38"/>
     </w:p>
     <w:p>
       <w:r>
@@ -7878,13 +8440,13 @@
       <w:pPr>
         <w:pStyle w:val="Ttulo2"/>
       </w:pPr>
-      <w:bookmarkStart w:id="37" w:name="__RefHeading___Toc505_4194855202"/>
-      <w:bookmarkStart w:id="38" w:name="_Toc239435026"/>
-      <w:bookmarkEnd w:id="37"/>
+      <w:bookmarkStart w:id="39" w:name="__RefHeading___Toc505_4194855202"/>
+      <w:bookmarkStart w:id="40" w:name="_Toc239787707"/>
+      <w:bookmarkEnd w:id="39"/>
       <w:r>
         <w:t>End-to-End Communication Flow:</w:t>
       </w:r>
-      <w:bookmarkEnd w:id="38"/>
+      <w:bookmarkEnd w:id="40"/>
     </w:p>
     <w:p>
       <w:r>
@@ -8058,12 +8620,12 @@
       <w:pPr>
         <w:pStyle w:val="Ttulo1"/>
       </w:pPr>
-      <w:bookmarkStart w:id="39" w:name="_Toc239435027"/>
+      <w:bookmarkStart w:id="41" w:name="_Toc239787708"/>
       <w:r>
         <w:lastRenderedPageBreak/>
         <w:t>WebRTC:</w:t>
       </w:r>
-      <w:bookmarkEnd w:id="39"/>
+      <w:bookmarkEnd w:id="41"/>
     </w:p>
     <w:p>
       <w:r>
@@ -8152,7 +8714,7 @@
         <w:pStyle w:val="Descripcin"/>
         <w:jc w:val="center"/>
       </w:pPr>
-      <w:bookmarkStart w:id="40" w:name="_Toc238930461"/>
+      <w:bookmarkStart w:id="42" w:name="_Toc239787746"/>
       <w:r>
         <w:t xml:space="preserve">Figure </w:t>
       </w:r>
@@ -8185,14 +8747,14 @@
       <w:r>
         <w:t xml:space="preserve"> protocol Stack</w:t>
       </w:r>
-      <w:bookmarkEnd w:id="40"/>
+      <w:bookmarkEnd w:id="42"/>
     </w:p>
     <w:p>
       <w:pPr>
         <w:pStyle w:val="Ttulo2"/>
       </w:pPr>
-      <w:bookmarkStart w:id="41" w:name="_Toc238835774"/>
-      <w:bookmarkStart w:id="42" w:name="_Toc239435028"/>
+      <w:bookmarkStart w:id="43" w:name="_Toc238835774"/>
+      <w:bookmarkStart w:id="44" w:name="_Toc239787709"/>
       <w:r>
         <w:rPr>
           <w:rFonts w:ascii="Century Gothic" w:hAnsi="Century Gothic"/>
@@ -8200,8 +8762,8 @@
         <w:lastRenderedPageBreak/>
         <w:t>WebRTC Model and Connection Establishment</w:t>
       </w:r>
-      <w:bookmarkEnd w:id="41"/>
-      <w:bookmarkEnd w:id="42"/>
+      <w:bookmarkEnd w:id="43"/>
+      <w:bookmarkEnd w:id="44"/>
     </w:p>
     <w:p>
       <w:r>
@@ -8282,16 +8844,16 @@
       <w:pPr>
         <w:pStyle w:val="Ttulo2"/>
       </w:pPr>
-      <w:bookmarkStart w:id="43" w:name="_Toc238835775"/>
-      <w:bookmarkStart w:id="44" w:name="_Toc239435029"/>
+      <w:bookmarkStart w:id="45" w:name="_Toc238835775"/>
+      <w:bookmarkStart w:id="46" w:name="_Toc239787710"/>
       <w:r>
         <w:rPr>
           <w:rFonts w:ascii="Century Gothic" w:hAnsi="Century Gothic"/>
         </w:rPr>
         <w:t>Transport Stack and Data Channels</w:t>
       </w:r>
-      <w:bookmarkEnd w:id="43"/>
-      <w:bookmarkEnd w:id="44"/>
+      <w:bookmarkEnd w:id="45"/>
+      <w:bookmarkEnd w:id="46"/>
     </w:p>
     <w:p>
       <w:r>
@@ -9044,16 +9606,16 @@
       <w:pPr>
         <w:pStyle w:val="Ttulo2"/>
       </w:pPr>
-      <w:bookmarkStart w:id="45" w:name="_Toc238835776"/>
-      <w:bookmarkStart w:id="46" w:name="_Toc239435030"/>
+      <w:bookmarkStart w:id="47" w:name="_Toc238835776"/>
+      <w:bookmarkStart w:id="48" w:name="_Toc239787711"/>
       <w:r>
         <w:rPr>
           <w:rFonts w:ascii="Century Gothic" w:hAnsi="Century Gothic"/>
         </w:rPr>
         <w:t>Video Codecs</w:t>
       </w:r>
-      <w:bookmarkEnd w:id="45"/>
-      <w:bookmarkEnd w:id="46"/>
+      <w:bookmarkEnd w:id="47"/>
+      <w:bookmarkEnd w:id="48"/>
     </w:p>
     <w:p>
       <w:r>
@@ -9689,13 +10251,13 @@
       <w:pPr>
         <w:pStyle w:val="Ttulo2"/>
       </w:pPr>
-      <w:bookmarkStart w:id="47" w:name="_Toc238835777"/>
-      <w:bookmarkStart w:id="48" w:name="_Toc239435031"/>
+      <w:bookmarkStart w:id="49" w:name="_Toc238835777"/>
+      <w:bookmarkStart w:id="50" w:name="_Toc239787712"/>
       <w:r>
         <w:t>WHIP and WHEP</w:t>
       </w:r>
-      <w:bookmarkEnd w:id="47"/>
-      <w:bookmarkEnd w:id="48"/>
+      <w:bookmarkEnd w:id="49"/>
+      <w:bookmarkEnd w:id="50"/>
     </w:p>
     <w:p>
       <w:r>
@@ -9777,12 +10339,498 @@
       <w:pPr>
         <w:pStyle w:val="Ttulo1"/>
       </w:pPr>
-      <w:bookmarkStart w:id="49" w:name="_Toc239435032"/>
+      <w:bookmarkStart w:id="51" w:name="_Toc239787713"/>
+      <w:r>
+        <w:lastRenderedPageBreak/>
+        <w:t>Implementation:</w:t>
+      </w:r>
+      <w:bookmarkEnd w:id="51"/>
+    </w:p>
+    <w:p>
+      <w:pPr>
+        <w:rPr>
+          <w:lang w:val="en-GB"/>
+        </w:rPr>
+      </w:pPr>
+      <w:r>
+        <w:rPr>
+          <w:lang w:val="en-GB"/>
+        </w:rPr>
+        <w:t xml:space="preserve">Implementation progressed from browser-based WebRTC tests to an onboard video service. The February experiments first connected two peers within a single tab, then separated the sender and receiver into browser pages. This established the basic sequence of media capture, offer and answer negotiation, ICE candidate exchange, and playback. The ASP.NET Core </w:t>
+      </w:r>
+      <w:proofErr w:type="spellStart"/>
+      <w:r>
+        <w:rPr>
+          <w:lang w:val="en-GB"/>
+        </w:rPr>
+        <w:t>SignalR</w:t>
+      </w:r>
+      <w:proofErr w:type="spellEnd"/>
+      <w:r>
+        <w:rPr>
+          <w:lang w:val="en-GB"/>
+        </w:rPr>
+        <w:t xml:space="preserve"> hub was then introduced to carry those messages between independently connected endpoints, replacing the local </w:t>
+      </w:r>
+      <w:proofErr w:type="spellStart"/>
+      <w:r>
+        <w:rPr>
+          <w:lang w:val="en-GB"/>
+        </w:rPr>
+        <w:t>BroadcastChannel</w:t>
+      </w:r>
+      <w:proofErr w:type="spellEnd"/>
+      <w:r>
+        <w:rPr>
+          <w:lang w:val="en-GB"/>
+        </w:rPr>
+        <w:t xml:space="preserve"> mechanism used in the earlier tests.</w:t>
+      </w:r>
+    </w:p>
+    <w:p>
+      <w:pPr>
+        <w:rPr>
+          <w:lang w:val="en-GB"/>
+        </w:rPr>
+      </w:pPr>
+      <w:r>
+        <w:rPr>
+          <w:lang w:val="en-GB"/>
+        </w:rPr>
+        <w:t xml:space="preserve">As the network configuration developed, TURN services were added alongside STUN in March 2026. This provided relay candidates for ICE to test when direct connectivity was unavailable. The application server continued to handle </w:t>
+      </w:r>
+      <w:proofErr w:type="spellStart"/>
+      <w:r>
+        <w:rPr>
+          <w:lang w:val="en-GB"/>
+        </w:rPr>
+        <w:t>signaling</w:t>
+      </w:r>
+      <w:proofErr w:type="spellEnd"/>
+      <w:r>
+        <w:rPr>
+          <w:lang w:val="en-GB"/>
+        </w:rPr>
+        <w:t>; a selected TURN relay belonged to the media transport path. Consequently, keeping video outside the ASP.NET Core service did not imply that every connection was direct. The browser interface also developed connection-state and candidate information to make the resulting session observable during testing.</w:t>
+      </w:r>
+    </w:p>
+    <w:p>
+      <w:pPr>
+        <w:rPr>
+          <w:lang w:val="en-GB"/>
+        </w:rPr>
+      </w:pPr>
+      <w:r>
+        <w:rPr>
+          <w:lang w:val="en-GB"/>
+        </w:rPr>
+        <w:t xml:space="preserve">The native device project was introduced in August, followed by camera integration using </w:t>
+      </w:r>
+      <w:proofErr w:type="spellStart"/>
+      <w:r>
+        <w:rPr>
+          <w:lang w:val="en-GB"/>
+        </w:rPr>
+        <w:t>SIPSorcery</w:t>
+      </w:r>
+      <w:proofErr w:type="spellEnd"/>
+      <w:r>
+        <w:rPr>
+          <w:lang w:val="en-GB"/>
+        </w:rPr>
+        <w:t xml:space="preserve"> for the WebRTC peer connection and </w:t>
+      </w:r>
+      <w:proofErr w:type="spellStart"/>
+      <w:r>
+        <w:rPr>
+          <w:lang w:val="en-GB"/>
+        </w:rPr>
+        <w:t>SIPSorceryMedia.FFmpeg</w:t>
+      </w:r>
+      <w:proofErr w:type="spellEnd"/>
+      <w:r>
+        <w:rPr>
+          <w:lang w:val="en-GB"/>
+        </w:rPr>
+        <w:t xml:space="preserve"> for capture and encoded video samples. The initial integration initialized </w:t>
+      </w:r>
+      <w:proofErr w:type="spellStart"/>
+      <w:r>
+        <w:rPr>
+          <w:lang w:val="en-GB"/>
+        </w:rPr>
+        <w:t>FFmpeg</w:t>
+      </w:r>
+      <w:proofErr w:type="spellEnd"/>
+      <w:r>
+        <w:rPr>
+          <w:lang w:val="en-GB"/>
+        </w:rPr>
+        <w:t xml:space="preserve"> within the .NET process and used </w:t>
+      </w:r>
+      <w:proofErr w:type="spellStart"/>
+      <w:r>
+        <w:rPr>
+          <w:lang w:val="en-GB"/>
+        </w:rPr>
+        <w:t>FFmpegCameraSource</w:t>
+      </w:r>
+      <w:proofErr w:type="spellEnd"/>
+      <w:r>
+        <w:rPr>
+          <w:lang w:val="en-GB"/>
+        </w:rPr>
+        <w:t xml:space="preserve"> to obtain camera formats and deliver encoded frames. It restricted the advertised video codec to H.264 and shared the camera source among connected viewers. This version depended on loading compatible native </w:t>
+      </w:r>
+      <w:proofErr w:type="spellStart"/>
+      <w:r>
+        <w:rPr>
+          <w:lang w:val="en-GB"/>
+        </w:rPr>
+        <w:t>FFmpeg</w:t>
+      </w:r>
+      <w:proofErr w:type="spellEnd"/>
+      <w:r>
+        <w:rPr>
+          <w:lang w:val="en-GB"/>
+        </w:rPr>
+        <w:t xml:space="preserve"> libraries into the device process.</w:t>
+      </w:r>
+    </w:p>
+    <w:p>
+      <w:pPr>
+        <w:rPr>
+          <w:lang w:val="en-GB"/>
+        </w:rPr>
+      </w:pPr>
+      <w:r>
+        <w:rPr>
+          <w:lang w:val="en-GB"/>
+        </w:rPr>
+        <w:t xml:space="preserve">A subsequent revision replaced those in-process bindings with an external </w:t>
+      </w:r>
+      <w:proofErr w:type="spellStart"/>
+      <w:r>
+        <w:rPr>
+          <w:lang w:val="en-GB"/>
+        </w:rPr>
+        <w:t>FFmpeg</w:t>
+      </w:r>
+      <w:proofErr w:type="spellEnd"/>
+      <w:r>
+        <w:rPr>
+          <w:lang w:val="en-GB"/>
+        </w:rPr>
+        <w:t xml:space="preserve"> executable. The .NET application now starts and supervises that process, receives its encoded output over a local RTP socket, and forwards reconstructed video samples to </w:t>
+      </w:r>
+      <w:proofErr w:type="spellStart"/>
+      <w:r>
+        <w:rPr>
+          <w:lang w:val="en-GB"/>
+        </w:rPr>
+        <w:t>SIPSorcery</w:t>
+      </w:r>
+      <w:proofErr w:type="spellEnd"/>
+      <w:r>
+        <w:rPr>
+          <w:lang w:val="en-GB"/>
+        </w:rPr>
+        <w:t xml:space="preserve">. This changes the integration boundary: </w:t>
+      </w:r>
+      <w:proofErr w:type="spellStart"/>
+      <w:r>
+        <w:rPr>
+          <w:lang w:val="en-GB"/>
+        </w:rPr>
+        <w:t>FFmpeg</w:t>
+      </w:r>
+      <w:proofErr w:type="spellEnd"/>
+      <w:r>
+        <w:rPr>
+          <w:lang w:val="en-GB"/>
+        </w:rPr>
+        <w:t xml:space="preserve"> is invoked through a configured command line instead of a native-library binding. It also introduces an explicit RTP depacketization step inside the device service. The change does not remove the computational cost of video conversion.</w:t>
+      </w:r>
+    </w:p>
+    <w:p>
+      <w:pPr>
+        <w:rPr>
+          <w:lang w:val="en-GB"/>
+        </w:rPr>
+      </w:pPr>
+      <w:r>
+        <w:rPr>
+          <w:lang w:val="en-GB"/>
+        </w:rPr>
+        <w:t xml:space="preserve">In the final Linux configuration, </w:t>
+      </w:r>
+      <w:proofErr w:type="spellStart"/>
+      <w:r>
+        <w:rPr>
+          <w:lang w:val="en-GB"/>
+        </w:rPr>
+        <w:t>FFmpeg</w:t>
+      </w:r>
+      <w:proofErr w:type="spellEnd"/>
+      <w:r>
+        <w:rPr>
+          <w:lang w:val="en-GB"/>
+        </w:rPr>
+        <w:t xml:space="preserve"> captures MJPEG frames from the USB camera through Video4Linux2. These frames are decoded and then encoded as H.264 using libx264. The configured capture size is 1280 by 720 pixels at 30 frames per second. The superfast preset, </w:t>
+      </w:r>
+      <w:proofErr w:type="spellStart"/>
+      <w:r>
+        <w:rPr>
+          <w:lang w:val="en-GB"/>
+        </w:rPr>
+        <w:t>zerolatency</w:t>
+      </w:r>
+      <w:proofErr w:type="spellEnd"/>
+      <w:r>
+        <w:rPr>
+          <w:lang w:val="en-GB"/>
+        </w:rPr>
+        <w:t xml:space="preserve"> tuning, disabled B-frames, and controlled keyframe interval express the preference for timely delivery over maximum compression efficiency. This is a software encoding </w:t>
+      </w:r>
+      <w:r>
+        <w:rPr>
+          <w:lang w:val="en-GB"/>
+        </w:rPr>
+        <w:lastRenderedPageBreak/>
+        <w:t>pipeline; it does not pass a camera-generated H.264 stream directly to the browser.</w:t>
+      </w:r>
+    </w:p>
+    <w:p>
+      <w:pPr>
+        <w:rPr>
+          <w:lang w:val="en-GB"/>
+        </w:rPr>
+      </w:pPr>
+      <w:proofErr w:type="spellStart"/>
+      <w:r>
+        <w:rPr>
+          <w:lang w:val="en-GB"/>
+        </w:rPr>
+        <w:t>FFmpeg</w:t>
+      </w:r>
+      <w:proofErr w:type="spellEnd"/>
+      <w:r>
+        <w:rPr>
+          <w:lang w:val="en-GB"/>
+        </w:rPr>
+        <w:t xml:space="preserve"> sends the encoded video as RTP to a socket bound on the device's IPv6 loopback interface. The device service parses the packets and reconstructs the H.264 units that make up each frame. It assembles Annex-B samples and retains </w:t>
+      </w:r>
+      <w:proofErr w:type="gramStart"/>
+      <w:r>
+        <w:rPr>
+          <w:lang w:val="en-GB"/>
+        </w:rPr>
+        <w:t>sequence</w:t>
+      </w:r>
+      <w:proofErr w:type="gramEnd"/>
+      <w:r>
+        <w:rPr>
+          <w:lang w:val="en-GB"/>
+        </w:rPr>
+        <w:t xml:space="preserve"> and picture parameter sets so that they can accompany keyframes when required. </w:t>
+      </w:r>
+      <w:proofErr w:type="spellStart"/>
+      <w:r>
+        <w:rPr>
+          <w:lang w:val="en-GB"/>
+        </w:rPr>
+        <w:t>SIPSorcery</w:t>
+      </w:r>
+      <w:proofErr w:type="spellEnd"/>
+      <w:r>
+        <w:rPr>
+          <w:lang w:val="en-GB"/>
+        </w:rPr>
+        <w:t xml:space="preserve"> receives these encoded samples and handles the WebRTC transport to each browser peer. </w:t>
+      </w:r>
+      <w:proofErr w:type="spellStart"/>
+      <w:r>
+        <w:rPr>
+          <w:lang w:val="en-GB"/>
+        </w:rPr>
+        <w:t>FFmpeg</w:t>
+      </w:r>
+      <w:proofErr w:type="spellEnd"/>
+      <w:r>
+        <w:rPr>
+          <w:lang w:val="en-GB"/>
+        </w:rPr>
+        <w:t xml:space="preserve"> therefore captures and encodes the image, while </w:t>
+      </w:r>
+      <w:proofErr w:type="spellStart"/>
+      <w:r>
+        <w:rPr>
+          <w:lang w:val="en-GB"/>
+        </w:rPr>
+        <w:t>SIPSorcery</w:t>
+      </w:r>
+      <w:proofErr w:type="spellEnd"/>
+      <w:r>
+        <w:rPr>
+          <w:lang w:val="en-GB"/>
+        </w:rPr>
+        <w:t xml:space="preserve"> owns the negotiated WebRTC connection and its protected media transport.</w:t>
+      </w:r>
+    </w:p>
+    <w:p>
+      <w:pPr>
+        <w:rPr>
+          <w:lang w:val="en-GB"/>
+        </w:rPr>
+      </w:pPr>
+      <w:r>
+        <w:rPr>
+          <w:lang w:val="en-GB"/>
+        </w:rPr>
+        <w:t xml:space="preserve">Session establishment retains the </w:t>
+      </w:r>
+      <w:proofErr w:type="spellStart"/>
+      <w:r>
+        <w:rPr>
+          <w:lang w:val="en-GB"/>
+        </w:rPr>
+        <w:t>signaling</w:t>
+      </w:r>
+      <w:proofErr w:type="spellEnd"/>
+      <w:r>
+        <w:rPr>
+          <w:lang w:val="en-GB"/>
+        </w:rPr>
+        <w:t xml:space="preserve"> model developed by the browser prototype. The device and viewer join through </w:t>
+      </w:r>
+      <w:proofErr w:type="spellStart"/>
+      <w:r>
+        <w:rPr>
+          <w:lang w:val="en-GB"/>
+        </w:rPr>
+        <w:t>SignalR</w:t>
+      </w:r>
+      <w:proofErr w:type="spellEnd"/>
+      <w:r>
+        <w:rPr>
+          <w:lang w:val="en-GB"/>
+        </w:rPr>
+        <w:t xml:space="preserve"> using the same device identifier. The device creates a send-only video offer, the browser returns an answer, and both endpoints exchange ICE candidates. Candidates received before the remote description is available are held until they can be applied. Once the peer is connected, its video consumer is attached to the camera source. Capture starts for the first consumer and stops when the last consumer leaves.</w:t>
+      </w:r>
+    </w:p>
+    <w:p>
+      <w:pPr>
+        <w:rPr>
+          <w:lang w:val="en-GB"/>
+        </w:rPr>
+      </w:pPr>
+      <w:r>
+        <w:rPr>
+          <w:lang w:val="en-GB"/>
+        </w:rPr>
+        <w:t xml:space="preserve">Resource management forms part of the implementation. The camera source is shared so that additional viewers do not require independent camera captures and encoders. If </w:t>
+      </w:r>
+      <w:proofErr w:type="spellStart"/>
+      <w:r>
+        <w:rPr>
+          <w:lang w:val="en-GB"/>
+        </w:rPr>
+        <w:t>FFmpeg</w:t>
+      </w:r>
+      <w:proofErr w:type="spellEnd"/>
+      <w:r>
+        <w:rPr>
+          <w:lang w:val="en-GB"/>
+        </w:rPr>
+        <w:t xml:space="preserve"> exits while consumers remain, the service attempts to restart the process while retaining the local receive socket. Peer cleanup detaches the corresponding video consumer and closes its connection. These mechanisms support repeated test sessions and make process failures visible through diagnostic logging.</w:t>
+      </w:r>
+    </w:p>
+    <w:p>
+      <w:pPr>
+        <w:rPr>
+          <w:lang w:val="en-GB"/>
+        </w:rPr>
+      </w:pPr>
+      <w:r>
+        <w:rPr>
+          <w:lang w:val="en-GB"/>
+        </w:rPr>
+        <w:t xml:space="preserve">WHIP and WHEP were also investigated, but the working </w:t>
+      </w:r>
+      <w:proofErr w:type="spellStart"/>
+      <w:r>
+        <w:rPr>
+          <w:lang w:val="en-GB"/>
+        </w:rPr>
+        <w:t>signaling</w:t>
+      </w:r>
+      <w:proofErr w:type="spellEnd"/>
+      <w:r>
+        <w:rPr>
+          <w:lang w:val="en-GB"/>
+        </w:rPr>
+        <w:t xml:space="preserve"> path remains </w:t>
+      </w:r>
+      <w:proofErr w:type="spellStart"/>
+      <w:r>
+        <w:rPr>
+          <w:lang w:val="en-GB"/>
+        </w:rPr>
+        <w:t>SignalR</w:t>
+      </w:r>
+      <w:proofErr w:type="spellEnd"/>
+      <w:r>
+        <w:rPr>
+          <w:lang w:val="en-GB"/>
+        </w:rPr>
+        <w:t>. The corresponding HTTP endpoints return Not Implemented, so the prototype does not provide a complete implementation of either protocol. Negotiated data channels provide a structure for control, commands, telemetry, and events, but complete vehicle actuation remains future work. Client and Server provide the code-level descriptions of these components and their responsibilities.</w:t>
+      </w:r>
+    </w:p>
+    <w:p>
+      <w:pPr>
+        <w:rPr>
+          <w:lang w:val="en-GB"/>
+        </w:rPr>
+      </w:pPr>
+      <w:r>
+        <w:rPr>
+          <w:lang w:val="en-GB"/>
+        </w:rPr>
+        <w:t xml:space="preserve">The implemented result is a low-latency video foundation for the RC vehicle. The documented setup produced an approximately 340 </w:t>
+      </w:r>
+      <w:proofErr w:type="spellStart"/>
+      <w:r>
+        <w:rPr>
+          <w:lang w:val="en-GB"/>
+        </w:rPr>
+        <w:t>ms</w:t>
+      </w:r>
+      <w:proofErr w:type="spellEnd"/>
+      <w:r>
+        <w:rPr>
+          <w:lang w:val="en-GB"/>
+        </w:rPr>
+        <w:t xml:space="preserve"> glass-to-glass observation using the Huawei 4G connection. This supports the feasibility of the target in that configuration; it is neither a statistical latency guarantee nor a 5G measurement. Completing vehicle control and evaluating genuine 5G connectivity remain necessary subsequent steps.</w:t>
+      </w:r>
+    </w:p>
+    <w:p>
+      <w:pPr>
+        <w:jc w:val="left"/>
+      </w:pPr>
+      <w:r>
+        <w:br w:type="page"/>
+      </w:r>
+    </w:p>
+    <w:p>
+      <w:pPr>
+        <w:pStyle w:val="Ttulo1"/>
+      </w:pPr>
+      <w:bookmarkStart w:id="52" w:name="_Toc239787714"/>
       <w:r>
         <w:lastRenderedPageBreak/>
         <w:t>Client:</w:t>
       </w:r>
-      <w:bookmarkEnd w:id="49"/>
+      <w:bookmarkEnd w:id="52"/>
     </w:p>
     <w:p>
       <w:r>
@@ -9809,13 +10857,13 @@
       <w:pPr>
         <w:pStyle w:val="Ttulo2"/>
       </w:pPr>
-      <w:bookmarkStart w:id="50" w:name="_Toc238857460"/>
-      <w:bookmarkStart w:id="51" w:name="_Toc239435033"/>
+      <w:bookmarkStart w:id="53" w:name="_Toc238857460"/>
+      <w:bookmarkStart w:id="54" w:name="_Toc239787715"/>
       <w:r>
         <w:t>Runtime Initialization and Configuration</w:t>
       </w:r>
-      <w:bookmarkEnd w:id="50"/>
-      <w:bookmarkEnd w:id="51"/>
+      <w:bookmarkEnd w:id="53"/>
+      <w:bookmarkEnd w:id="54"/>
     </w:p>
     <w:p>
       <w:r>
@@ -10019,16 +11067,16 @@
       <w:pPr>
         <w:pStyle w:val="Ttulo2"/>
       </w:pPr>
-      <w:bookmarkStart w:id="52" w:name="_Toc238857461"/>
-      <w:bookmarkStart w:id="53" w:name="_Toc239435034"/>
+      <w:bookmarkStart w:id="55" w:name="_Toc238857461"/>
+      <w:bookmarkStart w:id="56" w:name="_Toc239787716"/>
       <w:r>
         <w:rPr>
           <w:b w:val="0"/>
         </w:rPr>
         <w:t>Registration and Connectivity Lifecycle</w:t>
       </w:r>
-      <w:bookmarkEnd w:id="52"/>
-      <w:bookmarkEnd w:id="53"/>
+      <w:bookmarkEnd w:id="55"/>
+      <w:bookmarkEnd w:id="56"/>
     </w:p>
     <w:p>
       <w:proofErr w:type="spellStart"/>
@@ -11226,13 +12274,13 @@
       <w:pPr>
         <w:pStyle w:val="Ttulo2"/>
       </w:pPr>
-      <w:bookmarkStart w:id="54" w:name="_Toc238857462"/>
-      <w:bookmarkStart w:id="55" w:name="_Toc239435035"/>
+      <w:bookmarkStart w:id="57" w:name="_Toc238857462"/>
+      <w:bookmarkStart w:id="58" w:name="_Toc239787717"/>
       <w:r>
         <w:t>WebRTC Session Negotiation</w:t>
       </w:r>
-      <w:bookmarkEnd w:id="54"/>
-      <w:bookmarkEnd w:id="55"/>
+      <w:bookmarkEnd w:id="57"/>
+      <w:bookmarkEnd w:id="58"/>
     </w:p>
     <w:p>
       <w:r>
@@ -11384,13 +12432,13 @@
       <w:pPr>
         <w:pStyle w:val="Ttulo2"/>
       </w:pPr>
-      <w:bookmarkStart w:id="56" w:name="_Toc238857463"/>
-      <w:bookmarkStart w:id="57" w:name="_Toc239435036"/>
+      <w:bookmarkStart w:id="59" w:name="_Toc238857463"/>
+      <w:bookmarkStart w:id="60" w:name="_Toc239787718"/>
       <w:r>
         <w:t>Latency-Oriented Code Complexity</w:t>
       </w:r>
-      <w:bookmarkEnd w:id="56"/>
-      <w:bookmarkEnd w:id="57"/>
+      <w:bookmarkEnd w:id="59"/>
+      <w:bookmarkEnd w:id="60"/>
     </w:p>
     <w:p>
       <w:r>
@@ -12952,13 +14000,13 @@
       <w:pPr>
         <w:pStyle w:val="Ttulo2"/>
       </w:pPr>
-      <w:bookmarkStart w:id="58" w:name="_Toc238857464"/>
-      <w:bookmarkStart w:id="59" w:name="_Toc239435037"/>
+      <w:bookmarkStart w:id="61" w:name="_Toc238857464"/>
+      <w:bookmarkStart w:id="62" w:name="_Toc239787719"/>
       <w:r>
         <w:t>Camera-to-WebRTC Video Pipeline</w:t>
       </w:r>
-      <w:bookmarkEnd w:id="58"/>
-      <w:bookmarkEnd w:id="59"/>
+      <w:bookmarkEnd w:id="61"/>
+      <w:bookmarkEnd w:id="62"/>
     </w:p>
     <w:p>
       <w:r>
@@ -13171,13 +14219,13 @@
       <w:pPr>
         <w:pStyle w:val="Ttulo2"/>
       </w:pPr>
-      <w:bookmarkStart w:id="60" w:name="_Toc238857465"/>
-      <w:bookmarkStart w:id="61" w:name="_Toc239435038"/>
+      <w:bookmarkStart w:id="63" w:name="_Toc238857465"/>
+      <w:bookmarkStart w:id="64" w:name="_Toc239787720"/>
       <w:r>
         <w:t>Control, Commands, Telemetry, and Events</w:t>
       </w:r>
-      <w:bookmarkEnd w:id="60"/>
-      <w:bookmarkEnd w:id="61"/>
+      <w:bookmarkEnd w:id="63"/>
+      <w:bookmarkEnd w:id="64"/>
     </w:p>
     <w:p>
       <w:r>
@@ -14085,13 +15133,13 @@
       <w:pPr>
         <w:pStyle w:val="Ttulo2"/>
       </w:pPr>
-      <w:bookmarkStart w:id="62" w:name="_Toc238857466"/>
-      <w:bookmarkStart w:id="63" w:name="_Toc239435039"/>
+      <w:bookmarkStart w:id="65" w:name="_Toc238857466"/>
+      <w:bookmarkStart w:id="66" w:name="_Toc239787721"/>
       <w:r>
         <w:t>Runtime Resilience</w:t>
       </w:r>
-      <w:bookmarkEnd w:id="62"/>
-      <w:bookmarkEnd w:id="63"/>
+      <w:bookmarkEnd w:id="65"/>
+      <w:bookmarkEnd w:id="66"/>
     </w:p>
     <w:p>
       <w:r>
@@ -14208,12 +15256,12 @@
       <w:pPr>
         <w:pStyle w:val="Ttulo1"/>
       </w:pPr>
-      <w:bookmarkStart w:id="64" w:name="_Toc239435040"/>
+      <w:bookmarkStart w:id="67" w:name="_Toc239787722"/>
       <w:r>
         <w:lastRenderedPageBreak/>
         <w:t>Server:</w:t>
       </w:r>
-      <w:bookmarkEnd w:id="64"/>
+      <w:bookmarkEnd w:id="67"/>
     </w:p>
     <w:p>
       <w:r>
@@ -14307,7 +15355,7 @@
         <w:pStyle w:val="Descripcin"/>
         <w:jc w:val="center"/>
       </w:pPr>
-      <w:bookmarkStart w:id="65" w:name="_Toc238930462"/>
+      <w:bookmarkStart w:id="68" w:name="_Toc239787747"/>
       <w:r>
         <w:t xml:space="preserve">Figure </w:t>
       </w:r>
@@ -14332,19 +15380,19 @@
       <w:r>
         <w:t xml:space="preserve"> Device Selection Interface</w:t>
       </w:r>
-      <w:bookmarkEnd w:id="65"/>
+      <w:bookmarkEnd w:id="68"/>
     </w:p>
     <w:p>
       <w:pPr>
         <w:pStyle w:val="Ttulo2"/>
       </w:pPr>
-      <w:bookmarkStart w:id="66" w:name="_Toc238857468"/>
-      <w:bookmarkStart w:id="67" w:name="_Toc239435041"/>
+      <w:bookmarkStart w:id="69" w:name="_Toc238857468"/>
+      <w:bookmarkStart w:id="70" w:name="_Toc239787723"/>
       <w:r>
         <w:t>Application Composition</w:t>
       </w:r>
-      <w:bookmarkEnd w:id="66"/>
-      <w:bookmarkEnd w:id="67"/>
+      <w:bookmarkEnd w:id="69"/>
+      <w:bookmarkEnd w:id="70"/>
     </w:p>
     <w:p>
       <w:proofErr w:type="spellStart"/>
@@ -14574,13 +15622,13 @@
       <w:pPr>
         <w:pStyle w:val="Ttulo2"/>
       </w:pPr>
-      <w:bookmarkStart w:id="68" w:name="_Toc238857469"/>
-      <w:bookmarkStart w:id="69" w:name="_Toc239435042"/>
+      <w:bookmarkStart w:id="71" w:name="_Toc238857469"/>
+      <w:bookmarkStart w:id="72" w:name="_Toc239787724"/>
       <w:r>
         <w:t>Device Discovery and Operator Entry</w:t>
       </w:r>
-      <w:bookmarkEnd w:id="68"/>
-      <w:bookmarkEnd w:id="69"/>
+      <w:bookmarkEnd w:id="71"/>
+      <w:bookmarkEnd w:id="72"/>
     </w:p>
     <w:p>
       <w:r>
@@ -14717,13 +15765,13 @@
       <w:pPr>
         <w:pStyle w:val="Ttulo2"/>
       </w:pPr>
-      <w:bookmarkStart w:id="70" w:name="_Toc238857470"/>
-      <w:bookmarkStart w:id="71" w:name="_Toc239435043"/>
+      <w:bookmarkStart w:id="73" w:name="_Toc238857470"/>
+      <w:bookmarkStart w:id="74" w:name="_Toc239787725"/>
       <w:r>
         <w:t>Signaling Session Coordination</w:t>
       </w:r>
-      <w:bookmarkEnd w:id="70"/>
-      <w:bookmarkEnd w:id="71"/>
+      <w:bookmarkEnd w:id="73"/>
+      <w:bookmarkEnd w:id="74"/>
     </w:p>
     <w:p>
       <w:proofErr w:type="spellStart"/>
@@ -14918,13 +15966,13 @@
       <w:pPr>
         <w:pStyle w:val="Ttulo2"/>
       </w:pPr>
-      <w:bookmarkStart w:id="72" w:name="_Toc238857471"/>
-      <w:bookmarkStart w:id="73" w:name="_Toc239435044"/>
+      <w:bookmarkStart w:id="75" w:name="_Toc238857471"/>
+      <w:bookmarkStart w:id="76" w:name="_Toc239787726"/>
       <w:r>
         <w:t>Offer, Answer, and ICE Exchange</w:t>
       </w:r>
-      <w:bookmarkEnd w:id="72"/>
-      <w:bookmarkEnd w:id="73"/>
+      <w:bookmarkEnd w:id="75"/>
+      <w:bookmarkEnd w:id="76"/>
     </w:p>
     <w:p>
       <w:r>
@@ -16530,13 +17578,13 @@
       <w:pPr>
         <w:pStyle w:val="Ttulo2"/>
       </w:pPr>
-      <w:bookmarkStart w:id="74" w:name="_Toc238857472"/>
-      <w:bookmarkStart w:id="75" w:name="_Toc239435045"/>
+      <w:bookmarkStart w:id="77" w:name="_Toc238857472"/>
+      <w:bookmarkStart w:id="78" w:name="_Toc239787727"/>
       <w:r>
         <w:t>Browser Media and Control Session</w:t>
       </w:r>
-      <w:bookmarkEnd w:id="74"/>
-      <w:bookmarkEnd w:id="75"/>
+      <w:bookmarkEnd w:id="77"/>
+      <w:bookmarkEnd w:id="78"/>
     </w:p>
     <w:p>
       <w:proofErr w:type="spellStart"/>
@@ -16694,13 +17742,13 @@
       <w:pPr>
         <w:pStyle w:val="Ttulo2"/>
       </w:pPr>
-      <w:bookmarkStart w:id="76" w:name="_Toc238857473"/>
-      <w:bookmarkStart w:id="77" w:name="_Toc239435046"/>
+      <w:bookmarkStart w:id="79" w:name="_Toc238857473"/>
+      <w:bookmarkStart w:id="80" w:name="_Toc239787728"/>
       <w:r>
         <w:t>Validation and Standardized Interfaces</w:t>
       </w:r>
-      <w:bookmarkEnd w:id="76"/>
-      <w:bookmarkEnd w:id="77"/>
+      <w:bookmarkEnd w:id="79"/>
+      <w:bookmarkEnd w:id="80"/>
     </w:p>
     <w:p>
       <w:proofErr w:type="spellStart"/>
@@ -16811,12 +17859,12 @@
       <w:pPr>
         <w:pStyle w:val="Ttulo1"/>
       </w:pPr>
-      <w:bookmarkStart w:id="78" w:name="_Toc239435047"/>
+      <w:bookmarkStart w:id="81" w:name="_Toc239787729"/>
       <w:r>
         <w:lastRenderedPageBreak/>
         <w:t>Conclusions:</w:t>
       </w:r>
-      <w:bookmarkEnd w:id="78"/>
+      <w:bookmarkEnd w:id="81"/>
     </w:p>
     <w:p>
       <w:r>
@@ -16900,7 +17948,7 @@
         <w:pStyle w:val="Descripcin"/>
         <w:jc w:val="center"/>
       </w:pPr>
-      <w:bookmarkStart w:id="79" w:name="_Toc238930463"/>
+      <w:bookmarkStart w:id="82" w:name="_Toc239787748"/>
       <w:r>
         <w:t xml:space="preserve">Figure </w:t>
       </w:r>
@@ -16925,7 +17973,7 @@
       <w:r>
         <w:t xml:space="preserve"> Glass-To-Glass latency test (340ms)</w:t>
       </w:r>
-      <w:bookmarkEnd w:id="79"/>
+      <w:bookmarkEnd w:id="82"/>
     </w:p>
     <w:p>
       <w:r>
@@ -17019,7 +18067,7 @@
       <w:pPr>
         <w:pStyle w:val="Descripcin"/>
       </w:pPr>
-      <w:bookmarkStart w:id="80" w:name="_Toc238930464"/>
+      <w:bookmarkStart w:id="83" w:name="_Toc239787749"/>
       <w:r>
         <w:t xml:space="preserve">Figure </w:t>
       </w:r>
@@ -17044,7 +18092,7 @@
       <w:r>
         <w:t xml:space="preserve"> Live vehicle video-stream</w:t>
       </w:r>
-      <w:bookmarkEnd w:id="80"/>
+      <w:bookmarkEnd w:id="83"/>
     </w:p>
     <w:p>
       <w:r>
@@ -17055,22 +18103,22 @@
       <w:pPr>
         <w:pStyle w:val="Ttulo1"/>
       </w:pPr>
-      <w:bookmarkStart w:id="81" w:name="_Toc239435048"/>
+      <w:bookmarkStart w:id="84" w:name="_Toc239787730"/>
       <w:r>
         <w:lastRenderedPageBreak/>
         <w:t>Future Work:</w:t>
       </w:r>
-      <w:bookmarkEnd w:id="81"/>
+      <w:bookmarkEnd w:id="84"/>
     </w:p>
     <w:p>
       <w:pPr>
         <w:pStyle w:val="Ttulo2"/>
       </w:pPr>
-      <w:bookmarkStart w:id="82" w:name="_Toc239435049"/>
+      <w:bookmarkStart w:id="85" w:name="_Toc239787731"/>
       <w:r>
         <w:t>Complete Remote Control and Safety</w:t>
       </w:r>
-      <w:bookmarkEnd w:id="82"/>
+      <w:bookmarkEnd w:id="85"/>
     </w:p>
     <w:p>
       <w:r>
@@ -17094,11 +18142,11 @@
       <w:pPr>
         <w:pStyle w:val="Ttulo2"/>
       </w:pPr>
-      <w:bookmarkStart w:id="83" w:name="_Toc239435050"/>
+      <w:bookmarkStart w:id="86" w:name="_Toc239787732"/>
       <w:r>
         <w:t>IPv6 and Mobile-Network Validation</w:t>
       </w:r>
-      <w:bookmarkEnd w:id="83"/>
+      <w:bookmarkEnd w:id="86"/>
     </w:p>
     <w:p>
       <w:r>
@@ -17125,11 +18173,11 @@
       <w:pPr>
         <w:pStyle w:val="Ttulo2"/>
       </w:pPr>
-      <w:bookmarkStart w:id="84" w:name="_Toc239435051"/>
+      <w:bookmarkStart w:id="87" w:name="_Toc239787733"/>
       <w:r>
         <w:t>Hardware H.264 Camera</w:t>
       </w:r>
-      <w:bookmarkEnd w:id="84"/>
+      <w:bookmarkEnd w:id="87"/>
     </w:p>
     <w:p>
       <w:r>
@@ -17163,11 +18211,11 @@
       <w:pPr>
         <w:pStyle w:val="Ttulo2"/>
       </w:pPr>
-      <w:bookmarkStart w:id="85" w:name="_Toc239435052"/>
+      <w:bookmarkStart w:id="88" w:name="_Toc239787734"/>
       <w:r>
         <w:t>Protected Electrical Design</w:t>
       </w:r>
-      <w:bookmarkEnd w:id="85"/>
+      <w:bookmarkEnd w:id="88"/>
     </w:p>
     <w:p>
       <w:r>
@@ -17178,11 +18226,11 @@
       <w:pPr>
         <w:pStyle w:val="Ttulo2"/>
       </w:pPr>
-      <w:bookmarkStart w:id="86" w:name="_Toc239435053"/>
+      <w:bookmarkStart w:id="89" w:name="_Toc239787735"/>
       <w:r>
         <w:t>Mechanical Integration</w:t>
       </w:r>
-      <w:bookmarkEnd w:id="86"/>
+      <w:bookmarkEnd w:id="89"/>
     </w:p>
     <w:p>
       <w:r>
@@ -17201,11 +18249,11 @@
       <w:pPr>
         <w:pStyle w:val="Ttulo2"/>
       </w:pPr>
-      <w:bookmarkStart w:id="87" w:name="_Toc239435054"/>
+      <w:bookmarkStart w:id="90" w:name="_Toc239787736"/>
       <w:r>
         <w:t>ESP32-P4 Integrated Rust Platform</w:t>
       </w:r>
-      <w:bookmarkEnd w:id="87"/>
+      <w:bookmarkEnd w:id="90"/>
     </w:p>
     <w:p>
       <w:r>
@@ -17264,12 +18312,12 @@
       <w:pPr>
         <w:pStyle w:val="Ttulo2"/>
       </w:pPr>
-      <w:bookmarkStart w:id="88" w:name="_Toc239435055"/>
+      <w:bookmarkStart w:id="91" w:name="_Toc239787737"/>
       <w:r>
         <w:lastRenderedPageBreak/>
         <w:t>Final System Evaluation</w:t>
       </w:r>
-      <w:bookmarkEnd w:id="88"/>
+      <w:bookmarkEnd w:id="91"/>
     </w:p>
     <w:p>
       <w:r>
@@ -17285,12 +18333,12 @@
       <w:pPr>
         <w:pStyle w:val="Ttulo1"/>
       </w:pPr>
-      <w:bookmarkStart w:id="89" w:name="_Toc239435056"/>
+      <w:bookmarkStart w:id="92" w:name="_Toc239787738"/>
       <w:r>
         <w:lastRenderedPageBreak/>
         <w:t>References:</w:t>
       </w:r>
-      <w:bookmarkEnd w:id="89"/>
+      <w:bookmarkEnd w:id="92"/>
     </w:p>
     <w:p>
       <w:pPr>
@@ -19033,7 +20081,6 @@
   <w:style w:type="character" w:default="1" w:styleId="Fuentedeprrafopredeter">
     <w:name w:val="Default Paragraph Font"/>
     <w:uiPriority w:val="1"/>
-    <w:semiHidden/>
     <w:unhideWhenUsed/>
   </w:style>
   <w:style w:type="table" w:default="1" w:styleId="Tablanormal">

</xml_diff>